<commit_message>
Office fidelity, font handling and packaging verification
Squash 6 consecutive development commits, retaining the original ending snapshot.

- Match Word's pagination and line layout, draw PPTX connectors, order LTR runs in RTL text
- Select delivered fonts through an alias, calibrate Arabic substitutes, wait for fonts before measuring
- Bench Extend, apollo and pptx-browser; record measured findings in the competitor survey
- Read PPTX autofit and bullets as PowerPoint stores them, add Aptos and lazy font delivery, then freeze aared-fonts
- Place DOCX pictures as Word wraps them, close the PPTX fidelity pass, split open gaps from accepted limits
- Type every error by whose fault it is, prove webpack and Next.js consumers, report navigation failures on every embed layer
</commit_message>
<xml_diff>
--- a/fixtures/docx-coverage.docx
+++ b/fixtures/docx-coverage.docx
@@ -62,61 +62,7 @@
           <w:sz w:val="19"/>
           <w:szCs w:val="19"/>
         </w:rPr>
-        <w:t xml:space="preserve">Season </w:t>
-      </w:r>
-      <w:proofErr w:type="gramStart"/>
-      <w:r>
-        <w:rPr>
-          <w:color w:val="5B6470"/>
-          <w:sz w:val="19"/>
-          <w:szCs w:val="19"/>
-        </w:rPr>
-        <w:t>2  ·</w:t>
-      </w:r>
-      <w:proofErr w:type="gramEnd"/>
-      <w:r>
-        <w:rPr>
-          <w:color w:val="5B6470"/>
-          <w:sz w:val="19"/>
-          <w:szCs w:val="19"/>
-        </w:rPr>
-        <w:t xml:space="preserve">  Episodes 04–</w:t>
-      </w:r>
-      <w:proofErr w:type="gramStart"/>
-      <w:r>
-        <w:rPr>
-          <w:color w:val="5B6470"/>
-          <w:sz w:val="19"/>
-          <w:szCs w:val="19"/>
-        </w:rPr>
-        <w:t>06  ·</w:t>
-      </w:r>
-      <w:proofErr w:type="gramEnd"/>
-      <w:r>
-        <w:rPr>
-          <w:color w:val="5B6470"/>
-          <w:sz w:val="19"/>
-          <w:szCs w:val="19"/>
-        </w:rPr>
-        <w:t xml:space="preserve">  Draft </w:t>
-      </w:r>
-      <w:proofErr w:type="gramStart"/>
-      <w:r>
-        <w:rPr>
-          <w:color w:val="5B6470"/>
-          <w:sz w:val="19"/>
-          <w:szCs w:val="19"/>
-        </w:rPr>
-        <w:t>3.1  ·</w:t>
-      </w:r>
-      <w:proofErr w:type="gramEnd"/>
-      <w:r>
-        <w:rPr>
-          <w:color w:val="5B6470"/>
-          <w:sz w:val="19"/>
-          <w:szCs w:val="19"/>
-        </w:rPr>
-        <w:t xml:space="preserve">  Revised 12 May 2026</w:t>
+        <w:t>Season 2  ·  Episodes 04–06  ·  Draft 3.1  ·  Revised 12 May 2026</w:t>
       </w:r>
     </w:p>
     <w:tbl>
@@ -193,29 +139,8 @@
           </w:tcPr>
           <w:p>
             <w:r>
-              <w:t xml:space="preserve">Nile Heritage Foundation / </w:t>
-            </w:r>
-            <w:proofErr w:type="spellStart"/>
-            <w:r>
-              <w:t>مؤسسة</w:t>
-            </w:r>
-            <w:proofErr w:type="spellEnd"/>
-            <w:r>
-              <w:t xml:space="preserve"> </w:t>
-            </w:r>
-            <w:proofErr w:type="spellStart"/>
-            <w:r>
-              <w:t>تراث</w:t>
-            </w:r>
-            <w:proofErr w:type="spellEnd"/>
-            <w:r>
-              <w:t xml:space="preserve"> </w:t>
-            </w:r>
-            <w:proofErr w:type="spellStart"/>
-            <w:r>
-              <w:t>النيل</w:t>
-            </w:r>
-            <w:proofErr w:type="spellEnd"/>
+              <w:t>Nile Heritage Foundation / مؤسسة تراث النيل</w:t>
+            </w:r>
           </w:p>
         </w:tc>
       </w:tr>
@@ -339,15 +264,7 @@
           </w:tcPr>
           <w:p>
             <w:r>
-              <w:t xml:space="preserve">Karim </w:t>
-            </w:r>
-            <w:proofErr w:type="gramStart"/>
-            <w:r>
-              <w:t>Fahmy  —</w:t>
-            </w:r>
-            <w:proofErr w:type="gramEnd"/>
-            <w:r>
-              <w:t xml:space="preserve">  Premiere Pro 2026 / DaVinci Resolve 20</w:t>
+              <w:t>Karim Fahmy  —  Premiere Pro 2026 / DaVinci Resolve 20</w:t>
             </w:r>
           </w:p>
         </w:tc>
@@ -405,31 +322,7 @@
           </w:tcPr>
           <w:p>
             <w:r>
-              <w:t xml:space="preserve">3 × 26 </w:t>
-            </w:r>
-            <w:proofErr w:type="gramStart"/>
-            <w:r>
-              <w:t>min  ·</w:t>
-            </w:r>
-            <w:proofErr w:type="gramEnd"/>
-            <w:r>
-              <w:t xml:space="preserve">  UHD 3840×</w:t>
-            </w:r>
-            <w:proofErr w:type="gramStart"/>
-            <w:r>
-              <w:t>2160  ·</w:t>
-            </w:r>
-            <w:proofErr w:type="gramEnd"/>
-            <w:r>
-              <w:t xml:space="preserve">  25 </w:t>
-            </w:r>
-            <w:proofErr w:type="gramStart"/>
-            <w:r>
-              <w:t>fps  ·</w:t>
-            </w:r>
-            <w:proofErr w:type="gramEnd"/>
-            <w:r>
-              <w:t xml:space="preserve">  Rec.709</w:t>
+              <w:t>3 × 26 min  ·  UHD 3840×2160  ·  25 fps  ·  Rec.709</w:t>
             </w:r>
           </w:p>
         </w:tc>
@@ -448,27 +341,15 @@
           <w:sz w:val="24"/>
           <w:szCs w:val="24"/>
         </w:rPr>
-        <w:t xml:space="preserve">Contents / </w:t>
-      </w:r>
-      <w:proofErr w:type="spellStart"/>
-      <w:r>
-        <w:rPr>
-          <w:rFonts w:ascii="Cambria" w:eastAsia="Cambria" w:hAnsi="Cambria" w:cs="Cambria"/>
-          <w:b/>
-          <w:bCs/>
-          <w:color w:val="12171F"/>
-          <w:sz w:val="24"/>
-          <w:szCs w:val="24"/>
-        </w:rPr>
-        <w:t>المحتويات</w:t>
-      </w:r>
-      <w:proofErr w:type="spellEnd"/>
+        <w:t>Contents / المحتويات</w:t>
+      </w:r>
     </w:p>
     <w:sdt>
       <w:sdtPr>
         <w:alias w:val="Contents"/>
         <w:id w:val="1046333891"/>
       </w:sdtPr>
+      <w:sdtEndPr/>
       <w:sdtContent>
         <w:p>
           <w:pPr>
@@ -988,61 +869,7 @@
           <w:szCs w:val="22"/>
           <w:rtl/>
         </w:rPr>
-        <w:t xml:space="preserve">تتابع سلسلة «صوت النهر» ثلاث عائلات ترتبط معيشتها بالنيل بين أسوان ورشيد. تنتقل الحلقات من الرابعة إلى السادسة من التصوير الشخصي إلى الطرح والتحليل، بحيث تحمل كل حلقة سؤالًا واضحًا وتجيب عنه بالصورة قبل الكلام. يجري المونتاج الأولي على برنامج </w:t>
-      </w:r>
-      <w:proofErr w:type="spellStart"/>
-      <w:r>
-        <w:rPr>
-          <w:sz w:val="22"/>
-          <w:szCs w:val="22"/>
-          <w:rtl/>
-        </w:rPr>
-        <w:t>بريمير</w:t>
-      </w:r>
-      <w:proofErr w:type="spellEnd"/>
-      <w:r>
-        <w:rPr>
-          <w:sz w:val="22"/>
-          <w:szCs w:val="22"/>
-          <w:rtl/>
-        </w:rPr>
-        <w:t xml:space="preserve"> </w:t>
-      </w:r>
-      <w:proofErr w:type="spellStart"/>
-      <w:r>
-        <w:rPr>
-          <w:sz w:val="22"/>
-          <w:szCs w:val="22"/>
-          <w:rtl/>
-        </w:rPr>
-        <w:t>برو</w:t>
-      </w:r>
-      <w:proofErr w:type="spellEnd"/>
-      <w:r>
-        <w:rPr>
-          <w:sz w:val="22"/>
-          <w:szCs w:val="22"/>
-          <w:rtl/>
-        </w:rPr>
-        <w:t xml:space="preserve">، بينما تتم عمليات التجميع النهائي وتصحيح الألوان والتسليم على دافينشي </w:t>
-      </w:r>
-      <w:proofErr w:type="spellStart"/>
-      <w:r>
-        <w:rPr>
-          <w:sz w:val="22"/>
-          <w:szCs w:val="22"/>
-          <w:rtl/>
-        </w:rPr>
-        <w:t>ريزولف</w:t>
-      </w:r>
-      <w:proofErr w:type="spellEnd"/>
-      <w:r>
-        <w:rPr>
-          <w:sz w:val="22"/>
-          <w:szCs w:val="22"/>
-          <w:rtl/>
-        </w:rPr>
-        <w:t>.</w:t>
+        <w:t>تتابع سلسلة «صوت النهر» ثلاث عائلات ترتبط معيشتها بالنيل بين أسوان ورشيد. تنتقل الحلقات من الرابعة إلى السادسة من التصوير الشخصي إلى الطرح والتحليل، بحيث تحمل كل حلقة سؤالًا واضحًا وتجيب عنه بالصورة قبل الكلام. يجري المونتاج الأولي على برنامج بريمير برو، بينما تتم عمليات التجميع النهائي وتصحيح الألوان والتسليم على دافينشي ريزولف.</w:t>
       </w:r>
     </w:p>
     <w:p>
@@ -1320,17 +1147,8 @@
           <w:color w:val="5B6470"/>
           <w:rtl/>
         </w:rPr>
-        <w:t xml:space="preserve">«اقطع على الحركة، لا على </w:t>
-      </w:r>
-      <w:proofErr w:type="gramStart"/>
-      <w:r>
-        <w:rPr>
-          <w:color w:val="5B6470"/>
-          <w:rtl/>
-        </w:rPr>
-        <w:t>الكلمة.»</w:t>
-      </w:r>
-      <w:proofErr w:type="gramEnd"/>
+        <w:t>«اقطع على الحركة، لا على الكلمة.»</w:t>
+      </w:r>
     </w:p>
     <w:p>
       <w:pPr>
@@ -1481,9 +1299,27 @@
                 <w:sz w:val="18"/>
                 <w:szCs w:val="18"/>
               </w:rPr>
-              <w:t xml:space="preserve">Parameter / </w:t>
-            </w:r>
-            <w:proofErr w:type="spellStart"/>
+              <w:t>Parameter / المعيار</w:t>
+            </w:r>
+          </w:p>
+        </w:tc>
+        <w:tc>
+          <w:tcPr>
+            <w:tcW w:w="4560" w:type="dxa"/>
+            <w:gridSpan w:val="2"/>
+            <w:shd w:val="clear" w:color="auto" w:fill="12171F"/>
+            <w:tcMar>
+              <w:top w:w="80" w:type="dxa"/>
+              <w:left w:w="120" w:type="dxa"/>
+              <w:bottom w:w="80" w:type="dxa"/>
+              <w:right w:w="120" w:type="dxa"/>
+            </w:tcMar>
+            <w:vAlign w:val="center"/>
+          </w:tcPr>
+          <w:p>
+            <w:pPr>
+              <w:jc w:val="center"/>
+            </w:pPr>
             <w:r>
               <w:rPr>
                 <w:b/>
@@ -1492,15 +1328,13 @@
                 <w:sz w:val="18"/>
                 <w:szCs w:val="18"/>
               </w:rPr>
-              <w:t>المعيار</w:t>
-            </w:r>
-            <w:proofErr w:type="spellEnd"/>
-          </w:p>
-        </w:tc>
-        <w:tc>
-          <w:tcPr>
-            <w:tcW w:w="4560" w:type="dxa"/>
-            <w:gridSpan w:val="2"/>
+              <w:t>Picture — الصورة</w:t>
+            </w:r>
+          </w:p>
+        </w:tc>
+        <w:tc>
+          <w:tcPr>
+            <w:tcW w:w="2360" w:type="dxa"/>
             <w:shd w:val="clear" w:color="auto" w:fill="12171F"/>
             <w:tcMar>
               <w:top w:w="80" w:type="dxa"/>
@@ -1522,60 +1356,8 @@
                 <w:sz w:val="18"/>
                 <w:szCs w:val="18"/>
               </w:rPr>
-              <w:t xml:space="preserve">Picture — </w:t>
-            </w:r>
-            <w:proofErr w:type="spellStart"/>
-            <w:r>
-              <w:rPr>
-                <w:b/>
-                <w:bCs/>
-                <w:color w:val="FFFFFF"/>
-                <w:sz w:val="18"/>
-                <w:szCs w:val="18"/>
-              </w:rPr>
-              <w:t>الصورة</w:t>
-            </w:r>
-            <w:proofErr w:type="spellEnd"/>
-          </w:p>
-        </w:tc>
-        <w:tc>
-          <w:tcPr>
-            <w:tcW w:w="2360" w:type="dxa"/>
-            <w:shd w:val="clear" w:color="auto" w:fill="12171F"/>
-            <w:tcMar>
-              <w:top w:w="80" w:type="dxa"/>
-              <w:left w:w="120" w:type="dxa"/>
-              <w:bottom w:w="80" w:type="dxa"/>
-              <w:right w:w="120" w:type="dxa"/>
-            </w:tcMar>
-            <w:vAlign w:val="center"/>
-          </w:tcPr>
-          <w:p>
-            <w:pPr>
-              <w:jc w:val="center"/>
-            </w:pPr>
-            <w:r>
-              <w:rPr>
-                <w:b/>
-                <w:bCs/>
-                <w:color w:val="FFFFFF"/>
-                <w:sz w:val="18"/>
-                <w:szCs w:val="18"/>
-              </w:rPr>
-              <w:t xml:space="preserve">Sound — </w:t>
-            </w:r>
-            <w:proofErr w:type="spellStart"/>
-            <w:r>
-              <w:rPr>
-                <w:b/>
-                <w:bCs/>
-                <w:color w:val="FFFFFF"/>
-                <w:sz w:val="18"/>
-                <w:szCs w:val="18"/>
-              </w:rPr>
-              <w:t>الصوت</w:t>
-            </w:r>
-            <w:proofErr w:type="spellEnd"/>
+              <w:t>Sound — الصوت</w:t>
+            </w:r>
           </w:p>
         </w:tc>
       </w:tr>
@@ -1691,17 +1473,8 @@
                 <w:b/>
                 <w:bCs/>
               </w:rPr>
-              <w:t xml:space="preserve">Codec / </w:t>
-            </w:r>
-            <w:proofErr w:type="spellStart"/>
-            <w:r>
-              <w:rPr>
-                <w:b/>
-                <w:bCs/>
-              </w:rPr>
-              <w:t>الترميز</w:t>
-            </w:r>
-            <w:proofErr w:type="spellEnd"/>
+              <w:t>Codec / الترميز</w:t>
+            </w:r>
           </w:p>
         </w:tc>
         <w:tc>
@@ -1716,13 +1489,8 @@
             <w:vAlign w:val="center"/>
           </w:tcPr>
           <w:p>
-            <w:proofErr w:type="spellStart"/>
-            <w:r>
-              <w:t>ProRes</w:t>
-            </w:r>
-            <w:proofErr w:type="spellEnd"/>
-            <w:r>
-              <w:t xml:space="preserve"> 422 HQ</w:t>
+            <w:r>
+              <w:t>ProRes 422 HQ</w:t>
             </w:r>
           </w:p>
         </w:tc>
@@ -1781,17 +1549,72 @@
                 <w:b/>
                 <w:bCs/>
               </w:rPr>
-              <w:t xml:space="preserve">Resolution / </w:t>
-            </w:r>
-            <w:proofErr w:type="spellStart"/>
+              <w:t>Resolution / الدقة</w:t>
+            </w:r>
+          </w:p>
+        </w:tc>
+        <w:tc>
+          <w:tcPr>
+            <w:tcW w:w="2200" w:type="dxa"/>
+            <w:tcMar>
+              <w:top w:w="80" w:type="dxa"/>
+              <w:left w:w="120" w:type="dxa"/>
+              <w:bottom w:w="80" w:type="dxa"/>
+              <w:right w:w="120" w:type="dxa"/>
+            </w:tcMar>
+            <w:vAlign w:val="center"/>
+          </w:tcPr>
+          <w:p>
+            <w:r>
+              <w:t>3840 × 2160</w:t>
+            </w:r>
+          </w:p>
+        </w:tc>
+        <w:tc>
+          <w:tcPr>
+            <w:tcW w:w="2360" w:type="dxa"/>
+            <w:tcMar>
+              <w:top w:w="80" w:type="dxa"/>
+              <w:left w:w="120" w:type="dxa"/>
+              <w:bottom w:w="80" w:type="dxa"/>
+              <w:right w:w="120" w:type="dxa"/>
+            </w:tcMar>
+            <w:vAlign w:val="center"/>
+          </w:tcPr>
+          <w:p>
+            <w:r>
+              <w:t>1920 × 1080</w:t>
+            </w:r>
+          </w:p>
+        </w:tc>
+        <w:tc>
+          <w:tcPr>
+            <w:tcW w:w="0" w:type="auto"/>
+            <w:vMerge/>
+          </w:tcPr>
+          <w:p/>
+        </w:tc>
+      </w:tr>
+      <w:tr>
+        <w:tc>
+          <w:tcPr>
+            <w:tcW w:w="2200" w:type="dxa"/>
+            <w:tcMar>
+              <w:top w:w="80" w:type="dxa"/>
+              <w:left w:w="120" w:type="dxa"/>
+              <w:bottom w:w="80" w:type="dxa"/>
+              <w:right w:w="120" w:type="dxa"/>
+            </w:tcMar>
+            <w:vAlign w:val="center"/>
+          </w:tcPr>
+          <w:p>
             <w:r>
               <w:rPr>
                 <w:b/>
                 <w:bCs/>
               </w:rPr>
-              <w:t>الدقة</w:t>
-            </w:r>
-            <w:proofErr w:type="spellEnd"/>
+              <w:t>Loudness / الجهارة</w:t>
+            </w:r>
           </w:p>
         </w:tc>
         <w:tc>
@@ -1807,7 +1630,13 @@
           </w:tcPr>
           <w:p>
             <w:r>
-              <w:t>3840 × 2160</w:t>
+              <w:t xml:space="preserve">−23 LUFS </w:t>
+            </w:r>
+            <w:r>
+              <w:rPr>
+                <w:rStyle w:val="FootnoteReference"/>
+              </w:rPr>
+              <w:footnoteReference w:id="1"/>
             </w:r>
           </w:p>
         </w:tc>
@@ -1824,16 +1653,26 @@
           </w:tcPr>
           <w:p>
             <w:r>
-              <w:t>1920 × 1080</w:t>
-            </w:r>
-          </w:p>
-        </w:tc>
-        <w:tc>
-          <w:tcPr>
-            <w:tcW w:w="0" w:type="auto"/>
-            <w:vMerge/>
-          </w:tcPr>
-          <w:p/>
+              <w:t>−16 LUFS</w:t>
+            </w:r>
+          </w:p>
+        </w:tc>
+        <w:tc>
+          <w:tcPr>
+            <w:tcW w:w="2360" w:type="dxa"/>
+            <w:tcMar>
+              <w:top w:w="80" w:type="dxa"/>
+              <w:left w:w="120" w:type="dxa"/>
+              <w:bottom w:w="80" w:type="dxa"/>
+              <w:right w:w="120" w:type="dxa"/>
+            </w:tcMar>
+            <w:vAlign w:val="center"/>
+          </w:tcPr>
+          <w:p>
+            <w:r>
+              <w:t>True peak ≤ −1 dBTP</w:t>
+            </w:r>
+          </w:p>
         </w:tc>
       </w:tr>
       <w:tr>
@@ -1854,111 +1693,8 @@
                 <w:b/>
                 <w:bCs/>
               </w:rPr>
-              <w:t xml:space="preserve">Loudness / </w:t>
-            </w:r>
-            <w:proofErr w:type="spellStart"/>
-            <w:r>
-              <w:rPr>
-                <w:b/>
-                <w:bCs/>
-              </w:rPr>
-              <w:t>الجهارة</w:t>
-            </w:r>
-            <w:proofErr w:type="spellEnd"/>
-          </w:p>
-        </w:tc>
-        <w:tc>
-          <w:tcPr>
-            <w:tcW w:w="2200" w:type="dxa"/>
-            <w:tcMar>
-              <w:top w:w="80" w:type="dxa"/>
-              <w:left w:w="120" w:type="dxa"/>
-              <w:bottom w:w="80" w:type="dxa"/>
-              <w:right w:w="120" w:type="dxa"/>
-            </w:tcMar>
-            <w:vAlign w:val="center"/>
-          </w:tcPr>
-          <w:p>
-            <w:r>
-              <w:t xml:space="preserve">−23 LUFS </w:t>
-            </w:r>
-            <w:r>
-              <w:rPr>
-                <w:rStyle w:val="FootnoteReference"/>
-              </w:rPr>
-              <w:footnoteReference w:id="1"/>
-            </w:r>
-          </w:p>
-        </w:tc>
-        <w:tc>
-          <w:tcPr>
-            <w:tcW w:w="2360" w:type="dxa"/>
-            <w:tcMar>
-              <w:top w:w="80" w:type="dxa"/>
-              <w:left w:w="120" w:type="dxa"/>
-              <w:bottom w:w="80" w:type="dxa"/>
-              <w:right w:w="120" w:type="dxa"/>
-            </w:tcMar>
-            <w:vAlign w:val="center"/>
-          </w:tcPr>
-          <w:p>
-            <w:r>
-              <w:t>−16 LUFS</w:t>
-            </w:r>
-          </w:p>
-        </w:tc>
-        <w:tc>
-          <w:tcPr>
-            <w:tcW w:w="2360" w:type="dxa"/>
-            <w:tcMar>
-              <w:top w:w="80" w:type="dxa"/>
-              <w:left w:w="120" w:type="dxa"/>
-              <w:bottom w:w="80" w:type="dxa"/>
-              <w:right w:w="120" w:type="dxa"/>
-            </w:tcMar>
-            <w:vAlign w:val="center"/>
-          </w:tcPr>
-          <w:p>
-            <w:r>
-              <w:t xml:space="preserve">True peak ≤ −1 </w:t>
-            </w:r>
-            <w:proofErr w:type="spellStart"/>
-            <w:r>
-              <w:t>dBTP</w:t>
-            </w:r>
-            <w:proofErr w:type="spellEnd"/>
-          </w:p>
-        </w:tc>
-      </w:tr>
-      <w:tr>
-        <w:tc>
-          <w:tcPr>
-            <w:tcW w:w="2200" w:type="dxa"/>
-            <w:tcMar>
-              <w:top w:w="80" w:type="dxa"/>
-              <w:left w:w="120" w:type="dxa"/>
-              <w:bottom w:w="80" w:type="dxa"/>
-              <w:right w:w="120" w:type="dxa"/>
-            </w:tcMar>
-            <w:vAlign w:val="center"/>
-          </w:tcPr>
-          <w:p>
-            <w:r>
-              <w:rPr>
-                <w:b/>
-                <w:bCs/>
-              </w:rPr>
-              <w:t xml:space="preserve">Subtitles / </w:t>
-            </w:r>
-            <w:proofErr w:type="spellStart"/>
-            <w:r>
-              <w:rPr>
-                <w:b/>
-                <w:bCs/>
-              </w:rPr>
-              <w:t>الترجمة</w:t>
-            </w:r>
-            <w:proofErr w:type="spellEnd"/>
+              <w:t>Subtitles / الترجمة</w:t>
+            </w:r>
           </w:p>
         </w:tc>
         <w:tc>
@@ -2045,35 +1781,15 @@
           <w:sz w:val="17"/>
           <w:szCs w:val="17"/>
         </w:rPr>
-        <w:t xml:space="preserve">Table 1 — Delivery specification by </w:t>
-      </w:r>
-      <w:proofErr w:type="gramStart"/>
-      <w:r>
-        <w:rPr>
-          <w:i/>
-          <w:iCs/>
+        <w:t>Table 1 — Delivery specification by version</w:t>
+      </w:r>
+      <w:r>
+        <w:rPr>
           <w:color w:val="5B6470"/>
           <w:sz w:val="17"/>
           <w:szCs w:val="17"/>
         </w:rPr>
-        <w:t>version</w:t>
-      </w:r>
-      <w:r>
-        <w:rPr>
-          <w:color w:val="5B6470"/>
-          <w:sz w:val="17"/>
-          <w:szCs w:val="17"/>
-        </w:rPr>
-        <w:t xml:space="preserve">  •</w:t>
-      </w:r>
-      <w:proofErr w:type="gramEnd"/>
-      <w:r>
-        <w:rPr>
-          <w:color w:val="5B6470"/>
-          <w:sz w:val="17"/>
-          <w:szCs w:val="17"/>
-        </w:rPr>
-        <w:t xml:space="preserve">  </w:t>
+        <w:t xml:space="preserve">  •  </w:t>
       </w:r>
       <w:r>
         <w:rPr>
@@ -2148,35 +1864,15 @@
           <w:sz w:val="17"/>
           <w:szCs w:val="17"/>
         </w:rPr>
-        <w:t xml:space="preserve">Figure 1 — Calibration strip shipped at the head of every </w:t>
-      </w:r>
-      <w:proofErr w:type="gramStart"/>
-      <w:r>
-        <w:rPr>
-          <w:i/>
-          <w:iCs/>
+        <w:t>Figure 1 — Calibration strip shipped at the head of every master</w:t>
+      </w:r>
+      <w:r>
+        <w:rPr>
           <w:color w:val="5B6470"/>
           <w:sz w:val="17"/>
           <w:szCs w:val="17"/>
         </w:rPr>
-        <w:t>master</w:t>
-      </w:r>
-      <w:r>
-        <w:rPr>
-          <w:color w:val="5B6470"/>
-          <w:sz w:val="17"/>
-          <w:szCs w:val="17"/>
-        </w:rPr>
-        <w:t xml:space="preserve">  •</w:t>
-      </w:r>
-      <w:proofErr w:type="gramEnd"/>
-      <w:r>
-        <w:rPr>
-          <w:color w:val="5B6470"/>
-          <w:sz w:val="17"/>
-          <w:szCs w:val="17"/>
-        </w:rPr>
-        <w:t xml:space="preserve">  </w:t>
+        <w:t xml:space="preserve">  •  </w:t>
       </w:r>
       <w:r>
         <w:rPr>
@@ -2441,11 +2137,512 @@
     </w:p>
     <w:p>
       <w:pPr>
+        <w:pStyle w:val="Heading1"/>
+        <w:rPr>
+          <w:rFonts w:ascii="Times New Roman" w:hAnsi="Times New Roman" w:cs="Times New Roman"/>
+          <w:rtl/>
+        </w:rPr>
+      </w:pPr>
+      <w:r>
+        <w:t xml:space="preserve">5. Delivery tracker / </w:t>
+      </w:r>
+      <w:r>
+        <w:rPr>
+          <w:rFonts w:ascii="Times New Roman" w:hAnsi="Times New Roman" w:cs="Times New Roman" w:hint="cs"/>
+          <w:rtl/>
+        </w:rPr>
+        <w:t>متابعة</w:t>
+      </w:r>
+      <w:r>
+        <w:rPr>
+          <w:rtl/>
+        </w:rPr>
+        <w:t xml:space="preserve"> </w:t>
+      </w:r>
+      <w:r>
+        <w:rPr>
+          <w:rFonts w:ascii="Times New Roman" w:hAnsi="Times New Roman" w:cs="Times New Roman" w:hint="cs"/>
+          <w:rtl/>
+        </w:rPr>
+        <w:t>التسليم</w:t>
+      </w:r>
+    </w:p>
+    <w:p>
+      <w:pPr>
+        <w:bidi/>
+        <w:spacing w:line="360" w:lineRule="exact"/>
+        <w:jc w:val="right"/>
+        <w:rPr>
+          <w:rtl/>
+        </w:rPr>
+      </w:pPr>
+      <w:r>
+        <w:rPr>
+          <w:rtl/>
+        </w:rPr>
+        <w:t xml:space="preserve">آخر تحديث </w:t>
+      </w:r>
+      <w:r>
+        <w:rPr>
+          <w:rFonts w:ascii="Calibri" w:hAnsi="Calibri"/>
+        </w:rPr>
+        <w:t>15 Oct 2026</w:t>
+      </w:r>
+      <w:r>
+        <w:rPr>
+          <w:rtl/>
+        </w:rPr>
+        <w:t xml:space="preserve"> بنسبة إنجاز </w:t>
+      </w:r>
+      <w:r>
+        <w:rPr>
+          <w:rFonts w:ascii="Calibri" w:hAnsi="Calibri"/>
+        </w:rPr>
+        <w:t>71%</w:t>
+      </w:r>
+    </w:p>
+    <w:p>
+      <w:pPr>
+        <w:bidi/>
+        <w:jc w:val="right"/>
+      </w:pPr>
+      <w:r>
+        <w:rPr>
+          <w:rtl/>
+        </w:rPr>
+        <w:t>حالة حلقات الموسم الثاني حتى تاريخ هذا الملخص</w:t>
+      </w:r>
+      <w:r>
+        <w:t>.</w:t>
+      </w:r>
+    </w:p>
+    <w:tbl>
+      <w:tblPr>
+        <w:bidiVisual/>
+        <w:tblW w:w="10052" w:type="dxa"/>
+        <w:tblInd w:w="25" w:type="dxa"/>
+        <w:tblBorders>
+          <w:top w:val="single" w:sz="8" w:space="0" w:color="1E3A5A"/>
+          <w:left w:val="single" w:sz="24" w:space="0" w:color="1E3A5A"/>
+          <w:bottom w:val="single" w:sz="8" w:space="0" w:color="1E3A5A"/>
+          <w:right w:val="single" w:sz="4" w:space="0" w:color="C8C8C8"/>
+          <w:insideH w:val="single" w:sz="4" w:space="0" w:color="C8C8C8"/>
+        </w:tblBorders>
+        <w:tblLayout w:type="fixed"/>
+        <w:tblCellMar>
+          <w:left w:w="432" w:type="dxa"/>
+          <w:right w:w="72" w:type="dxa"/>
+        </w:tblCellMar>
+        <w:tblLook w:val="0000" w:firstRow="0" w:lastRow="0" w:firstColumn="0" w:lastColumn="0" w:noHBand="0" w:noVBand="0"/>
+      </w:tblPr>
+      <w:tblGrid>
+        <w:gridCol w:w="2513"/>
+        <w:gridCol w:w="2513"/>
+        <w:gridCol w:w="2513"/>
+        <w:gridCol w:w="2513"/>
+      </w:tblGrid>
+      <w:tr>
+        <w:tc>
+          <w:tcPr>
+            <w:tcW w:w="2513" w:type="dxa"/>
+            <w:shd w:val="clear" w:color="auto" w:fill="F4EFE6"/>
+          </w:tcPr>
+          <w:p>
+            <w:pPr>
+              <w:bidi/>
+              <w:jc w:val="right"/>
+              <w:rPr>
+                <w:rtl/>
+              </w:rPr>
+            </w:pPr>
+            <w:r>
+              <w:rPr>
+                <w:rtl/>
+              </w:rPr>
+              <w:t>الحلقة</w:t>
+            </w:r>
+          </w:p>
+        </w:tc>
+        <w:tc>
+          <w:tcPr>
+            <w:tcW w:w="2513" w:type="dxa"/>
+            <w:shd w:val="clear" w:color="auto" w:fill="F4EFE6"/>
+          </w:tcPr>
+          <w:p>
+            <w:pPr>
+              <w:bidi/>
+              <w:jc w:val="right"/>
+              <w:rPr>
+                <w:rtl/>
+              </w:rPr>
+            </w:pPr>
+            <w:r>
+              <w:rPr>
+                <w:rtl/>
+              </w:rPr>
+              <w:t>موقع التصوير</w:t>
+            </w:r>
+          </w:p>
+        </w:tc>
+        <w:tc>
+          <w:tcPr>
+            <w:tcW w:w="2513" w:type="dxa"/>
+            <w:shd w:val="clear" w:color="auto" w:fill="F4EFE6"/>
+          </w:tcPr>
+          <w:p>
+            <w:pPr>
+              <w:bidi/>
+              <w:jc w:val="right"/>
+              <w:rPr>
+                <w:rtl/>
+              </w:rPr>
+            </w:pPr>
+            <w:r>
+              <w:rPr>
+                <w:rtl/>
+              </w:rPr>
+              <w:t>المدة</w:t>
+            </w:r>
+          </w:p>
+        </w:tc>
+        <w:tc>
+          <w:tcPr>
+            <w:tcW w:w="2513" w:type="dxa"/>
+            <w:shd w:val="clear" w:color="auto" w:fill="F4EFE6"/>
+          </w:tcPr>
+          <w:p>
+            <w:pPr>
+              <w:bidi/>
+              <w:jc w:val="right"/>
+              <w:rPr>
+                <w:rtl/>
+              </w:rPr>
+            </w:pPr>
+            <w:r>
+              <w:rPr>
+                <w:rtl/>
+              </w:rPr>
+              <w:t>الحالة</w:t>
+            </w:r>
+          </w:p>
+        </w:tc>
+      </w:tr>
+      <w:tr>
+        <w:tc>
+          <w:tcPr>
+            <w:tcW w:w="2513" w:type="dxa"/>
+          </w:tcPr>
+          <w:p>
+            <w:pPr>
+              <w:bidi/>
+              <w:jc w:val="right"/>
+              <w:rPr>
+                <w:rtl/>
+              </w:rPr>
+            </w:pPr>
+            <w:r>
+              <w:rPr>
+                <w:rtl/>
+              </w:rPr>
+              <w:t>الحلقة ٤</w:t>
+            </w:r>
+          </w:p>
+        </w:tc>
+        <w:tc>
+          <w:tcPr>
+            <w:tcW w:w="2513" w:type="dxa"/>
+          </w:tcPr>
+          <w:p>
+            <w:pPr>
+              <w:bidi/>
+              <w:jc w:val="right"/>
+              <w:rPr>
+                <w:rtl/>
+              </w:rPr>
+            </w:pPr>
+            <w:r>
+              <w:rPr>
+                <w:rtl/>
+              </w:rPr>
+              <w:t>أسوان</w:t>
+            </w:r>
+          </w:p>
+        </w:tc>
+        <w:tc>
+          <w:tcPr>
+            <w:tcW w:w="2513" w:type="dxa"/>
+          </w:tcPr>
+          <w:p>
+            <w:pPr>
+              <w:bidi/>
+              <w:jc w:val="right"/>
+              <w:rPr>
+                <w:rtl/>
+              </w:rPr>
+            </w:pPr>
+            <w:r>
+              <w:rPr>
+                <w:rtl/>
+              </w:rPr>
+              <w:t>52:10</w:t>
+            </w:r>
+          </w:p>
+        </w:tc>
+        <w:tc>
+          <w:tcPr>
+            <w:tcW w:w="2513" w:type="dxa"/>
+          </w:tcPr>
+          <w:p>
+            <w:pPr>
+              <w:bidi/>
+              <w:jc w:val="right"/>
+              <w:rPr>
+                <w:rtl/>
+              </w:rPr>
+            </w:pPr>
+            <w:r>
+              <w:rPr>
+                <w:rtl/>
+              </w:rPr>
+              <w:t>تسليم نهائي</w:t>
+            </w:r>
+          </w:p>
+        </w:tc>
+      </w:tr>
+      <w:tr>
+        <w:tc>
+          <w:tcPr>
+            <w:tcW w:w="2513" w:type="dxa"/>
+          </w:tcPr>
+          <w:p>
+            <w:pPr>
+              <w:bidi/>
+              <w:jc w:val="right"/>
+              <w:rPr>
+                <w:rtl/>
+              </w:rPr>
+            </w:pPr>
+            <w:r>
+              <w:rPr>
+                <w:rtl/>
+              </w:rPr>
+              <w:t>الحلقة ٥</w:t>
+            </w:r>
+          </w:p>
+        </w:tc>
+        <w:tc>
+          <w:tcPr>
+            <w:tcW w:w="2513" w:type="dxa"/>
+          </w:tcPr>
+          <w:p>
+            <w:pPr>
+              <w:bidi/>
+              <w:jc w:val="right"/>
+              <w:rPr>
+                <w:rtl/>
+              </w:rPr>
+            </w:pPr>
+            <w:r>
+              <w:rPr>
+                <w:rtl/>
+              </w:rPr>
+              <w:t>إسنا</w:t>
+            </w:r>
+          </w:p>
+        </w:tc>
+        <w:tc>
+          <w:tcPr>
+            <w:tcW w:w="2513" w:type="dxa"/>
+          </w:tcPr>
+          <w:p>
+            <w:pPr>
+              <w:bidi/>
+              <w:jc w:val="right"/>
+              <w:rPr>
+                <w:rtl/>
+              </w:rPr>
+            </w:pPr>
+            <w:r>
+              <w:rPr>
+                <w:rtl/>
+              </w:rPr>
+              <w:t>49:35</w:t>
+            </w:r>
+          </w:p>
+        </w:tc>
+        <w:tc>
+          <w:tcPr>
+            <w:tcW w:w="2513" w:type="dxa"/>
+          </w:tcPr>
+          <w:p>
+            <w:pPr>
+              <w:bidi/>
+              <w:jc w:val="right"/>
+              <w:rPr>
+                <w:rtl/>
+              </w:rPr>
+            </w:pPr>
+            <w:r>
+              <w:rPr>
+                <w:rtl/>
+              </w:rPr>
+              <w:t>تصحيح ألوان</w:t>
+            </w:r>
+          </w:p>
+        </w:tc>
+      </w:tr>
+      <w:tr>
+        <w:tc>
+          <w:tcPr>
+            <w:tcW w:w="2513" w:type="dxa"/>
+          </w:tcPr>
+          <w:p>
+            <w:pPr>
+              <w:bidi/>
+              <w:jc w:val="right"/>
+              <w:rPr>
+                <w:rtl/>
+              </w:rPr>
+            </w:pPr>
+            <w:r>
+              <w:rPr>
+                <w:rtl/>
+              </w:rPr>
+              <w:t>الحلقة ٦</w:t>
+            </w:r>
+          </w:p>
+        </w:tc>
+        <w:tc>
+          <w:tcPr>
+            <w:tcW w:w="2513" w:type="dxa"/>
+          </w:tcPr>
+          <w:p>
+            <w:pPr>
+              <w:bidi/>
+              <w:jc w:val="right"/>
+              <w:rPr>
+                <w:rtl/>
+              </w:rPr>
+            </w:pPr>
+            <w:r>
+              <w:rPr>
+                <w:rtl/>
+              </w:rPr>
+              <w:t>الأقصر</w:t>
+            </w:r>
+          </w:p>
+        </w:tc>
+        <w:tc>
+          <w:tcPr>
+            <w:tcW w:w="2513" w:type="dxa"/>
+          </w:tcPr>
+          <w:p>
+            <w:pPr>
+              <w:bidi/>
+              <w:jc w:val="right"/>
+              <w:rPr>
+                <w:rtl/>
+              </w:rPr>
+            </w:pPr>
+            <w:r>
+              <w:rPr>
+                <w:rtl/>
+              </w:rPr>
+              <w:t>51:02</w:t>
+            </w:r>
+          </w:p>
+        </w:tc>
+        <w:tc>
+          <w:tcPr>
+            <w:tcW w:w="2513" w:type="dxa"/>
+          </w:tcPr>
+          <w:p>
+            <w:pPr>
+              <w:bidi/>
+              <w:jc w:val="right"/>
+              <w:rPr>
+                <w:rtl/>
+              </w:rPr>
+            </w:pPr>
+            <w:r>
+              <w:rPr>
+                <w:rtl/>
+              </w:rPr>
+              <w:t>مونتاج</w:t>
+            </w:r>
+          </w:p>
+        </w:tc>
+      </w:tr>
+      <w:tr>
+        <w:tc>
+          <w:tcPr>
+            <w:tcW w:w="5026" w:type="dxa"/>
+            <w:gridSpan w:val="2"/>
+          </w:tcPr>
+          <w:p>
+            <w:pPr>
+              <w:pStyle w:val="Heading2"/>
+              <w:bidi/>
+              <w:jc w:val="right"/>
+              <w:rPr>
+                <w:rtl/>
+              </w:rPr>
+            </w:pPr>
+            <w:r>
+              <w:rPr>
+                <w:rFonts w:ascii="Times New Roman" w:hAnsi="Times New Roman" w:cs="Times New Roman" w:hint="cs"/>
+                <w:rtl/>
+              </w:rPr>
+              <w:t>الإجمالي</w:t>
+            </w:r>
+          </w:p>
+        </w:tc>
+        <w:tc>
+          <w:tcPr>
+            <w:tcW w:w="2513" w:type="dxa"/>
+          </w:tcPr>
+          <w:p>
+            <w:pPr>
+              <w:bidi/>
+              <w:jc w:val="right"/>
+              <w:rPr>
+                <w:rtl/>
+              </w:rPr>
+            </w:pPr>
+            <w:r>
+              <w:rPr>
+                <w:rtl/>
+              </w:rPr>
+              <w:t>152:47</w:t>
+            </w:r>
+          </w:p>
+        </w:tc>
+        <w:tc>
+          <w:tcPr>
+            <w:tcW w:w="2513" w:type="dxa"/>
+          </w:tcPr>
+          <w:p>
+            <w:pPr>
+              <w:bidi/>
+              <w:jc w:val="right"/>
+              <w:rPr>
+                <w:rtl/>
+              </w:rPr>
+            </w:pPr>
+          </w:p>
+        </w:tc>
+      </w:tr>
+    </w:tbl>
+    <w:p>
+      <w:pPr>
+        <w:bidi/>
+      </w:pPr>
+    </w:p>
+    <w:p>
+      <w:pPr>
         <w:sectPr>
-          <w:headerReference w:type="even" r:id="rId11"/>
           <w:headerReference w:type="default" r:id="rId12"/>
           <w:footerReference w:type="default" r:id="rId13"/>
-          <w:headerReference w:type="first" r:id="rId14"/>
           <w:pgSz w:w="11906" w:h="16838"/>
           <w:pgMar w:top="720" w:right="720" w:bottom="720" w:left="1134" w:header="708" w:footer="708" w:gutter="0"/>
           <w:cols w:space="720"/>
@@ -2578,7 +2775,6 @@
             <w:vAlign w:val="center"/>
           </w:tcPr>
           <w:p>
-            <w:proofErr w:type="spellStart"/>
             <w:r>
               <w:rPr>
                 <w:b/>
@@ -2589,7 +2785,6 @@
               </w:rPr>
               <w:t>المشهد</w:t>
             </w:r>
-            <w:proofErr w:type="spellEnd"/>
           </w:p>
         </w:tc>
         <w:tc>
@@ -2663,20 +2858,8 @@
                 <w:sz w:val="17"/>
                 <w:szCs w:val="17"/>
               </w:rPr>
-              <w:t xml:space="preserve">Notes / </w:t>
-            </w:r>
-            <w:proofErr w:type="spellStart"/>
-            <w:r>
-              <w:rPr>
-                <w:b/>
-                <w:bCs/>
-                <w:color w:val="FFFFFF"/>
-                <w:sz w:val="17"/>
-                <w:szCs w:val="17"/>
-              </w:rPr>
-              <w:t>ملاحظات</w:t>
-            </w:r>
-            <w:proofErr w:type="spellEnd"/>
+              <w:t>Notes / ملاحظات</w:t>
+            </w:r>
           </w:p>
         </w:tc>
       </w:tr>
@@ -2809,9 +2992,132 @@
                 <w:sz w:val="18"/>
                 <w:szCs w:val="18"/>
               </w:rPr>
-              <w:t xml:space="preserve">Handheld, no </w:t>
-            </w:r>
-            <w:proofErr w:type="spellStart"/>
+              <w:t>Handheld, no stabiliser</w:t>
+            </w:r>
+          </w:p>
+        </w:tc>
+      </w:tr>
+      <w:tr>
+        <w:tc>
+          <w:tcPr>
+            <w:tcW w:w="900" w:type="dxa"/>
+            <w:tcMar>
+              <w:top w:w="80" w:type="dxa"/>
+              <w:left w:w="120" w:type="dxa"/>
+              <w:bottom w:w="80" w:type="dxa"/>
+              <w:right w:w="120" w:type="dxa"/>
+            </w:tcMar>
+            <w:vAlign w:val="center"/>
+          </w:tcPr>
+          <w:p>
+            <w:pPr>
+              <w:jc w:val="center"/>
+            </w:pPr>
+            <w:r>
+              <w:rPr>
+                <w:b/>
+                <w:bCs/>
+                <w:color w:val="B87F1E"/>
+              </w:rPr>
+              <w:t>02</w:t>
+            </w:r>
+          </w:p>
+        </w:tc>
+        <w:tc>
+          <w:tcPr>
+            <w:tcW w:w="3400" w:type="dxa"/>
+            <w:tcMar>
+              <w:top w:w="80" w:type="dxa"/>
+              <w:left w:w="120" w:type="dxa"/>
+              <w:bottom w:w="80" w:type="dxa"/>
+              <w:right w:w="120" w:type="dxa"/>
+            </w:tcMar>
+            <w:vAlign w:val="center"/>
+          </w:tcPr>
+          <w:p>
+            <w:r>
+              <w:t>Hands mending a net</w:t>
+            </w:r>
+          </w:p>
+        </w:tc>
+        <w:tc>
+          <w:tcPr>
+            <w:tcW w:w="3400" w:type="dxa"/>
+            <w:tcMar>
+              <w:top w:w="80" w:type="dxa"/>
+              <w:left w:w="120" w:type="dxa"/>
+              <w:bottom w:w="80" w:type="dxa"/>
+              <w:right w:w="120" w:type="dxa"/>
+            </w:tcMar>
+            <w:vAlign w:val="center"/>
+          </w:tcPr>
+          <w:p>
+            <w:pPr>
+              <w:bidi/>
+              <w:jc w:val="right"/>
+            </w:pPr>
+            <w:r>
+              <w:rPr>
+                <w:sz w:val="22"/>
+                <w:szCs w:val="22"/>
+                <w:rtl/>
+              </w:rPr>
+              <w:t>أيادٍ تصلح شبكة صيد</w:t>
+            </w:r>
+          </w:p>
+        </w:tc>
+        <w:tc>
+          <w:tcPr>
+            <w:tcW w:w="1400" w:type="dxa"/>
+            <w:tcMar>
+              <w:top w:w="80" w:type="dxa"/>
+              <w:left w:w="120" w:type="dxa"/>
+              <w:bottom w:w="80" w:type="dxa"/>
+              <w:right w:w="120" w:type="dxa"/>
+            </w:tcMar>
+            <w:vAlign w:val="center"/>
+          </w:tcPr>
+          <w:p>
+            <w:pPr>
+              <w:jc w:val="center"/>
+            </w:pPr>
+            <w:r>
+              <w:t>01:15</w:t>
+            </w:r>
+          </w:p>
+        </w:tc>
+        <w:tc>
+          <w:tcPr>
+            <w:tcW w:w="1500" w:type="dxa"/>
+            <w:tcMar>
+              <w:top w:w="80" w:type="dxa"/>
+              <w:left w:w="120" w:type="dxa"/>
+              <w:bottom w:w="80" w:type="dxa"/>
+              <w:right w:w="120" w:type="dxa"/>
+            </w:tcMar>
+            <w:vAlign w:val="center"/>
+          </w:tcPr>
+          <w:p>
+            <w:pPr>
+              <w:jc w:val="center"/>
+            </w:pPr>
+            <w:r>
+              <w:t>85 mm</w:t>
+            </w:r>
+          </w:p>
+        </w:tc>
+        <w:tc>
+          <w:tcPr>
+            <w:tcW w:w="2800" w:type="dxa"/>
+            <w:tcMar>
+              <w:top w:w="80" w:type="dxa"/>
+              <w:left w:w="120" w:type="dxa"/>
+              <w:bottom w:w="80" w:type="dxa"/>
+              <w:right w:w="120" w:type="dxa"/>
+            </w:tcMar>
+            <w:vAlign w:val="center"/>
+          </w:tcPr>
+          <w:p>
             <w:r>
               <w:rPr>
                 <w:i/>
@@ -2820,9 +3126,8 @@
                 <w:sz w:val="18"/>
                 <w:szCs w:val="18"/>
               </w:rPr>
-              <w:t>stabiliser</w:t>
-            </w:r>
-            <w:proofErr w:type="spellEnd"/>
+              <w:t>Sync sound only</w:t>
+            </w:r>
           </w:p>
         </w:tc>
       </w:tr>
@@ -2848,7 +3153,7 @@
                 <w:bCs/>
                 <w:color w:val="B87F1E"/>
               </w:rPr>
-              <w:t>02</w:t>
+              <w:t>03</w:t>
             </w:r>
           </w:p>
         </w:tc>
@@ -2865,7 +3170,7 @@
           </w:tcPr>
           <w:p>
             <w:r>
-              <w:t>Hands mending a net</w:t>
+              <w:t>Interview — Umm Sayed, kitchen</w:t>
             </w:r>
           </w:p>
         </w:tc>
@@ -2891,7 +3196,7 @@
                 <w:szCs w:val="22"/>
                 <w:rtl/>
               </w:rPr>
-              <w:t>أيادٍ تصلح شبكة صيد</w:t>
+              <w:t>مقابلة — أم سيد، المطبخ</w:t>
             </w:r>
           </w:p>
         </w:tc>
@@ -2911,7 +3216,7 @@
               <w:jc w:val="center"/>
             </w:pPr>
             <w:r>
-              <w:t>01:15</w:t>
+              <w:t>06:30</w:t>
             </w:r>
           </w:p>
         </w:tc>
@@ -2931,7 +3236,7 @@
               <w:jc w:val="center"/>
             </w:pPr>
             <w:r>
-              <w:t>85 mm</w:t>
+              <w:t>35 mm</w:t>
             </w:r>
           </w:p>
         </w:tc>
@@ -2955,7 +3260,7 @@
                 <w:sz w:val="18"/>
                 <w:szCs w:val="18"/>
               </w:rPr>
-              <w:t>Sync sound only</w:t>
+              <w:t>Two-camera, 25p</w:t>
             </w:r>
           </w:p>
         </w:tc>
@@ -2982,7 +3287,7 @@
                 <w:bCs/>
                 <w:color w:val="B87F1E"/>
               </w:rPr>
-              <w:t>03</w:t>
+              <w:t>04</w:t>
             </w:r>
           </w:p>
         </w:tc>
@@ -2999,7 +3304,7 @@
           </w:tcPr>
           <w:p>
             <w:r>
-              <w:t>Interview — Umm Sayed, kitchen</w:t>
+              <w:t>Archive: 1974 irrigation reel</w:t>
             </w:r>
           </w:p>
         </w:tc>
@@ -3025,7 +3330,7 @@
                 <w:szCs w:val="22"/>
                 <w:rtl/>
               </w:rPr>
-              <w:t>مقابلة — أم سيد، المطبخ</w:t>
+              <w:t>أرشيف: شريط الري ١٩٧٤</w:t>
             </w:r>
           </w:p>
         </w:tc>
@@ -3045,7 +3350,7 @@
               <w:jc w:val="center"/>
             </w:pPr>
             <w:r>
-              <w:t>06:30</w:t>
+              <w:t>00:55</w:t>
             </w:r>
           </w:p>
         </w:tc>
@@ -3065,7 +3370,7 @@
               <w:jc w:val="center"/>
             </w:pPr>
             <w:r>
-              <w:t>35 mm</w:t>
+              <w:t>—</w:t>
             </w:r>
           </w:p>
         </w:tc>
@@ -3089,7 +3394,7 @@
                 <w:sz w:val="18"/>
                 <w:szCs w:val="18"/>
               </w:rPr>
-              <w:t>Two-camera, 25p</w:t>
+              <w:t>16 mm scan, 4K</w:t>
             </w:r>
           </w:p>
         </w:tc>
@@ -3116,7 +3421,7 @@
                 <w:bCs/>
                 <w:color w:val="B87F1E"/>
               </w:rPr>
-              <w:t>04</w:t>
+              <w:t>05</w:t>
             </w:r>
           </w:p>
         </w:tc>
@@ -3133,7 +3438,7 @@
           </w:tcPr>
           <w:p>
             <w:r>
-              <w:t>Archive: 1974 irrigation reel</w:t>
+              <w:t>Ferry crossing at dusk</w:t>
             </w:r>
           </w:p>
         </w:tc>
@@ -3159,7 +3464,7 @@
                 <w:szCs w:val="22"/>
                 <w:rtl/>
               </w:rPr>
-              <w:t>أرشيف: شريط الري ١٩٧٤</w:t>
+              <w:t>معدية عند الغروب</w:t>
             </w:r>
           </w:p>
         </w:tc>
@@ -3179,7 +3484,7 @@
               <w:jc w:val="center"/>
             </w:pPr>
             <w:r>
-              <w:t>00:55</w:t>
+              <w:t>01:08</w:t>
             </w:r>
           </w:p>
         </w:tc>
@@ -3199,7 +3504,7 @@
               <w:jc w:val="center"/>
             </w:pPr>
             <w:r>
-              <w:t>—</w:t>
+              <w:t>50 mm</w:t>
             </w:r>
           </w:p>
         </w:tc>
@@ -3223,140 +3528,6 @@
                 <w:sz w:val="18"/>
                 <w:szCs w:val="18"/>
               </w:rPr>
-              <w:t>16 mm scan, 4K</w:t>
-            </w:r>
-          </w:p>
-        </w:tc>
-      </w:tr>
-      <w:tr>
-        <w:tc>
-          <w:tcPr>
-            <w:tcW w:w="900" w:type="dxa"/>
-            <w:tcMar>
-              <w:top w:w="80" w:type="dxa"/>
-              <w:left w:w="120" w:type="dxa"/>
-              <w:bottom w:w="80" w:type="dxa"/>
-              <w:right w:w="120" w:type="dxa"/>
-            </w:tcMar>
-            <w:vAlign w:val="center"/>
-          </w:tcPr>
-          <w:p>
-            <w:pPr>
-              <w:jc w:val="center"/>
-            </w:pPr>
-            <w:r>
-              <w:rPr>
-                <w:b/>
-                <w:bCs/>
-                <w:color w:val="B87F1E"/>
-              </w:rPr>
-              <w:t>05</w:t>
-            </w:r>
-          </w:p>
-        </w:tc>
-        <w:tc>
-          <w:tcPr>
-            <w:tcW w:w="3400" w:type="dxa"/>
-            <w:tcMar>
-              <w:top w:w="80" w:type="dxa"/>
-              <w:left w:w="120" w:type="dxa"/>
-              <w:bottom w:w="80" w:type="dxa"/>
-              <w:right w:w="120" w:type="dxa"/>
-            </w:tcMar>
-            <w:vAlign w:val="center"/>
-          </w:tcPr>
-          <w:p>
-            <w:r>
-              <w:t>Ferry crossing at dusk</w:t>
-            </w:r>
-          </w:p>
-        </w:tc>
-        <w:tc>
-          <w:tcPr>
-            <w:tcW w:w="3400" w:type="dxa"/>
-            <w:tcMar>
-              <w:top w:w="80" w:type="dxa"/>
-              <w:left w:w="120" w:type="dxa"/>
-              <w:bottom w:w="80" w:type="dxa"/>
-              <w:right w:w="120" w:type="dxa"/>
-            </w:tcMar>
-            <w:vAlign w:val="center"/>
-          </w:tcPr>
-          <w:p>
-            <w:pPr>
-              <w:bidi/>
-              <w:jc w:val="right"/>
-            </w:pPr>
-            <w:r>
-              <w:rPr>
-                <w:sz w:val="22"/>
-                <w:szCs w:val="22"/>
-                <w:rtl/>
-              </w:rPr>
-              <w:t>معدية عند الغروب</w:t>
-            </w:r>
-          </w:p>
-        </w:tc>
-        <w:tc>
-          <w:tcPr>
-            <w:tcW w:w="1400" w:type="dxa"/>
-            <w:tcMar>
-              <w:top w:w="80" w:type="dxa"/>
-              <w:left w:w="120" w:type="dxa"/>
-              <w:bottom w:w="80" w:type="dxa"/>
-              <w:right w:w="120" w:type="dxa"/>
-            </w:tcMar>
-            <w:vAlign w:val="center"/>
-          </w:tcPr>
-          <w:p>
-            <w:pPr>
-              <w:jc w:val="center"/>
-            </w:pPr>
-            <w:r>
-              <w:t>01:08</w:t>
-            </w:r>
-          </w:p>
-        </w:tc>
-        <w:tc>
-          <w:tcPr>
-            <w:tcW w:w="1500" w:type="dxa"/>
-            <w:tcMar>
-              <w:top w:w="80" w:type="dxa"/>
-              <w:left w:w="120" w:type="dxa"/>
-              <w:bottom w:w="80" w:type="dxa"/>
-              <w:right w:w="120" w:type="dxa"/>
-            </w:tcMar>
-            <w:vAlign w:val="center"/>
-          </w:tcPr>
-          <w:p>
-            <w:pPr>
-              <w:jc w:val="center"/>
-            </w:pPr>
-            <w:r>
-              <w:t>50 mm</w:t>
-            </w:r>
-          </w:p>
-        </w:tc>
-        <w:tc>
-          <w:tcPr>
-            <w:tcW w:w="2800" w:type="dxa"/>
-            <w:tcMar>
-              <w:top w:w="80" w:type="dxa"/>
-              <w:left w:w="120" w:type="dxa"/>
-              <w:bottom w:w="80" w:type="dxa"/>
-              <w:right w:w="120" w:type="dxa"/>
-            </w:tcMar>
-            <w:vAlign w:val="center"/>
-          </w:tcPr>
-          <w:p>
-            <w:r>
-              <w:rPr>
-                <w:i/>
-                <w:iCs/>
-                <w:color w:val="5B6470"/>
-                <w:sz w:val="18"/>
-                <w:szCs w:val="18"/>
-              </w:rPr>
               <w:t>Golden hour, one take</w:t>
             </w:r>
           </w:p>
@@ -3376,35 +3547,15 @@
           <w:sz w:val="17"/>
           <w:szCs w:val="17"/>
         </w:rPr>
-        <w:t xml:space="preserve">Table 2 — Shot list extract (landscape </w:t>
-      </w:r>
-      <w:proofErr w:type="gramStart"/>
-      <w:r>
-        <w:rPr>
-          <w:i/>
-          <w:iCs/>
+        <w:t>Table 2 — Shot list extract (landscape section)</w:t>
+      </w:r>
+      <w:r>
+        <w:rPr>
           <w:color w:val="5B6470"/>
           <w:sz w:val="17"/>
           <w:szCs w:val="17"/>
         </w:rPr>
-        <w:t>section)</w:t>
-      </w:r>
-      <w:r>
-        <w:rPr>
-          <w:color w:val="5B6470"/>
-          <w:sz w:val="17"/>
-          <w:szCs w:val="17"/>
-        </w:rPr>
-        <w:t xml:space="preserve">  •</w:t>
-      </w:r>
-      <w:proofErr w:type="gramEnd"/>
-      <w:r>
-        <w:rPr>
-          <w:color w:val="5B6470"/>
-          <w:sz w:val="17"/>
-          <w:szCs w:val="17"/>
-        </w:rPr>
-        <w:t xml:space="preserve">  </w:t>
+        <w:t xml:space="preserve">  •  </w:t>
       </w:r>
       <w:r>
         <w:rPr>
@@ -3469,6 +3620,12 @@
       <w:pPr>
         <w:spacing w:before="80" w:after="240"/>
         <w:jc w:val="center"/>
+        <w:rPr>
+          <w:color w:val="5B6470"/>
+          <w:sz w:val="18"/>
+          <w:szCs w:val="18"/>
+          <w:rtl/>
+        </w:rPr>
       </w:pPr>
       <w:r>
         <w:rPr>
@@ -3478,35 +3635,15 @@
           <w:sz w:val="17"/>
           <w:szCs w:val="17"/>
         </w:rPr>
-        <w:t xml:space="preserve">Figure 2 — Reference frame for shot 05, </w:t>
-      </w:r>
-      <w:proofErr w:type="gramStart"/>
-      <w:r>
-        <w:rPr>
-          <w:i/>
-          <w:iCs/>
+        <w:t>Figure 2 — Reference frame for shot 05, graded</w:t>
+      </w:r>
+      <w:r>
+        <w:rPr>
           <w:color w:val="5B6470"/>
           <w:sz w:val="17"/>
           <w:szCs w:val="17"/>
         </w:rPr>
-        <w:t>graded</w:t>
-      </w:r>
-      <w:r>
-        <w:rPr>
-          <w:color w:val="5B6470"/>
-          <w:sz w:val="17"/>
-          <w:szCs w:val="17"/>
-        </w:rPr>
-        <w:t xml:space="preserve">  •</w:t>
-      </w:r>
-      <w:proofErr w:type="gramEnd"/>
-      <w:r>
-        <w:rPr>
-          <w:color w:val="5B6470"/>
-          <w:sz w:val="17"/>
-          <w:szCs w:val="17"/>
-        </w:rPr>
-        <w:t xml:space="preserve">  </w:t>
+        <w:t xml:space="preserve">  •  </w:t>
       </w:r>
       <w:r>
         <w:rPr>
@@ -3518,9 +3655,593 @@
         <w:t>الشكل ٢ — لقطة مرجعية للمشهد ٠٥ بعد تصحيح الألوان</w:t>
       </w:r>
     </w:p>
+    <w:p>
+      <w:pPr>
+        <w:pageBreakBefore/>
+        <w:bidi/>
+        <w:spacing w:before="80" w:after="240"/>
+        <w:jc w:val="both"/>
+      </w:pPr>
+      <w:r>
+        <w:rPr>
+          <w:noProof/>
+          <w:rtl/>
+          <w:lang w:val="ar-SA"/>
+        </w:rPr>
+        <w:lastRenderedPageBreak/>
+        <w:drawing>
+          <wp:anchor distT="114300" distB="114300" distL="114300" distR="114300" simplePos="0" relativeHeight="251658240" behindDoc="0" locked="0" layoutInCell="1" allowOverlap="1" wp14:anchorId="0905AE06" wp14:editId="53954654">
+            <wp:simplePos x="0" y="0"/>
+            <wp:positionH relativeFrom="column">
+              <wp:align>left</wp:align>
+            </wp:positionH>
+            <wp:positionV relativeFrom="paragraph">
+              <wp:posOffset>76200</wp:posOffset>
+            </wp:positionV>
+            <wp:extent cx="685800" cy="685800"/>
+            <wp:effectExtent l="0" t="0" r="0" b="0"/>
+            <wp:wrapSquare wrapText="bothSides"/>
+            <wp:docPr id="692848898" name="Picture 1"/>
+            <wp:cNvGraphicFramePr>
+              <a:graphicFrameLocks xmlns:a="http://schemas.openxmlformats.org/drawingml/2006/main" noChangeAspect="1"/>
+            </wp:cNvGraphicFramePr>
+            <a:graphic xmlns:a="http://schemas.openxmlformats.org/drawingml/2006/main">
+              <a:graphicData uri="http://schemas.openxmlformats.org/drawingml/2006/picture">
+                <pic:pic xmlns:pic="http://schemas.openxmlformats.org/drawingml/2006/picture">
+                  <pic:nvPicPr>
+                    <pic:cNvPr id="692848898" name=""/>
+                    <pic:cNvPicPr/>
+                  </pic:nvPicPr>
+                  <pic:blipFill>
+                    <a:blip r:embed="rId16" cstate="print">
+                      <a:extLst>
+                        <a:ext uri="{28A0092B-C50C-407E-A947-70E740481C1C}">
+                          <a14:useLocalDpi xmlns:a14="http://schemas.microsoft.com/office/drawing/2010/main" val="0"/>
+                        </a:ext>
+                      </a:extLst>
+                    </a:blip>
+                    <a:stretch>
+                      <a:fillRect/>
+                    </a:stretch>
+                  </pic:blipFill>
+                  <pic:spPr>
+                    <a:xfrm>
+                      <a:off x="0" y="0"/>
+                      <a:ext cx="685800" cy="685800"/>
+                    </a:xfrm>
+                    <a:prstGeom prst="rect">
+                      <a:avLst/>
+                    </a:prstGeom>
+                  </pic:spPr>
+                </pic:pic>
+              </a:graphicData>
+            </a:graphic>
+            <wp14:sizeRelH relativeFrom="margin">
+              <wp14:pctWidth>0</wp14:pctWidth>
+            </wp14:sizeRelH>
+            <wp14:sizeRelV relativeFrom="margin">
+              <wp14:pctHeight>0</wp14:pctHeight>
+            </wp14:sizeRelV>
+          </wp:anchor>
+        </w:drawing>
+      </w:r>
+      <w:r>
+        <w:rPr>
+          <w:rtl/>
+        </w:rPr>
+        <w:t>التفاف مربع عند الطرف الأيسر: النسخة الأولية أطول من المطلوب بإحدى عشرة دقيقة، ومعظم الزيادة في الفصل الثاني حيث تتكرر المقابلتان. اختصار مشهد المطبخ يوفّر نحو ست دقائق دون المساس بمواد الأرشيف. النسخة الأولية أطول من المطلوب بإحدى عشرة دقيقة، ومعظم الزيادة في الفصل الثاني حيث تتكرر المقابلتان. اختصار مشهد المطبخ يوفّر نحو ست دقائق دون المساس بمواد الأرشيف. النسخة الأولية أطول من المطلوب بإحدى عشرة دقيقة، ومعظم الزيادة في الفصل الثاني حيث تتكرر المقابلتان. اختصار مشهد المطبخ يوفّر نحو ست دقائق دون المساس</w:t>
+      </w:r>
+      <w:r>
+        <w:t xml:space="preserve"> </w:t>
+      </w:r>
+      <w:r>
+        <w:rPr>
+          <w:rtl/>
+        </w:rPr>
+        <w:t>بمواد الأرشيف. النسخة الأولية أطول من المطلوب بإحدى عشرة دقيقة، ومعظم الزيادة في الفصل الثاني حيث تتكرر المقابلتان. اختصار مشهد المطبخ يوفّر نحو ست دقائق دون المساس بمواد الأرشيف</w:t>
+      </w:r>
+      <w:r>
+        <w:t xml:space="preserve">. </w:t>
+      </w:r>
+    </w:p>
+    <w:p>
+      <w:pPr>
+        <w:bidi/>
+        <w:spacing w:before="80" w:after="240"/>
+        <w:jc w:val="both"/>
+        <w:rPr>
+          <w:rtl/>
+        </w:rPr>
+      </w:pPr>
+      <w:r>
+        <w:rPr>
+          <w:noProof/>
+          <w:rtl/>
+          <w:lang w:val="ar-SA"/>
+        </w:rPr>
+        <w:drawing>
+          <wp:anchor distT="114300" distB="114300" distL="114300" distR="114300" simplePos="0" relativeHeight="251659264" behindDoc="0" locked="0" layoutInCell="1" allowOverlap="1" wp14:anchorId="1A631AE3" wp14:editId="16C66173">
+            <wp:simplePos x="0" y="0"/>
+            <wp:positionH relativeFrom="column">
+              <wp:align>right</wp:align>
+            </wp:positionH>
+            <wp:positionV relativeFrom="paragraph">
+              <wp:posOffset>76200</wp:posOffset>
+            </wp:positionV>
+            <wp:extent cx="685800" cy="685800"/>
+            <wp:effectExtent l="0" t="0" r="0" b="0"/>
+            <wp:wrapSquare wrapText="bothSides"/>
+            <wp:docPr id="878267911" name="Picture 2"/>
+            <wp:cNvGraphicFramePr>
+              <a:graphicFrameLocks xmlns:a="http://schemas.openxmlformats.org/drawingml/2006/main" noChangeAspect="1"/>
+            </wp:cNvGraphicFramePr>
+            <a:graphic xmlns:a="http://schemas.openxmlformats.org/drawingml/2006/main">
+              <a:graphicData uri="http://schemas.openxmlformats.org/drawingml/2006/picture">
+                <pic:pic xmlns:pic="http://schemas.openxmlformats.org/drawingml/2006/picture">
+                  <pic:nvPicPr>
+                    <pic:cNvPr id="878267911" name=""/>
+                    <pic:cNvPicPr/>
+                  </pic:nvPicPr>
+                  <pic:blipFill>
+                    <a:blip r:embed="rId16" cstate="print">
+                      <a:extLst>
+                        <a:ext uri="{28A0092B-C50C-407E-A947-70E740481C1C}">
+                          <a14:useLocalDpi xmlns:a14="http://schemas.microsoft.com/office/drawing/2010/main" val="0"/>
+                        </a:ext>
+                      </a:extLst>
+                    </a:blip>
+                    <a:stretch>
+                      <a:fillRect/>
+                    </a:stretch>
+                  </pic:blipFill>
+                  <pic:spPr>
+                    <a:xfrm>
+                      <a:off x="0" y="0"/>
+                      <a:ext cx="685800" cy="685800"/>
+                    </a:xfrm>
+                    <a:prstGeom prst="rect">
+                      <a:avLst/>
+                    </a:prstGeom>
+                  </pic:spPr>
+                </pic:pic>
+              </a:graphicData>
+            </a:graphic>
+            <wp14:sizeRelH relativeFrom="margin">
+              <wp14:pctWidth>0</wp14:pctWidth>
+            </wp14:sizeRelH>
+            <wp14:sizeRelV relativeFrom="margin">
+              <wp14:pctHeight>0</wp14:pctHeight>
+            </wp14:sizeRelV>
+          </wp:anchor>
+        </w:drawing>
+      </w:r>
+      <w:r>
+        <w:rPr>
+          <w:rtl/>
+        </w:rPr>
+        <w:t xml:space="preserve">التفاف مربع عند الطرف الأيمن: النسخة الأولية أطول من المطلوب بإحدى عشرة دقيقة، ومعظم الزيادة في الفصل الثاني حيث تتكرر المقابلتان. اختصار مشهد المطبخ يوفّر نحو ست دقائق دون المساس بمواد الأرشيف. النسخة الأولية أطول من المطلوب بإحدى عشرة دقيقة، ومعظم الزيادة في الفصل الثاني حيث تتكرر المقابلتان. اختصار مشهد المطبخ يوفّر نحو ست دقائق دون المساس بمواد الأرشيف. النسخة الأولية أطول من المطلوب بإحدى عشرة دقيقة، ومعظم الزيادة في الفصل الثاني حيث تتكرر المقابلتان. اختصار مشهد المطبخ يوفّر نحو ست دقائق دون المساس بمواد الأرشيف. النسخة الأولية أطول من المطلوب بإحدى عشرة دقيقة، ومعظم الزيادة في الفصل الثاني حيث تتكرر المقابلتان. اختصار مشهد المطبخ يوفّر نحو ست دقائق دون المساس بمواد الأرشيف. </w:t>
+      </w:r>
+    </w:p>
+    <w:p>
+      <w:pPr>
+        <w:bidi/>
+        <w:spacing w:before="80" w:after="240"/>
+        <w:jc w:val="both"/>
+        <w:rPr>
+          <w:rtl/>
+        </w:rPr>
+      </w:pPr>
+      <w:r>
+        <w:rPr>
+          <w:noProof/>
+          <w:rtl/>
+          <w:lang w:val="ar-SA"/>
+        </w:rPr>
+        <w:drawing>
+          <wp:anchor distT="114300" distB="114300" distL="114300" distR="114300" simplePos="0" relativeHeight="251660288" behindDoc="0" locked="0" layoutInCell="1" allowOverlap="1" wp14:anchorId="3951F7CF" wp14:editId="48B9B0F4">
+            <wp:simplePos x="0" y="0"/>
+            <wp:positionH relativeFrom="column">
+              <wp:align>center</wp:align>
+            </wp:positionH>
+            <wp:positionV relativeFrom="paragraph">
+              <wp:posOffset>381000</wp:posOffset>
+            </wp:positionV>
+            <wp:extent cx="685800" cy="685800"/>
+            <wp:effectExtent l="0" t="0" r="0" b="0"/>
+            <wp:wrapTopAndBottom/>
+            <wp:docPr id="2081681828" name="Picture 3"/>
+            <wp:cNvGraphicFramePr>
+              <a:graphicFrameLocks xmlns:a="http://schemas.openxmlformats.org/drawingml/2006/main" noChangeAspect="1"/>
+            </wp:cNvGraphicFramePr>
+            <a:graphic xmlns:a="http://schemas.openxmlformats.org/drawingml/2006/main">
+              <a:graphicData uri="http://schemas.openxmlformats.org/drawingml/2006/picture">
+                <pic:pic xmlns:pic="http://schemas.openxmlformats.org/drawingml/2006/picture">
+                  <pic:nvPicPr>
+                    <pic:cNvPr id="2081681828" name=""/>
+                    <pic:cNvPicPr/>
+                  </pic:nvPicPr>
+                  <pic:blipFill>
+                    <a:blip r:embed="rId16" cstate="print">
+                      <a:extLst>
+                        <a:ext uri="{28A0092B-C50C-407E-A947-70E740481C1C}">
+                          <a14:useLocalDpi xmlns:a14="http://schemas.microsoft.com/office/drawing/2010/main" val="0"/>
+                        </a:ext>
+                      </a:extLst>
+                    </a:blip>
+                    <a:stretch>
+                      <a:fillRect/>
+                    </a:stretch>
+                  </pic:blipFill>
+                  <pic:spPr>
+                    <a:xfrm>
+                      <a:off x="0" y="0"/>
+                      <a:ext cx="685800" cy="685800"/>
+                    </a:xfrm>
+                    <a:prstGeom prst="rect">
+                      <a:avLst/>
+                    </a:prstGeom>
+                  </pic:spPr>
+                </pic:pic>
+              </a:graphicData>
+            </a:graphic>
+            <wp14:sizeRelH relativeFrom="margin">
+              <wp14:pctWidth>0</wp14:pctWidth>
+            </wp14:sizeRelH>
+            <wp14:sizeRelV relativeFrom="margin">
+              <wp14:pctHeight>0</wp14:pctHeight>
+            </wp14:sizeRelV>
+          </wp:anchor>
+        </w:drawing>
+      </w:r>
+      <w:r>
+        <w:rPr>
+          <w:rtl/>
+        </w:rPr>
+        <w:t xml:space="preserve">أعلى وأسفل الصورة: النسخة الأولية أطول من المطلوب بإحدى عشرة دقيقة، ومعظم الزيادة في الفصل الثاني حيث تتكرر المقابلتان. اختصار مشهد المطبخ يوفّر نحو ست دقائق دون المساس بمواد الأرشيف. النسخة الأولية أطول من المطلوب بإحدى عشرة دقيقة، ومعظم الزيادة في الفصل الثاني حيث تتكرر المقابلتان. اختصار مشهد المطبخ يوفّر نحو ست دقائق دون المساس بمواد الأرشيف. النسخة الأولية أطول من المطلوب بإحدى عشرة دقيقة، ومعظم الزيادة في الفصل الثاني حيث تتكرر المقابلتان. اختصار مشهد المطبخ يوفّر نحو ست دقائق دون المساس بمواد الأرشيف. النسخة الأولية أطول من المطلوب بإحدى عشرة دقيقة، ومعظم الزيادة في الفصل الثاني حيث تتكرر المقابلتان. اختصار مشهد المطبخ يوفّر نحو ست دقائق دون المساس بمواد الأرشيف. </w:t>
+      </w:r>
+    </w:p>
+    <w:p>
+      <w:pPr>
+        <w:bidi/>
+        <w:spacing w:before="80" w:after="240"/>
+        <w:jc w:val="both"/>
+        <w:rPr>
+          <w:rtl/>
+        </w:rPr>
+      </w:pPr>
+      <w:r>
+        <w:rPr>
+          <w:noProof/>
+          <w:rtl/>
+          <w:lang w:val="ar-SA"/>
+        </w:rPr>
+        <w:drawing>
+          <wp:anchor distT="114300" distB="114300" distL="114300" distR="114300" simplePos="0" relativeHeight="251661312" behindDoc="1" locked="0" layoutInCell="1" allowOverlap="1" wp14:anchorId="49172CC1" wp14:editId="22B30453">
+            <wp:simplePos x="0" y="0"/>
+            <wp:positionH relativeFrom="column">
+              <wp:align>center</wp:align>
+            </wp:positionH>
+            <wp:positionV relativeFrom="paragraph">
+              <wp:posOffset>76200</wp:posOffset>
+            </wp:positionV>
+            <wp:extent cx="685800" cy="685800"/>
+            <wp:effectExtent l="0" t="0" r="0" b="0"/>
+            <wp:wrapNone/>
+            <wp:docPr id="1641697861" name="Picture 4"/>
+            <wp:cNvGraphicFramePr>
+              <a:graphicFrameLocks xmlns:a="http://schemas.openxmlformats.org/drawingml/2006/main" noChangeAspect="1"/>
+            </wp:cNvGraphicFramePr>
+            <a:graphic xmlns:a="http://schemas.openxmlformats.org/drawingml/2006/main">
+              <a:graphicData uri="http://schemas.openxmlformats.org/drawingml/2006/picture">
+                <pic:pic xmlns:pic="http://schemas.openxmlformats.org/drawingml/2006/picture">
+                  <pic:nvPicPr>
+                    <pic:cNvPr id="1641697861" name=""/>
+                    <pic:cNvPicPr/>
+                  </pic:nvPicPr>
+                  <pic:blipFill>
+                    <a:blip r:embed="rId16" cstate="print">
+                      <a:extLst>
+                        <a:ext uri="{28A0092B-C50C-407E-A947-70E740481C1C}">
+                          <a14:useLocalDpi xmlns:a14="http://schemas.microsoft.com/office/drawing/2010/main" val="0"/>
+                        </a:ext>
+                      </a:extLst>
+                    </a:blip>
+                    <a:stretch>
+                      <a:fillRect/>
+                    </a:stretch>
+                  </pic:blipFill>
+                  <pic:spPr>
+                    <a:xfrm>
+                      <a:off x="0" y="0"/>
+                      <a:ext cx="685800" cy="685800"/>
+                    </a:xfrm>
+                    <a:prstGeom prst="rect">
+                      <a:avLst/>
+                    </a:prstGeom>
+                  </pic:spPr>
+                </pic:pic>
+              </a:graphicData>
+            </a:graphic>
+            <wp14:sizeRelH relativeFrom="margin">
+              <wp14:pctWidth>0</wp14:pctWidth>
+            </wp14:sizeRelH>
+            <wp14:sizeRelV relativeFrom="margin">
+              <wp14:pctHeight>0</wp14:pctHeight>
+            </wp14:sizeRelV>
+          </wp:anchor>
+        </w:drawing>
+      </w:r>
+      <w:r>
+        <w:rPr>
+          <w:rtl/>
+        </w:rPr>
+        <w:t xml:space="preserve">صورة خلف النص: النسخة الأولية أطول من المطلوب بإحدى عشرة دقيقة، ومعظم الزيادة في الفصل الثاني حيث تتكرر المقابلتان. اختصار مشهد المطبخ يوفّر نحو ست دقائق دون المساس بمواد الأرشيف. النسخة الأولية أطول من المطلوب بإحدى عشرة دقيقة، ومعظم الزيادة في الفصل الثاني حيث تتكرر المقابلتان. اختصار مشهد المطبخ يوفّر نحو ست دقائق دون المساس بمواد الأرشيف. النسخة الأولية أطول من المطلوب بإحدى عشرة دقيقة، ومعظم الزيادة في الفصل الثاني حيث تتكرر المقابلتان. اختصار مشهد المطبخ يوفّر نحو ست دقائق دون المساس بمواد الأرشيف. النسخة الأولية أطول من المطلوب بإحدى عشرة دقيقة، ومعظم الزيادة في الفصل الثاني حيث تتكرر المقابلتان. اختصار مشهد المطبخ يوفّر نحو ست دقائق دون المساس بمواد الأرشيف. </w:t>
+      </w:r>
+    </w:p>
+    <w:p>
+      <w:pPr>
+        <w:pageBreakBefore/>
+        <w:bidi/>
+        <w:spacing w:before="80" w:after="240"/>
+        <w:jc w:val="both"/>
+        <w:rPr>
+          <w:rtl/>
+        </w:rPr>
+      </w:pPr>
+      <w:r>
+        <w:rPr>
+          <w:noProof/>
+          <w:rtl/>
+          <w:lang w:val="ar-SA"/>
+        </w:rPr>
+        <w:lastRenderedPageBreak/>
+        <w:drawing>
+          <wp:anchor distT="114300" distB="114300" distL="114300" distR="114300" simplePos="0" relativeHeight="251662336" behindDoc="1" locked="0" layoutInCell="1" allowOverlap="1" wp14:anchorId="18FBAC40" wp14:editId="620987FE">
+            <wp:simplePos x="0" y="0"/>
+            <wp:positionH relativeFrom="column">
+              <wp:align>left</wp:align>
+            </wp:positionH>
+            <wp:positionV relativeFrom="paragraph">
+              <wp:posOffset>76200</wp:posOffset>
+            </wp:positionV>
+            <wp:extent cx="685800" cy="685800"/>
+            <wp:effectExtent l="0" t="0" r="0" b="0"/>
+            <wp:wrapTight wrapText="bothSides">
+              <wp:wrapPolygon edited="0">
+                <wp:start x="6600" y="0"/>
+                <wp:lineTo x="0" y="3000"/>
+                <wp:lineTo x="0" y="15000"/>
+                <wp:lineTo x="3000" y="19200"/>
+                <wp:lineTo x="6000" y="21000"/>
+                <wp:lineTo x="15000" y="21000"/>
+                <wp:lineTo x="18000" y="19200"/>
+                <wp:lineTo x="21000" y="15600"/>
+                <wp:lineTo x="21000" y="4200"/>
+                <wp:lineTo x="15000" y="0"/>
+                <wp:lineTo x="6600" y="0"/>
+              </wp:wrapPolygon>
+            </wp:wrapTight>
+            <wp:docPr id="1610166451" name="Picture 5"/>
+            <wp:cNvGraphicFramePr>
+              <a:graphicFrameLocks xmlns:a="http://schemas.openxmlformats.org/drawingml/2006/main" noChangeAspect="1"/>
+            </wp:cNvGraphicFramePr>
+            <a:graphic xmlns:a="http://schemas.openxmlformats.org/drawingml/2006/main">
+              <a:graphicData uri="http://schemas.openxmlformats.org/drawingml/2006/picture">
+                <pic:pic xmlns:pic="http://schemas.openxmlformats.org/drawingml/2006/picture">
+                  <pic:nvPicPr>
+                    <pic:cNvPr id="1610166451" name=""/>
+                    <pic:cNvPicPr/>
+                  </pic:nvPicPr>
+                  <pic:blipFill>
+                    <a:blip r:embed="rId16" cstate="print">
+                      <a:extLst>
+                        <a:ext uri="{28A0092B-C50C-407E-A947-70E740481C1C}">
+                          <a14:useLocalDpi xmlns:a14="http://schemas.microsoft.com/office/drawing/2010/main" val="0"/>
+                        </a:ext>
+                      </a:extLst>
+                    </a:blip>
+                    <a:stretch>
+                      <a:fillRect/>
+                    </a:stretch>
+                  </pic:blipFill>
+                  <pic:spPr>
+                    <a:xfrm>
+                      <a:off x="0" y="0"/>
+                      <a:ext cx="685800" cy="685800"/>
+                    </a:xfrm>
+                    <a:prstGeom prst="rect">
+                      <a:avLst/>
+                    </a:prstGeom>
+                  </pic:spPr>
+                </pic:pic>
+              </a:graphicData>
+            </a:graphic>
+            <wp14:sizeRelH relativeFrom="margin">
+              <wp14:pctWidth>0</wp14:pctWidth>
+            </wp14:sizeRelH>
+            <wp14:sizeRelV relativeFrom="margin">
+              <wp14:pctHeight>0</wp14:pctHeight>
+            </wp14:sizeRelV>
+          </wp:anchor>
+        </w:drawing>
+      </w:r>
+      <w:r>
+        <w:rPr>
+          <w:rtl/>
+        </w:rPr>
+        <w:t xml:space="preserve">التفاف محكم حول الصورة: النسخة الأولية أطول من المطلوب بإحدى عشرة دقيقة، ومعظم الزيادة في الفصل الثاني حيث تتكرر المقابلتان. اختصار مشهد المطبخ يوفّر نحو ست دقائق دون المساس بمواد الأرشيف. النسخة الأولية أطول من المطلوب بإحدى عشرة دقيقة، ومعظم الزيادة في الفصل الثاني حيث تتكرر المقابلتان. اختصار مشهد المطبخ يوفّر نحو ست دقائق دون المساس بمواد الأرشيف. النسخة الأولية أطول من المطلوب بإحدى عشرة دقيقة، ومعظم الزيادة في الفصل الثاني حيث تتكرر المقابلتان. اختصار مشهد المطبخ يوفّر نحو ست دقائق دون المساس بمواد الأرشيف. النسخة الأولية أطول من المطلوب بإحدى عشرة دقيقة، ومعظم الزيادة في الفصل الثاني حيث تتكرر المقابلتان. اختصار مشهد المطبخ يوفّر نحو ست دقائق دون المساس بمواد الأرشيف. </w:t>
+      </w:r>
+    </w:p>
+    <w:p>
+      <w:pPr>
+        <w:bidi/>
+        <w:spacing w:before="80" w:after="240"/>
+        <w:jc w:val="both"/>
+        <w:rPr>
+          <w:rtl/>
+        </w:rPr>
+      </w:pPr>
+      <w:r>
+        <w:rPr>
+          <w:noProof/>
+          <w:rtl/>
+          <w:lang w:val="ar-SA"/>
+        </w:rPr>
+        <w:drawing>
+          <wp:anchor distT="114300" distB="114300" distL="114300" distR="114300" simplePos="0" relativeHeight="251663360" behindDoc="0" locked="0" layoutInCell="1" allowOverlap="1" wp14:anchorId="46D8EFAA" wp14:editId="228EF995">
+            <wp:simplePos x="0" y="0"/>
+            <wp:positionH relativeFrom="column">
+              <wp:align>center</wp:align>
+            </wp:positionH>
+            <wp:positionV relativeFrom="paragraph">
+              <wp:posOffset>76200</wp:posOffset>
+            </wp:positionV>
+            <wp:extent cx="685800" cy="685800"/>
+            <wp:effectExtent l="0" t="0" r="0" b="0"/>
+            <wp:wrapSquare wrapText="bothSides"/>
+            <wp:docPr id="629535477" name="Picture 6"/>
+            <wp:cNvGraphicFramePr>
+              <a:graphicFrameLocks xmlns:a="http://schemas.openxmlformats.org/drawingml/2006/main" noChangeAspect="1"/>
+            </wp:cNvGraphicFramePr>
+            <a:graphic xmlns:a="http://schemas.openxmlformats.org/drawingml/2006/main">
+              <a:graphicData uri="http://schemas.openxmlformats.org/drawingml/2006/picture">
+                <pic:pic xmlns:pic="http://schemas.openxmlformats.org/drawingml/2006/picture">
+                  <pic:nvPicPr>
+                    <pic:cNvPr id="629535477" name=""/>
+                    <pic:cNvPicPr/>
+                  </pic:nvPicPr>
+                  <pic:blipFill>
+                    <a:blip r:embed="rId16" cstate="print">
+                      <a:extLst>
+                        <a:ext uri="{28A0092B-C50C-407E-A947-70E740481C1C}">
+                          <a14:useLocalDpi xmlns:a14="http://schemas.microsoft.com/office/drawing/2010/main" val="0"/>
+                        </a:ext>
+                      </a:extLst>
+                    </a:blip>
+                    <a:stretch>
+                      <a:fillRect/>
+                    </a:stretch>
+                  </pic:blipFill>
+                  <pic:spPr>
+                    <a:xfrm>
+                      <a:off x="0" y="0"/>
+                      <a:ext cx="685800" cy="685800"/>
+                    </a:xfrm>
+                    <a:prstGeom prst="rect">
+                      <a:avLst/>
+                    </a:prstGeom>
+                  </pic:spPr>
+                </pic:pic>
+              </a:graphicData>
+            </a:graphic>
+            <wp14:sizeRelH relativeFrom="margin">
+              <wp14:pctWidth>0</wp14:pctWidth>
+            </wp14:sizeRelH>
+            <wp14:sizeRelV relativeFrom="margin">
+              <wp14:pctHeight>0</wp14:pctHeight>
+            </wp14:sizeRelV>
+          </wp:anchor>
+        </w:drawing>
+      </w:r>
+      <w:r>
+        <w:rPr>
+          <w:rtl/>
+        </w:rPr>
+        <w:t xml:space="preserve">التفاف مربع في الوسط: النسخة الأولية أطول من المطلوب بإحدى عشرة دقيقة، ومعظم الزيادة في الفصل الثاني حيث تتكرر المقابلتان. اختصار مشهد المطبخ يوفّر نحو ست دقائق دون المساس بمواد الأرشيف. النسخة الأولية أطول من المطلوب بإحدى عشرة دقيقة، ومعظم الزيادة في الفصل الثاني حيث تتكرر المقابلتان. اختصار مشهد المطبخ يوفّر نحو ست دقائق دون المساس بمواد الأرشيف. النسخة الأولية أطول من المطلوب بإحدى عشرة دقيقة، ومعظم الزيادة في الفصل الثاني حيث تتكرر المقابلتان. اختصار مشهد المطبخ يوفّر نحو ست دقائق دون المساس بمواد الأرشيف. النسخة الأولية أطول من المطلوب بإحدى عشرة دقيقة، ومعظم الزيادة في الفصل الثاني حيث تتكرر المقابلتان. اختصار مشهد المطبخ يوفّر نحو ست دقائق دون المساس بمواد الأرشيف. </w:t>
+      </w:r>
+    </w:p>
+    <w:p>
+      <w:pPr>
+        <w:bidi/>
+        <w:spacing w:before="80" w:after="240"/>
+        <w:jc w:val="both"/>
+      </w:pPr>
+      <w:r>
+        <w:rPr>
+          <w:noProof/>
+          <w:rtl/>
+          <w:lang w:val="ar-SA"/>
+        </w:rPr>
+        <w:drawing>
+          <wp:anchor distT="114300" distB="114300" distL="114300" distR="114300" simplePos="0" relativeHeight="251664384" behindDoc="0" locked="0" layoutInCell="1" allowOverlap="1" wp14:anchorId="103CEB8A" wp14:editId="0ACE2C87">
+            <wp:simplePos x="0" y="0"/>
+            <wp:positionH relativeFrom="column">
+              <wp:align>center</wp:align>
+            </wp:positionH>
+            <wp:positionV relativeFrom="paragraph">
+              <wp:posOffset>76200</wp:posOffset>
+            </wp:positionV>
+            <wp:extent cx="685800" cy="685800"/>
+            <wp:effectExtent l="0" t="0" r="0" b="0"/>
+            <wp:wrapThrough wrapText="bothSides">
+              <wp:wrapPolygon edited="0">
+                <wp:start x="6600" y="0"/>
+                <wp:lineTo x="0" y="3000"/>
+                <wp:lineTo x="0" y="15000"/>
+                <wp:lineTo x="3000" y="19200"/>
+                <wp:lineTo x="6000" y="21000"/>
+                <wp:lineTo x="15000" y="21000"/>
+                <wp:lineTo x="18000" y="19200"/>
+                <wp:lineTo x="21000" y="15600"/>
+                <wp:lineTo x="21000" y="4200"/>
+                <wp:lineTo x="15000" y="0"/>
+                <wp:lineTo x="6600" y="0"/>
+              </wp:wrapPolygon>
+            </wp:wrapThrough>
+            <wp:docPr id="1669157097" name="Picture 7"/>
+            <wp:cNvGraphicFramePr>
+              <a:graphicFrameLocks xmlns:a="http://schemas.openxmlformats.org/drawingml/2006/main" noChangeAspect="1"/>
+            </wp:cNvGraphicFramePr>
+            <a:graphic xmlns:a="http://schemas.openxmlformats.org/drawingml/2006/main">
+              <a:graphicData uri="http://schemas.openxmlformats.org/drawingml/2006/picture">
+                <pic:pic xmlns:pic="http://schemas.openxmlformats.org/drawingml/2006/picture">
+                  <pic:nvPicPr>
+                    <pic:cNvPr id="1669157097" name=""/>
+                    <pic:cNvPicPr/>
+                  </pic:nvPicPr>
+                  <pic:blipFill>
+                    <a:blip r:embed="rId16" cstate="print">
+                      <a:extLst>
+                        <a:ext uri="{28A0092B-C50C-407E-A947-70E740481C1C}">
+                          <a14:useLocalDpi xmlns:a14="http://schemas.microsoft.com/office/drawing/2010/main" val="0"/>
+                        </a:ext>
+                      </a:extLst>
+                    </a:blip>
+                    <a:stretch>
+                      <a:fillRect/>
+                    </a:stretch>
+                  </pic:blipFill>
+                  <pic:spPr>
+                    <a:xfrm>
+                      <a:off x="0" y="0"/>
+                      <a:ext cx="685800" cy="685800"/>
+                    </a:xfrm>
+                    <a:prstGeom prst="rect">
+                      <a:avLst/>
+                    </a:prstGeom>
+                  </pic:spPr>
+                </pic:pic>
+              </a:graphicData>
+            </a:graphic>
+            <wp14:sizeRelH relativeFrom="margin">
+              <wp14:pctWidth>0</wp14:pctWidth>
+            </wp14:sizeRelH>
+            <wp14:sizeRelV relativeFrom="margin">
+              <wp14:pctHeight>0</wp14:pctHeight>
+            </wp14:sizeRelV>
+          </wp:anchor>
+        </w:drawing>
+      </w:r>
+      <w:r>
+        <w:rPr>
+          <w:rtl/>
+        </w:rPr>
+        <w:t xml:space="preserve">التفاف عبر الصورة: النسخة الأولية أطول من المطلوب بإحدى عشرة دقيقة، ومعظم الزيادة في الفصل الثاني حيث تتكرر المقابلتان. اختصار مشهد المطبخ يوفّر نحو ست دقائق دون المساس بمواد الأرشيف. النسخة الأولية أطول من المطلوب بإحدى عشرة دقيقة، ومعظم الزيادة في الفصل الثاني حيث تتكرر المقابلتان. اختصار مشهد المطبخ يوفّر نحو ست دقائق دون المساس بمواد الأرشيف. النسخة الأولية أطول من المطلوب بإحدى عشرة دقيقة، ومعظم الزيادة في الفصل الثاني حيث تتكرر المقابلتان. اختصار مشهد المطبخ يوفّر نحو ست دقائق دون المساس بمواد الأرشيف. النسخة الأولية أطول من المطلوب بإحدى عشرة دقيقة، ومعظم الزيادة في الفصل الثاني حيث تتكرر المقابلتان. اختصار مشهد المطبخ يوفّر نحو ست دقائق دون المساس بمواد الأرشيف. </w:t>
+      </w:r>
+    </w:p>
     <w:sectPr>
-      <w:headerReference w:type="default" r:id="rId16"/>
-      <w:footerReference w:type="default" r:id="rId17"/>
+      <w:headerReference w:type="default" r:id="rId17"/>
+      <w:footerReference w:type="default" r:id="rId18"/>
       <w:pgSz w:w="16838" w:h="11906" w:orient="landscape"/>
       <w:pgMar w:top="900" w:right="1000" w:bottom="900" w:left="1000" w:header="708" w:footer="708" w:gutter="0"/>
       <w:cols w:space="720"/>
@@ -3563,36 +4284,8 @@
         <w:sz w:val="16"/>
         <w:szCs w:val="16"/>
       </w:rPr>
-      <w:t xml:space="preserve">Internal — Confidential / </w:t>
+      <w:t>Internal — Confidential / داخلي — سري</w:t>
     </w:r>
-    <w:proofErr w:type="spellStart"/>
-    <w:r>
-      <w:rPr>
-        <w:color w:val="5B6470"/>
-        <w:sz w:val="16"/>
-        <w:szCs w:val="16"/>
-      </w:rPr>
-      <w:t>داخلي</w:t>
-    </w:r>
-    <w:proofErr w:type="spellEnd"/>
-    <w:r>
-      <w:rPr>
-        <w:color w:val="5B6470"/>
-        <w:sz w:val="16"/>
-        <w:szCs w:val="16"/>
-      </w:rPr>
-      <w:t xml:space="preserve"> — </w:t>
-    </w:r>
-    <w:proofErr w:type="spellStart"/>
-    <w:r>
-      <w:rPr>
-        <w:color w:val="5B6470"/>
-        <w:sz w:val="16"/>
-        <w:szCs w:val="16"/>
-      </w:rPr>
-      <w:t>سري</w:t>
-    </w:r>
-    <w:proofErr w:type="spellEnd"/>
     <w:r>
       <w:tab/>
     </w:r>
@@ -3712,36 +4405,8 @@
         <w:sz w:val="16"/>
         <w:szCs w:val="16"/>
       </w:rPr>
-      <w:t xml:space="preserve">Internal — Confidential / </w:t>
+      <w:t>Internal — Confidential / داخلي — سري</w:t>
     </w:r>
-    <w:proofErr w:type="spellStart"/>
-    <w:r>
-      <w:rPr>
-        <w:color w:val="5B6470"/>
-        <w:sz w:val="16"/>
-        <w:szCs w:val="16"/>
-      </w:rPr>
-      <w:t>داخلي</w:t>
-    </w:r>
-    <w:proofErr w:type="spellEnd"/>
-    <w:r>
-      <w:rPr>
-        <w:color w:val="5B6470"/>
-        <w:sz w:val="16"/>
-        <w:szCs w:val="16"/>
-      </w:rPr>
-      <w:t xml:space="preserve"> — </w:t>
-    </w:r>
-    <w:proofErr w:type="spellStart"/>
-    <w:r>
-      <w:rPr>
-        <w:color w:val="5B6470"/>
-        <w:sz w:val="16"/>
-        <w:szCs w:val="16"/>
-      </w:rPr>
-      <w:t>سري</w:t>
-    </w:r>
-    <w:proofErr w:type="spellEnd"/>
     <w:r>
       <w:tab/>
     </w:r>
@@ -3876,39 +4541,7 @@
           <w:sz w:val="17"/>
           <w:szCs w:val="17"/>
         </w:rPr>
-        <w:t xml:space="preserve">Measured per EBU R 128 over the full </w:t>
-      </w:r>
-      <w:proofErr w:type="spellStart"/>
-      <w:r>
-        <w:rPr>
-          <w:sz w:val="17"/>
-          <w:szCs w:val="17"/>
-        </w:rPr>
-        <w:t>programme</w:t>
-      </w:r>
-      <w:proofErr w:type="spellEnd"/>
-      <w:r>
-        <w:rPr>
-          <w:sz w:val="17"/>
-          <w:szCs w:val="17"/>
-        </w:rPr>
-        <w:t xml:space="preserve">, </w:t>
-      </w:r>
-      <w:proofErr w:type="gramStart"/>
-      <w:r>
-        <w:rPr>
-          <w:sz w:val="17"/>
-          <w:szCs w:val="17"/>
-        </w:rPr>
-        <w:t>dialogue-gated</w:t>
-      </w:r>
-      <w:proofErr w:type="gramEnd"/>
-      <w:r>
-        <w:rPr>
-          <w:sz w:val="17"/>
-          <w:szCs w:val="17"/>
-        </w:rPr>
-        <w:t xml:space="preserve">. </w:t>
+        <w:t xml:space="preserve">Measured per EBU R 128 over the full programme, dialogue-gated. </w:t>
       </w:r>
       <w:r>
         <w:rPr>
@@ -3933,117 +4566,11 @@
           <w:sz w:val="17"/>
           <w:szCs w:val="17"/>
         </w:rPr>
-        <w:t xml:space="preserve">Lock date assumes archive clearance closes on time / </w:t>
-      </w:r>
-      <w:proofErr w:type="spellStart"/>
-      <w:r>
-        <w:rPr>
-          <w:sz w:val="17"/>
-          <w:szCs w:val="17"/>
-        </w:rPr>
-        <w:t>يفترض</w:t>
-      </w:r>
-      <w:proofErr w:type="spellEnd"/>
-      <w:r>
-        <w:rPr>
-          <w:sz w:val="17"/>
-          <w:szCs w:val="17"/>
-        </w:rPr>
-        <w:t xml:space="preserve"> </w:t>
-      </w:r>
-      <w:proofErr w:type="spellStart"/>
-      <w:r>
-        <w:rPr>
-          <w:sz w:val="17"/>
-          <w:szCs w:val="17"/>
-        </w:rPr>
-        <w:t>انتهاء</w:t>
-      </w:r>
-      <w:proofErr w:type="spellEnd"/>
-      <w:r>
-        <w:rPr>
-          <w:sz w:val="17"/>
-          <w:szCs w:val="17"/>
-        </w:rPr>
-        <w:t xml:space="preserve"> </w:t>
-      </w:r>
-      <w:proofErr w:type="spellStart"/>
-      <w:r>
-        <w:rPr>
-          <w:sz w:val="17"/>
-          <w:szCs w:val="17"/>
-        </w:rPr>
-        <w:t>تصاريح</w:t>
-      </w:r>
-      <w:proofErr w:type="spellEnd"/>
-      <w:r>
-        <w:rPr>
-          <w:sz w:val="17"/>
-          <w:szCs w:val="17"/>
-        </w:rPr>
-        <w:t xml:space="preserve"> </w:t>
-      </w:r>
-      <w:proofErr w:type="spellStart"/>
-      <w:r>
-        <w:rPr>
-          <w:sz w:val="17"/>
-          <w:szCs w:val="17"/>
-        </w:rPr>
-        <w:t>الأرشيف</w:t>
-      </w:r>
-      <w:proofErr w:type="spellEnd"/>
-      <w:r>
-        <w:rPr>
-          <w:sz w:val="17"/>
-          <w:szCs w:val="17"/>
-        </w:rPr>
-        <w:t xml:space="preserve"> </w:t>
-      </w:r>
-      <w:proofErr w:type="spellStart"/>
-      <w:r>
-        <w:rPr>
-          <w:sz w:val="17"/>
-          <w:szCs w:val="17"/>
-        </w:rPr>
-        <w:t>في</w:t>
-      </w:r>
-      <w:proofErr w:type="spellEnd"/>
-      <w:r>
-        <w:rPr>
-          <w:sz w:val="17"/>
-          <w:szCs w:val="17"/>
-        </w:rPr>
-        <w:t xml:space="preserve"> </w:t>
-      </w:r>
-      <w:proofErr w:type="spellStart"/>
-      <w:r>
-        <w:rPr>
-          <w:sz w:val="17"/>
-          <w:szCs w:val="17"/>
-        </w:rPr>
-        <w:t>موعدها</w:t>
-      </w:r>
-      <w:proofErr w:type="spellEnd"/>
-      <w:r>
-        <w:rPr>
-          <w:sz w:val="17"/>
-          <w:szCs w:val="17"/>
-        </w:rPr>
-        <w:t>.</w:t>
+        <w:t>Lock date assumes archive clearance closes on time / يفترض انتهاء تصاريح الأرشيف في موعدها.</w:t>
       </w:r>
     </w:p>
   </w:footnote>
 </w:footnotes>
-</file>
-
-<file path=word/header1.xml><?xml version="1.0" encoding="utf-8"?>
-<w:hdr xmlns:wpc="http://schemas.microsoft.com/office/word/2010/wordprocessingCanvas" xmlns:cx="http://schemas.microsoft.com/office/drawing/2014/chartex" xmlns:cx1="http://schemas.microsoft.com/office/drawing/2015/9/8/chartex" xmlns:cx2="http://schemas.microsoft.com/office/drawing/2015/10/21/chartex" xmlns:cx3="http://schemas.microsoft.com/office/drawing/2016/5/9/chartex" xmlns:cx4="http://schemas.microsoft.com/office/drawing/2016/5/10/chartex" xmlns:cx5="http://schemas.microsoft.com/office/drawing/2016/5/11/chartex" xmlns:cx6="http://schemas.microsoft.com/office/drawing/2016/5/12/chartex" xmlns:cx7="http://schemas.microsoft.com/office/drawing/2016/5/13/chartex" xmlns:cx8="http://schemas.microsoft.com/office/drawing/2016/5/14/chartex" xmlns:mc="http://schemas.openxmlformats.org/markup-compatibility/2006" xmlns:aink="http://schemas.microsoft.com/office/drawing/2016/ink" xmlns:am3d="http://schemas.microsoft.com/office/drawing/2017/model3d" xmlns:o="urn:schemas-microsoft-com:office:office" xmlns:oel="http://schemas.microsoft.com/office/2019/extlst" xmlns:r="http://schemas.openxmlformats.org/officeDocument/2006/relationships" xmlns:m="http://schemas.openxmlformats.org/officeDocument/2006/math" xmlns:v="urn:schemas-microsoft-com:vml" xmlns:wp14="http://schemas.microsoft.com/office/word/2010/wordprocessingDrawing" xmlns:wp="http://schemas.openxmlformats.org/drawingml/2006/wordprocessingDrawing" xmlns:w10="urn:schemas-microsoft-com:office:word" xmlns:w="http://schemas.openxmlformats.org/wordprocessingml/2006/main" xmlns:w14="http://schemas.microsoft.com/office/word/2010/wordml" xmlns:w15="http://schemas.microsoft.com/office/word/2012/wordml" xmlns:w16cex="http://schemas.microsoft.com/office/word/2018/wordml/cex" xmlns:w16cid="http://schemas.microsoft.com/office/word/2016/wordml/cid" xmlns:w16="http://schemas.microsoft.com/office/word/2018/wordml" xmlns:w16du="http://schemas.microsoft.com/office/word/2023/wordml/word16du" xmlns:w16sdtdh="http://schemas.microsoft.com/office/word/2020/wordml/sdtdatahash" xmlns:w16sdtfl="http://schemas.microsoft.com/office/word/2024/wordml/sdtformatlock" xmlns:w16se="http://schemas.microsoft.com/office/word/2015/wordml/symex" xmlns:wpg="http://schemas.microsoft.com/office/word/2010/wordprocessingGroup" xmlns:wpi="http://schemas.microsoft.com/office/word/2010/wordprocessingInk" xmlns:wne="http://schemas.microsoft.com/office/word/2006/wordml" xmlns:wps="http://schemas.microsoft.com/office/word/2010/wordprocessingShape" mc:Ignorable="w14 w15 w16se w16cid w16 w16cex w16sdtdh w16sdtfl w16du wp14">
-  <w:p>
-    <w:pPr>
-      <w:pStyle w:val="Header"/>
-    </w:pPr>
-  </w:p>
-</w:hdr>
 </file>
 
 <file path=word/header2.xml><?xml version="1.0" encoding="utf-8"?>
@@ -4128,16 +4655,6 @@
 </w:hdr>
 </file>
 
-<file path=word/header3.xml><?xml version="1.0" encoding="utf-8"?>
-<w:hdr xmlns:wpc="http://schemas.microsoft.com/office/word/2010/wordprocessingCanvas" xmlns:cx="http://schemas.microsoft.com/office/drawing/2014/chartex" xmlns:cx1="http://schemas.microsoft.com/office/drawing/2015/9/8/chartex" xmlns:cx2="http://schemas.microsoft.com/office/drawing/2015/10/21/chartex" xmlns:cx3="http://schemas.microsoft.com/office/drawing/2016/5/9/chartex" xmlns:cx4="http://schemas.microsoft.com/office/drawing/2016/5/10/chartex" xmlns:cx5="http://schemas.microsoft.com/office/drawing/2016/5/11/chartex" xmlns:cx6="http://schemas.microsoft.com/office/drawing/2016/5/12/chartex" xmlns:cx7="http://schemas.microsoft.com/office/drawing/2016/5/13/chartex" xmlns:cx8="http://schemas.microsoft.com/office/drawing/2016/5/14/chartex" xmlns:mc="http://schemas.openxmlformats.org/markup-compatibility/2006" xmlns:aink="http://schemas.microsoft.com/office/drawing/2016/ink" xmlns:am3d="http://schemas.microsoft.com/office/drawing/2017/model3d" xmlns:o="urn:schemas-microsoft-com:office:office" xmlns:oel="http://schemas.microsoft.com/office/2019/extlst" xmlns:r="http://schemas.openxmlformats.org/officeDocument/2006/relationships" xmlns:m="http://schemas.openxmlformats.org/officeDocument/2006/math" xmlns:v="urn:schemas-microsoft-com:vml" xmlns:wp14="http://schemas.microsoft.com/office/word/2010/wordprocessingDrawing" xmlns:wp="http://schemas.openxmlformats.org/drawingml/2006/wordprocessingDrawing" xmlns:w10="urn:schemas-microsoft-com:office:word" xmlns:w="http://schemas.openxmlformats.org/wordprocessingml/2006/main" xmlns:w14="http://schemas.microsoft.com/office/word/2010/wordml" xmlns:w15="http://schemas.microsoft.com/office/word/2012/wordml" xmlns:w16cex="http://schemas.microsoft.com/office/word/2018/wordml/cex" xmlns:w16cid="http://schemas.microsoft.com/office/word/2016/wordml/cid" xmlns:w16="http://schemas.microsoft.com/office/word/2018/wordml" xmlns:w16du="http://schemas.microsoft.com/office/word/2023/wordml/word16du" xmlns:w16sdtdh="http://schemas.microsoft.com/office/word/2020/wordml/sdtdatahash" xmlns:w16sdtfl="http://schemas.microsoft.com/office/word/2024/wordml/sdtformatlock" xmlns:w16se="http://schemas.microsoft.com/office/word/2015/wordml/symex" xmlns:wpg="http://schemas.microsoft.com/office/word/2010/wordprocessingGroup" xmlns:wpi="http://schemas.microsoft.com/office/word/2010/wordprocessingInk" xmlns:wne="http://schemas.microsoft.com/office/word/2006/wordml" xmlns:wps="http://schemas.microsoft.com/office/word/2010/wordprocessingShape" mc:Ignorable="w14 w15 w16se w16cid w16 w16cex w16sdtdh w16sdtfl w16du wp14">
-  <w:p>
-    <w:pPr>
-      <w:pStyle w:val="Header"/>
-    </w:pPr>
-  </w:p>
-</w:hdr>
-</file>
-
 <file path=word/header4.xml><?xml version="1.0" encoding="utf-8"?>
 <w:hdr xmlns:wpc="http://schemas.microsoft.com/office/word/2010/wordprocessingCanvas" xmlns:cx="http://schemas.microsoft.com/office/drawing/2014/chartex" xmlns:cx1="http://schemas.microsoft.com/office/drawing/2015/9/8/chartex" xmlns:cx2="http://schemas.microsoft.com/office/drawing/2015/10/21/chartex" xmlns:cx3="http://schemas.microsoft.com/office/drawing/2016/5/9/chartex" xmlns:cx4="http://schemas.microsoft.com/office/drawing/2016/5/10/chartex" xmlns:cx5="http://schemas.microsoft.com/office/drawing/2016/5/11/chartex" xmlns:cx6="http://schemas.microsoft.com/office/drawing/2016/5/12/chartex" xmlns:cx7="http://schemas.microsoft.com/office/drawing/2016/5/13/chartex" xmlns:cx8="http://schemas.microsoft.com/office/drawing/2016/5/14/chartex" xmlns:mc="http://schemas.openxmlformats.org/markup-compatibility/2006" xmlns:aink="http://schemas.microsoft.com/office/drawing/2016/ink" xmlns:am3d="http://schemas.microsoft.com/office/drawing/2017/model3d" xmlns:o="urn:schemas-microsoft-com:office:office" xmlns:oel="http://schemas.microsoft.com/office/2019/extlst" xmlns:r="http://schemas.openxmlformats.org/officeDocument/2006/relationships" xmlns:m="http://schemas.openxmlformats.org/officeDocument/2006/math" xmlns:v="urn:schemas-microsoft-com:vml" xmlns:wp14="http://schemas.microsoft.com/office/word/2010/wordprocessingDrawing" xmlns:wp="http://schemas.openxmlformats.org/drawingml/2006/wordprocessingDrawing" xmlns:w10="urn:schemas-microsoft-com:office:word" xmlns:w="http://schemas.openxmlformats.org/wordprocessingml/2006/main" xmlns:w14="http://schemas.microsoft.com/office/word/2010/wordml" xmlns:w15="http://schemas.microsoft.com/office/word/2012/wordml" xmlns:w16cex="http://schemas.microsoft.com/office/word/2018/wordml/cex" xmlns:w16cid="http://schemas.microsoft.com/office/word/2016/wordml/cid" xmlns:w16="http://schemas.microsoft.com/office/word/2018/wordml" xmlns:w16du="http://schemas.microsoft.com/office/word/2023/wordml/word16du" xmlns:w16sdtdh="http://schemas.microsoft.com/office/word/2020/wordml/sdtdatahash" xmlns:w16sdtfl="http://schemas.microsoft.com/office/word/2024/wordml/sdtformatlock" xmlns:w16se="http://schemas.microsoft.com/office/word/2015/wordml/symex" xmlns:wpg="http://schemas.microsoft.com/office/word/2010/wordprocessingGroup" xmlns:wpi="http://schemas.microsoft.com/office/word/2010/wordprocessingInk" xmlns:wne="http://schemas.microsoft.com/office/word/2006/wordml" xmlns:wps="http://schemas.microsoft.com/office/word/2010/wordprocessingShape" mc:Ignorable="w14 w15 w16se w16cid w16 w16cex w16sdtdh w16sdtfl w16du wp14">
   <w:p>
@@ -4148,6 +4665,12 @@
       <w:tabs>
         <w:tab w:val="right" w:pos="9026"/>
       </w:tabs>
+      <w:rPr>
+        <w:color w:val="5B6470"/>
+        <w:sz w:val="19"/>
+        <w:szCs w:val="19"/>
+        <w:rtl/>
+      </w:rPr>
     </w:pPr>
     <w:r>
       <w:rPr>
@@ -4215,6 +4738,31 @@
         <w:rtl/>
       </w:rPr>
       <w:t>استوديو نايل فريم</w:t>
+    </w:r>
+  </w:p>
+  <w:p>
+    <w:pPr>
+      <w:pStyle w:val="Heading1"/>
+      <w:rPr>
+        <w:b w:val="0"/>
+        <w:sz w:val="16"/>
+      </w:rPr>
+    </w:pPr>
+    <w:r>
+      <w:rPr>
+        <w:b w:val="0"/>
+        <w:sz w:val="16"/>
+      </w:rPr>
+      <w:t xml:space="preserve">Appendix / </w:t>
+    </w:r>
+    <w:r>
+      <w:rPr>
+        <w:rFonts w:ascii="Times New Roman" w:hAnsi="Times New Roman" w:cs="Times New Roman" w:hint="cs"/>
+        <w:b w:val="0"/>
+        <w:sz w:val="16"/>
+        <w:rtl/>
+      </w:rPr>
+      <w:t>ملحق</w:t>
     </w:r>
   </w:p>
 </w:hdr>
@@ -5103,6 +5651,27 @@
     <w:uiPriority w:val="99"/>
     <w:rsid w:val="008815AF"/>
   </w:style>
+  <w:style w:type="paragraph" w:styleId="Footer">
+    <w:name w:val="footer"/>
+    <w:basedOn w:val="Normal"/>
+    <w:link w:val="FooterChar"/>
+    <w:uiPriority w:val="99"/>
+    <w:unhideWhenUsed/>
+    <w:rsid w:val="00F55BE8"/>
+    <w:pPr>
+      <w:tabs>
+        <w:tab w:val="center" w:pos="4680"/>
+        <w:tab w:val="right" w:pos="9360"/>
+      </w:tabs>
+    </w:pPr>
+  </w:style>
+  <w:style w:type="character" w:customStyle="1" w:styleId="FooterChar">
+    <w:name w:val="Footer Char"/>
+    <w:basedOn w:val="DefaultParagraphFont"/>
+    <w:link w:val="Footer"/>
+    <w:uiPriority w:val="99"/>
+    <w:rsid w:val="00F55BE8"/>
+  </w:style>
 </w:styles>
 </file>
 

</xml_diff>

<commit_message>
Unified viewer, search and chart engine
Squash 5 consecutive development commits, retaining the original ending snapshot.

- Run every embed layer on one viewer with toolbar methods and search, make renders cancellable, add a Start page, compact the decision log
- Read charts into a real model in the Worker and lay them out on the page, draw every chart type but surface and maps, set Arabic chart text as Office does, and bound hostile counts where files are read
- Check the chart engine's assumed rules against Office and correct them; list the chart corpora as bench samples
- Fix the review findings, warn on drawings without an id, number DOCX lists as Word does, read a second master's theme, and reorganise the roadmap
- Consolidate tools: one Office export driver, one rasterizer, standard probe shape
</commit_message>
<xml_diff>
--- a/fixtures/docx-coverage.docx
+++ b/fixtures/docx-coverage.docx
@@ -3661,6 +3661,24 @@
         <w:bidi/>
         <w:spacing w:before="80" w:after="240"/>
         <w:jc w:val="both"/>
+        <w:rPr>
+          <w:rtl/>
+        </w:rPr>
+        <w:sectPr>
+          <w:headerReference w:type="default" r:id="rId16"/>
+          <w:footerReference w:type="default" r:id="rId17"/>
+          <w:pgSz w:w="16838" w:h="11906" w:orient="landscape"/>
+          <w:pgMar w:top="900" w:right="1000" w:bottom="900" w:left="1000" w:header="708" w:footer="708" w:gutter="0"/>
+          <w:cols w:space="720"/>
+          <w:docGrid w:linePitch="360"/>
+        </w:sectPr>
+      </w:pPr>
+    </w:p>
+    <w:p>
+      <w:pPr>
+        <w:bidi/>
+        <w:spacing w:before="80" w:after="240"/>
+        <w:jc w:val="both"/>
       </w:pPr>
       <w:r>
         <w:rPr>
@@ -3693,7 +3711,7 @@
                     <pic:cNvPicPr/>
                   </pic:nvPicPr>
                   <pic:blipFill>
-                    <a:blip r:embed="rId16" cstate="print">
+                    <a:blip r:embed="rId18" cstate="print">
                       <a:extLst>
                         <a:ext uri="{28A0092B-C50C-407E-A947-70E740481C1C}">
                           <a14:useLocalDpi xmlns:a14="http://schemas.microsoft.com/office/drawing/2010/main" val="0"/>
@@ -3783,7 +3801,7 @@
                     <pic:cNvPicPr/>
                   </pic:nvPicPr>
                   <pic:blipFill>
-                    <a:blip r:embed="rId16" cstate="print">
+                    <a:blip r:embed="rId18" cstate="print">
                       <a:extLst>
                         <a:ext uri="{28A0092B-C50C-407E-A947-70E740481C1C}">
                           <a14:useLocalDpi xmlns:a14="http://schemas.microsoft.com/office/drawing/2010/main" val="0"/>
@@ -3861,7 +3879,7 @@
                     <pic:cNvPicPr/>
                   </pic:nvPicPr>
                   <pic:blipFill>
-                    <a:blip r:embed="rId16" cstate="print">
+                    <a:blip r:embed="rId18" cstate="print">
                       <a:extLst>
                         <a:ext uri="{28A0092B-C50C-407E-A947-70E740481C1C}">
                           <a14:useLocalDpi xmlns:a14="http://schemas.microsoft.com/office/drawing/2010/main" val="0"/>
@@ -3939,7 +3957,7 @@
                     <pic:cNvPicPr/>
                   </pic:nvPicPr>
                   <pic:blipFill>
-                    <a:blip r:embed="rId16" cstate="print">
+                    <a:blip r:embed="rId18" cstate="print">
                       <a:extLst>
                         <a:ext uri="{28A0092B-C50C-407E-A947-70E740481C1C}">
                           <a14:useLocalDpi xmlns:a14="http://schemas.microsoft.com/office/drawing/2010/main" val="0"/>
@@ -3980,7 +3998,6 @@
     </w:p>
     <w:p>
       <w:pPr>
-        <w:pageBreakBefore/>
         <w:bidi/>
         <w:spacing w:before="80" w:after="240"/>
         <w:jc w:val="both"/>
@@ -3994,7 +4011,6 @@
           <w:rtl/>
           <w:lang w:val="ar-SA"/>
         </w:rPr>
-        <w:lastRenderedPageBreak/>
         <w:drawing>
           <wp:anchor distT="114300" distB="114300" distL="114300" distR="114300" simplePos="0" relativeHeight="251662336" behindDoc="1" locked="0" layoutInCell="1" allowOverlap="1" wp14:anchorId="18FBAC40" wp14:editId="620987FE">
             <wp:simplePos x="0" y="0"/>
@@ -4033,7 +4049,7 @@
                     <pic:cNvPicPr/>
                   </pic:nvPicPr>
                   <pic:blipFill>
-                    <a:blip r:embed="rId16" cstate="print">
+                    <a:blip r:embed="rId18" cstate="print">
                       <a:extLst>
                         <a:ext uri="{28A0092B-C50C-407E-A947-70E740481C1C}">
                           <a14:useLocalDpi xmlns:a14="http://schemas.microsoft.com/office/drawing/2010/main" val="0"/>
@@ -4111,7 +4127,7 @@
                     <pic:cNvPicPr/>
                   </pic:nvPicPr>
                   <pic:blipFill>
-                    <a:blip r:embed="rId16" cstate="print">
+                    <a:blip r:embed="rId18" cstate="print">
                       <a:extLst>
                         <a:ext uri="{28A0092B-C50C-407E-A947-70E740481C1C}">
                           <a14:useLocalDpi xmlns:a14="http://schemas.microsoft.com/office/drawing/2010/main" val="0"/>
@@ -4155,6 +4171,9 @@
         <w:bidi/>
         <w:spacing w:before="80" w:after="240"/>
         <w:jc w:val="both"/>
+        <w:rPr>
+          <w:rtl/>
+        </w:rPr>
       </w:pPr>
       <w:r>
         <w:rPr>
@@ -4200,7 +4219,7 @@
                     <pic:cNvPicPr/>
                   </pic:nvPicPr>
                   <pic:blipFill>
-                    <a:blip r:embed="rId16" cstate="print">
+                    <a:blip r:embed="rId18" cstate="print">
                       <a:extLst>
                         <a:ext uri="{28A0092B-C50C-407E-A947-70E740481C1C}">
                           <a14:useLocalDpi xmlns:a14="http://schemas.microsoft.com/office/drawing/2010/main" val="0"/>
@@ -4239,12 +4258,630 @@
         <w:t xml:space="preserve">التفاف عبر الصورة: النسخة الأولية أطول من المطلوب بإحدى عشرة دقيقة، ومعظم الزيادة في الفصل الثاني حيث تتكرر المقابلتان. اختصار مشهد المطبخ يوفّر نحو ست دقائق دون المساس بمواد الأرشيف. النسخة الأولية أطول من المطلوب بإحدى عشرة دقيقة، ومعظم الزيادة في الفصل الثاني حيث تتكرر المقابلتان. اختصار مشهد المطبخ يوفّر نحو ست دقائق دون المساس بمواد الأرشيف. النسخة الأولية أطول من المطلوب بإحدى عشرة دقيقة، ومعظم الزيادة في الفصل الثاني حيث تتكرر المقابلتان. اختصار مشهد المطبخ يوفّر نحو ست دقائق دون المساس بمواد الأرشيف. النسخة الأولية أطول من المطلوب بإحدى عشرة دقيقة، ومعظم الزيادة في الفصل الثاني حيث تتكرر المقابلتان. اختصار مشهد المطبخ يوفّر نحو ست دقائق دون المساس بمواد الأرشيف. </w:t>
       </w:r>
     </w:p>
+    <w:p>
+      <w:pPr>
+        <w:pageBreakBefore/>
+        <w:bidi/>
+        <w:spacing w:before="80" w:after="240"/>
+        <w:jc w:val="both"/>
+        <w:rPr>
+          <w:rtl/>
+        </w:rPr>
+        <w:sectPr>
+          <w:pgSz w:w="11906" w:h="16838"/>
+          <w:pgMar w:top="1000" w:right="900" w:bottom="1000" w:left="900" w:header="708" w:footer="708" w:gutter="0"/>
+          <w:cols w:space="720"/>
+          <w:docGrid w:linePitch="360"/>
+        </w:sectPr>
+      </w:pPr>
+    </w:p>
+    <w:p>
+      <w:pPr>
+        <w:pageBreakBefore/>
+        <w:bidi/>
+        <w:spacing w:before="80" w:after="240"/>
+        <w:jc w:val="both"/>
+        <w:rPr>
+          <w:rtl/>
+        </w:rPr>
+      </w:pPr>
+      <w:r>
+        <w:rPr>
+          <w:rtl/>
+        </w:rPr>
+        <w:lastRenderedPageBreak/>
+        <w:t xml:space="preserve">مخطط مضمن في سطره: تجاوزت الحلقة الرابعة خطتها بثلاث ساعات بسبب إعادة تصوير مشهد السوق، بينما تأخرت الحلقة السادسة لأن مواد الأرشيف لم تصل بعد. تجاوزت الحلقة الرابعة خطتها بثلاث ساعات بسبب إعادة تصوير مشهد السوق، بينما تأخرت الحلقة السادسة لأن مواد الأرشيف لم تصل بعد. تجاوزت الحلقة الرابعة خطتها بثلاث ساعات بسبب إعادة تصوير مشهد السوق، بينما تأخرت الحلقة السادسة لأن مواد الأرشيف لم تصل بعد. </w:t>
+      </w:r>
+    </w:p>
+    <w:p>
+      <w:pPr>
+        <w:bidi/>
+        <w:spacing w:before="80" w:after="240"/>
+        <w:jc w:val="center"/>
+        <w:rPr>
+          <w:rtl/>
+        </w:rPr>
+      </w:pPr>
+      <w:r>
+        <w:rPr>
+          <w:noProof/>
+        </w:rPr>
+        <w:drawing>
+          <wp:inline distT="0" distB="0" distL="0" distR="0" wp14:anchorId="7DE510E1" wp14:editId="61CF184E">
+            <wp:extent cx="4572000" cy="2743200"/>
+            <wp:effectExtent l="0" t="0" r="0" b="0"/>
+            <wp:docPr id="1934735282" name="Chart 1"/>
+            <wp:cNvGraphicFramePr/>
+            <a:graphic xmlns:a="http://schemas.openxmlformats.org/drawingml/2006/main">
+              <a:graphicData uri="http://schemas.openxmlformats.org/drawingml/2006/chart">
+                <c:chart xmlns:c="http://schemas.openxmlformats.org/drawingml/2006/chart" xmlns:r="http://schemas.openxmlformats.org/officeDocument/2006/relationships" r:id="rId19"/>
+              </a:graphicData>
+            </a:graphic>
+          </wp:inline>
+        </w:drawing>
+      </w:r>
+    </w:p>
+    <w:p>
+      <w:pPr>
+        <w:bidi/>
+        <w:spacing w:before="80" w:after="240"/>
+        <w:jc w:val="both"/>
+        <w:rPr>
+          <w:rtl/>
+        </w:rPr>
+        <w:sectPr>
+          <w:pgSz w:w="16838" w:h="11906" w:orient="landscape"/>
+          <w:pgMar w:top="900" w:right="1000" w:bottom="900" w:left="1000" w:header="708" w:footer="708" w:gutter="0"/>
+          <w:cols w:space="720"/>
+          <w:docGrid w:linePitch="360"/>
+        </w:sectPr>
+      </w:pPr>
+      <w:r>
+        <w:rPr>
+          <w:noProof/>
+          <w:rtl/>
+          <w:lang w:val="ar-SA"/>
+        </w:rPr>
+        <w:drawing>
+          <wp:anchor distT="114300" distB="114300" distL="114300" distR="114300" simplePos="0" relativeHeight="251665408" behindDoc="0" locked="0" layoutInCell="1" allowOverlap="1" wp14:anchorId="73CA5506" wp14:editId="54A5EA77">
+            <wp:simplePos x="6851015" y="4367530"/>
+            <wp:positionH relativeFrom="column">
+              <wp:align>left</wp:align>
+            </wp:positionH>
+            <wp:positionV relativeFrom="paragraph">
+              <wp:posOffset>76200</wp:posOffset>
+            </wp:positionV>
+            <wp:extent cx="3200400" cy="2057400"/>
+            <wp:effectExtent l="0" t="0" r="0" b="0"/>
+            <wp:wrapSquare wrapText="bothSides"/>
+            <wp:docPr id="1654089638" name="Chart 2"/>
+            <wp:cNvGraphicFramePr/>
+            <a:graphic xmlns:a="http://schemas.openxmlformats.org/drawingml/2006/main">
+              <a:graphicData uri="http://schemas.openxmlformats.org/drawingml/2006/chart">
+                <c:chart xmlns:c="http://schemas.openxmlformats.org/drawingml/2006/chart" xmlns:r="http://schemas.openxmlformats.org/officeDocument/2006/relationships" r:id="rId20"/>
+              </a:graphicData>
+            </a:graphic>
+          </wp:anchor>
+        </w:drawing>
+      </w:r>
+      <w:r>
+        <w:rPr>
+          <w:rtl/>
+        </w:rPr>
+        <w:t xml:space="preserve">مخطط بالتفاف مربع: تجاوزت الحلقة الرابعة خطتها بثلاث ساعات بسبب إعادة تصوير مشهد السوق، بينما تأخرت الحلقة السادسة لأن مواد الأرشيف لم تصل بعد. تجاوزت الحلقة الرابعة خطتها بثلاث ساعات بسبب إعادة تصوير مشهد السوق، بينما تأخرت الحلقة السادسة لأن مواد الأرشيف لم تصل بعد. تجاوزت الحلقة الرابعة خطتها بثلاث ساعات بسبب إعادة تصوير مشهد السوق، بينما تأخرت الحلقة السادسة لأن مواد الأرشيف لم تصل بعد. تجاوزت الحلقة الرابعة خطتها بثلاث ساعات بسبب إعادة تصوير مشهد السوق، بينما تأخرت الحلقة السادسة لأن مواد الأرشيف لم تصل بعد. تجاوزت الحلقة الرابعة خطتها بثلاث ساعات بسبب إعادة تصوير مشهد السوق، بينما تأخرت الحلقة السادسة لأن مواد الأرشيف لم تصل بعد. تجاوزت الحلقة الرابعة خطتها بثلاث ساعات بسبب إعادة تصوير مشهد السوق، بينما تأخرت الحلقة السادسة لأن مواد الأرشيف لم تصل بعد. </w:t>
+      </w:r>
+    </w:p>
+    <w:p>
+      <w:pPr>
+        <w:bidi/>
+        <w:spacing w:before="80" w:after="240"/>
+        <w:jc w:val="both"/>
+        <w:rPr>
+          <w:rtl/>
+        </w:rPr>
+      </w:pPr>
+    </w:p>
+    <w:p>
+      <w:pPr>
+        <w:bidi/>
+        <w:spacing w:before="80" w:after="240"/>
+        <w:jc w:val="both"/>
+        <w:rPr>
+          <w:b/>
+          <w:rtl/>
+        </w:rPr>
+      </w:pPr>
+      <w:r>
+        <w:rPr>
+          <w:b/>
+          <w:rtl/>
+        </w:rPr>
+        <w:t xml:space="preserve">8. </w:t>
+      </w:r>
+      <w:r>
+        <w:rPr>
+          <w:b/>
+        </w:rPr>
+        <w:t>Lists, headers and empty lines</w:t>
+      </w:r>
+      <w:r>
+        <w:rPr>
+          <w:b/>
+          <w:rtl/>
+        </w:rPr>
+        <w:t xml:space="preserve"> / القوائم والرؤوس والأسطر الفارغة</w:t>
+      </w:r>
+    </w:p>
+    <w:p>
+      <w:pPr>
+        <w:pStyle w:val="ListParagraph"/>
+        <w:numPr>
+          <w:ilvl w:val="0"/>
+          <w:numId w:val="4"/>
+        </w:numPr>
+        <w:bidi/>
+        <w:spacing w:before="80" w:after="240"/>
+        <w:jc w:val="both"/>
+        <w:rPr>
+          <w:b/>
+          <w:rtl/>
+        </w:rPr>
+      </w:pPr>
+      <w:r>
+        <w:rPr>
+          <w:b/>
+          <w:rtl/>
+        </w:rPr>
+        <w:t>الأول: التصوير</w:t>
+      </w:r>
+    </w:p>
+    <w:p>
+      <w:pPr>
+        <w:pStyle w:val="ListParagraph"/>
+        <w:numPr>
+          <w:ilvl w:val="0"/>
+          <w:numId w:val="4"/>
+        </w:numPr>
+        <w:bidi/>
+        <w:spacing w:before="80" w:after="240"/>
+        <w:jc w:val="both"/>
+        <w:rPr>
+          <w:b/>
+          <w:rtl/>
+        </w:rPr>
+      </w:pPr>
+      <w:r>
+        <w:rPr>
+          <w:b/>
+          <w:rtl/>
+        </w:rPr>
+        <w:t>الثاني: المونتاج</w:t>
+      </w:r>
+    </w:p>
+    <w:p>
+      <w:pPr>
+        <w:pStyle w:val="ListParagraph"/>
+        <w:numPr>
+          <w:ilvl w:val="0"/>
+          <w:numId w:val="4"/>
+        </w:numPr>
+        <w:bidi/>
+        <w:spacing w:before="80" w:after="240"/>
+        <w:jc w:val="both"/>
+        <w:rPr>
+          <w:b/>
+          <w:rtl/>
+        </w:rPr>
+      </w:pPr>
+      <w:r>
+        <w:rPr>
+          <w:b/>
+          <w:rtl/>
+        </w:rPr>
+        <w:t>الثالث: التسليم</w:t>
+      </w:r>
+    </w:p>
+    <w:p>
+      <w:pPr>
+        <w:bidi/>
+        <w:spacing w:before="80" w:after="240"/>
+        <w:jc w:val="both"/>
+        <w:rPr>
+          <w:b/>
+          <w:rtl/>
+        </w:rPr>
+      </w:pPr>
+      <w:r>
+        <w:rPr>
+          <w:b/>
+          <w:rtl/>
+        </w:rPr>
+        <w:t>فقرة عادية بين القوائم، لا ترقيم فيها.</w:t>
+      </w:r>
+    </w:p>
+    <w:p>
+      <w:pPr>
+        <w:pStyle w:val="ListParagraph"/>
+        <w:numPr>
+          <w:ilvl w:val="0"/>
+          <w:numId w:val="4"/>
+        </w:numPr>
+        <w:bidi/>
+        <w:spacing w:before="80" w:after="240"/>
+        <w:jc w:val="both"/>
+        <w:rPr>
+          <w:b/>
+          <w:rtl/>
+        </w:rPr>
+      </w:pPr>
+      <w:r>
+        <w:rPr>
+          <w:b/>
+          <w:rtl/>
+        </w:rPr>
+        <w:t>الخامس: الألوان</w:t>
+      </w:r>
+    </w:p>
+    <w:p>
+      <w:pPr>
+        <w:pStyle w:val="ListParagraph"/>
+        <w:numPr>
+          <w:ilvl w:val="0"/>
+          <w:numId w:val="4"/>
+        </w:numPr>
+        <w:bidi/>
+        <w:spacing w:before="80" w:after="240"/>
+        <w:jc w:val="both"/>
+        <w:rPr>
+          <w:b/>
+          <w:rtl/>
+        </w:rPr>
+      </w:pPr>
+      <w:r>
+        <w:rPr>
+          <w:b/>
+          <w:rtl/>
+        </w:rPr>
+        <w:t>السادس: الصوت</w:t>
+      </w:r>
+    </w:p>
+    <w:p>
+      <w:pPr>
+        <w:pStyle w:val="ListParagraph"/>
+        <w:numPr>
+          <w:ilvl w:val="0"/>
+          <w:numId w:val="5"/>
+        </w:numPr>
+        <w:bidi/>
+        <w:spacing w:before="80" w:after="240"/>
+        <w:jc w:val="both"/>
+        <w:rPr>
+          <w:b/>
+          <w:rtl/>
+        </w:rPr>
+      </w:pPr>
+      <w:r>
+        <w:rPr>
+          <w:b/>
+          <w:rtl/>
+        </w:rPr>
+        <w:t>قائمة جديدة: أولاً</w:t>
+      </w:r>
+    </w:p>
+    <w:p>
+      <w:pPr>
+        <w:pStyle w:val="ListParagraph"/>
+        <w:numPr>
+          <w:ilvl w:val="0"/>
+          <w:numId w:val="5"/>
+        </w:numPr>
+        <w:bidi/>
+        <w:spacing w:before="80" w:after="240"/>
+        <w:jc w:val="both"/>
+        <w:rPr>
+          <w:b/>
+          <w:rtl/>
+        </w:rPr>
+      </w:pPr>
+      <w:r>
+        <w:rPr>
+          <w:b/>
+          <w:rtl/>
+        </w:rPr>
+        <w:t>قائمة جديدة: ثانياً</w:t>
+      </w:r>
+    </w:p>
+    <w:p>
+      <w:pPr>
+        <w:bidi/>
+        <w:spacing w:before="80" w:after="240"/>
+        <w:jc w:val="both"/>
+        <w:rPr>
+          <w:b/>
+          <w:rtl/>
+        </w:rPr>
+      </w:pPr>
+      <w:r>
+        <w:rPr>
+          <w:b/>
+          <w:rtl/>
+        </w:rPr>
+        <w:t>جدول فيه خلية فارغة:</w:t>
+      </w:r>
+    </w:p>
+    <w:tbl>
+      <w:tblPr>
+        <w:bidiVisual/>
+        <w:tblW w:w="0" w:type="auto"/>
+        <w:tblBorders>
+          <w:top w:val="single" w:sz="4" w:space="0" w:color="auto"/>
+          <w:left w:val="single" w:sz="4" w:space="0" w:color="auto"/>
+          <w:bottom w:val="single" w:sz="4" w:space="0" w:color="auto"/>
+          <w:right w:val="single" w:sz="4" w:space="0" w:color="auto"/>
+          <w:insideH w:val="single" w:sz="4" w:space="0" w:color="auto"/>
+          <w:insideV w:val="single" w:sz="4" w:space="0" w:color="auto"/>
+        </w:tblBorders>
+        <w:tblLayout w:type="fixed"/>
+        <w:tblLook w:val="0000" w:firstRow="0" w:lastRow="0" w:firstColumn="0" w:lastColumn="0" w:noHBand="0" w:noVBand="0"/>
+      </w:tblPr>
+      <w:tblGrid>
+        <w:gridCol w:w="5026"/>
+        <w:gridCol w:w="5026"/>
+      </w:tblGrid>
+      <w:tr>
+        <w:tc>
+          <w:tcPr>
+            <w:tcW w:w="5026" w:type="dxa"/>
+          </w:tcPr>
+          <w:p>
+            <w:pPr>
+              <w:bidi/>
+              <w:spacing w:before="80" w:after="240"/>
+              <w:jc w:val="both"/>
+              <w:rPr>
+                <w:b/>
+                <w:rtl/>
+              </w:rPr>
+            </w:pPr>
+            <w:r>
+              <w:rPr>
+                <w:b/>
+                <w:rtl/>
+              </w:rPr>
+              <w:t>البند</w:t>
+            </w:r>
+          </w:p>
+        </w:tc>
+        <w:tc>
+          <w:tcPr>
+            <w:tcW w:w="5026" w:type="dxa"/>
+          </w:tcPr>
+          <w:p>
+            <w:pPr>
+              <w:bidi/>
+              <w:spacing w:before="80" w:after="240"/>
+              <w:jc w:val="both"/>
+              <w:rPr>
+                <w:b/>
+                <w:rtl/>
+              </w:rPr>
+            </w:pPr>
+            <w:r>
+              <w:rPr>
+                <w:b/>
+                <w:rtl/>
+              </w:rPr>
+              <w:t>الحالة</w:t>
+            </w:r>
+          </w:p>
+        </w:tc>
+      </w:tr>
+      <w:tr>
+        <w:tc>
+          <w:tcPr>
+            <w:tcW w:w="5026" w:type="dxa"/>
+          </w:tcPr>
+          <w:p>
+            <w:pPr>
+              <w:bidi/>
+              <w:spacing w:before="80" w:after="240"/>
+              <w:jc w:val="both"/>
+              <w:rPr>
+                <w:b/>
+                <w:rtl/>
+              </w:rPr>
+            </w:pPr>
+          </w:p>
+        </w:tc>
+        <w:tc>
+          <w:tcPr>
+            <w:tcW w:w="5026" w:type="dxa"/>
+          </w:tcPr>
+          <w:p>
+            <w:pPr>
+              <w:bidi/>
+              <w:spacing w:before="80" w:after="240"/>
+              <w:jc w:val="both"/>
+              <w:rPr>
+                <w:b/>
+                <w:rtl/>
+              </w:rPr>
+            </w:pPr>
+            <w:r>
+              <w:rPr>
+                <w:b/>
+                <w:rtl/>
+              </w:rPr>
+              <w:t>فارغ</w:t>
+            </w:r>
+          </w:p>
+        </w:tc>
+      </w:tr>
+      <w:tr>
+        <w:tc>
+          <w:tcPr>
+            <w:tcW w:w="5026" w:type="dxa"/>
+          </w:tcPr>
+          <w:p>
+            <w:pPr>
+              <w:bidi/>
+              <w:spacing w:before="80" w:after="240"/>
+              <w:jc w:val="both"/>
+              <w:rPr>
+                <w:b/>
+                <w:rtl/>
+              </w:rPr>
+            </w:pPr>
+            <w:r>
+              <w:rPr>
+                <w:b/>
+                <w:rtl/>
+              </w:rPr>
+              <w:t>المراجعة</w:t>
+            </w:r>
+          </w:p>
+        </w:tc>
+        <w:tc>
+          <w:tcPr>
+            <w:tcW w:w="5026" w:type="dxa"/>
+          </w:tcPr>
+          <w:p>
+            <w:pPr>
+              <w:bidi/>
+              <w:spacing w:before="80" w:after="240"/>
+              <w:jc w:val="both"/>
+              <w:rPr>
+                <w:b/>
+                <w:rtl/>
+              </w:rPr>
+            </w:pPr>
+            <w:r>
+              <w:rPr>
+                <w:b/>
+                <w:rtl/>
+              </w:rPr>
+              <w:t>تمت</w:t>
+            </w:r>
+          </w:p>
+        </w:tc>
+      </w:tr>
+    </w:tbl>
+    <w:p>
+      <w:pPr>
+        <w:bidi/>
+        <w:spacing w:before="80" w:after="240"/>
+        <w:jc w:val="both"/>
+        <w:rPr>
+          <w:b/>
+        </w:rPr>
+      </w:pPr>
+      <w:r>
+        <w:rPr>
+          <w:b/>
+          <w:noProof/>
+        </w:rPr>
+        <mc:AlternateContent>
+          <mc:Choice Requires="wps">
+            <w:drawing>
+              <wp:anchor distT="0" distB="0" distL="114300" distR="114300" simplePos="0" relativeHeight="251666432" behindDoc="0" locked="0" layoutInCell="1" allowOverlap="1" wp14:anchorId="44724B16" wp14:editId="4B91A801">
+                <wp:simplePos x="0" y="0"/>
+                <wp:positionH relativeFrom="column">
+                  <wp:posOffset>-275590</wp:posOffset>
+                </wp:positionH>
+                <wp:positionV relativeFrom="paragraph">
+                  <wp:posOffset>-1844040</wp:posOffset>
+                </wp:positionV>
+                <wp:extent cx="2921000" cy="914400"/>
+                <wp:effectExtent l="0" t="0" r="12700" b="19050"/>
+                <wp:wrapNone/>
+                <wp:docPr id="983238157" name="Arabic delivery note"/>
+                <wp:cNvGraphicFramePr/>
+                <a:graphic xmlns:a="http://schemas.openxmlformats.org/drawingml/2006/main">
+                  <a:graphicData uri="http://schemas.microsoft.com/office/word/2010/wordprocessingShape">
+                    <wps:wsp>
+                      <wps:cNvSpPr txBox="1"/>
+                      <wps:spPr>
+                        <a:xfrm>
+                          <a:off x="0" y="0"/>
+                          <a:ext cx="2921000" cy="914400"/>
+                        </a:xfrm>
+                        <a:prstGeom prst="rect">
+                          <a:avLst/>
+                        </a:prstGeom>
+                        <a:solidFill>
+                          <a:srgbClr val="E8F2E8"/>
+                        </a:solidFill>
+                        <a:ln w="6350">
+                          <a:solidFill>
+                            <a:srgbClr val="3A6128"/>
+                          </a:solidFill>
+                        </a:ln>
+                      </wps:spPr>
+                      <wps:txbx>
+                        <w:txbxContent>
+                          <w:p>
+                            <w:r>
+                              <w:rPr>
+                                <w:rtl/>
+                              </w:rPr>
+                              <w:t>صندوق ملاحظات: مراجعة التسليم</w:t>
+                            </w:r>
+                          </w:p>
+                          <w:p>
+                            <w:r>
+                              <w:t>English note: confirm the final delivery.</w:t>
+                            </w:r>
+                          </w:p>
+                        </w:txbxContent>
+                      </wps:txbx>
+                      <wps:bodyPr rot="0" spcFirstLastPara="0" vertOverflow="overflow" horzOverflow="overflow" vert="horz" wrap="square" lIns="91440" tIns="45720" rIns="91440" bIns="45720" numCol="1" spcCol="0" rtlCol="0" fromWordArt="0" anchor="t" anchorCtr="0" forceAA="0" compatLnSpc="1">
+                        <a:prstTxWarp prst="textNoShape">
+                          <a:avLst/>
+                        </a:prstTxWarp>
+                        <a:noAutofit/>
+                      </wps:bodyPr>
+                    </wps:wsp>
+                  </a:graphicData>
+                </a:graphic>
+              </wp:anchor>
+            </w:drawing>
+          </mc:Choice>
+          <mc:Fallback>
+            <w:pict>
+              <v:shapetype w14:anchorId="44724B16" id="_x0000_t202" coordsize="21600,21600" o:spt="202" path="m,l,21600r21600,l21600,xe">
+                <v:stroke joinstyle="miter"/>
+                <v:path gradientshapeok="t" o:connecttype="rect"/>
+              </v:shapetype>
+              <v:shape id="Arabic delivery note" o:spid="_x0000_s1026" type="#_x0000_t202" style="position:absolute;left:0;text-align:left;margin-left:-21.7pt;margin-top:-145.2pt;width:230pt;height:1in;z-index:251666432;visibility:visible;mso-wrap-style:square;mso-wrap-distance-left:9pt;mso-wrap-distance-top:0;mso-wrap-distance-right:9pt;mso-wrap-distance-bottom:0;mso-position-horizontal:absolute;mso-position-horizontal-relative:text;mso-position-vertical:absolute;mso-position-vertical-relative:text;v-text-anchor:top" o:gfxdata="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" fillcolor="#e8f2e8" strokecolor="#3a6128" strokeweight=".5pt">
+                <v:textbox>
+                  <w:txbxContent>
+                    <w:p>
+                      <w:r>
+                        <w:rPr>
+                          <w:rtl/>
+                        </w:rPr>
+                        <w:t>صندوق ملاحظات: مراجعة التسليم</w:t>
+                      </w:r>
+                    </w:p>
+                    <w:p>
+                      <w:r>
+                        <w:t>English note: confirm the final delivery.</w:t>
+                      </w:r>
+                    </w:p>
+                  </w:txbxContent>
+                </v:textbox>
+              </v:shape>
+            </w:pict>
+          </mc:Fallback>
+        </mc:AlternateContent>
+      </w:r>
+    </w:p>
     <w:sectPr>
-      <w:headerReference w:type="default" r:id="rId17"/>
-      <w:footerReference w:type="default" r:id="rId18"/>
-      <w:pgSz w:w="16838" w:h="11906" w:orient="landscape"/>
-      <w:pgMar w:top="900" w:right="1000" w:bottom="900" w:left="1000" w:header="708" w:footer="708" w:gutter="0"/>
+      <w:headerReference w:type="first" r:id="rId21"/>
+      <w:pgSz w:w="11906" w:h="16838"/>
+      <w:pgMar w:top="720" w:right="720" w:bottom="720" w:left="1134" w:header="708" w:footer="708" w:gutter="0"/>
       <w:cols w:space="720"/>
+      <w:titlePg/>
       <w:docGrid w:linePitch="360"/>
     </w:sectPr>
   </w:body>
@@ -4768,6 +5405,25 @@
 </w:hdr>
 </file>
 
+<file path=word/header5.xml><?xml version="1.0" encoding="utf-8"?>
+<w:hdr xmlns:wpc="http://schemas.microsoft.com/office/word/2010/wordprocessingCanvas" xmlns:cx="http://schemas.microsoft.com/office/drawing/2014/chartex" xmlns:cx1="http://schemas.microsoft.com/office/drawing/2015/9/8/chartex" xmlns:cx2="http://schemas.microsoft.com/office/drawing/2015/10/21/chartex" xmlns:cx3="http://schemas.microsoft.com/office/drawing/2016/5/9/chartex" xmlns:cx4="http://schemas.microsoft.com/office/drawing/2016/5/10/chartex" xmlns:cx5="http://schemas.microsoft.com/office/drawing/2016/5/11/chartex" xmlns:cx6="http://schemas.microsoft.com/office/drawing/2016/5/12/chartex" xmlns:cx7="http://schemas.microsoft.com/office/drawing/2016/5/13/chartex" xmlns:cx8="http://schemas.microsoft.com/office/drawing/2016/5/14/chartex" xmlns:mc="http://schemas.openxmlformats.org/markup-compatibility/2006" xmlns:aink="http://schemas.microsoft.com/office/drawing/2016/ink" xmlns:am3d="http://schemas.microsoft.com/office/drawing/2017/model3d" xmlns:o="urn:schemas-microsoft-com:office:office" xmlns:oel="http://schemas.microsoft.com/office/2019/extlst" xmlns:r="http://schemas.openxmlformats.org/officeDocument/2006/relationships" xmlns:m="http://schemas.openxmlformats.org/officeDocument/2006/math" xmlns:v="urn:schemas-microsoft-com:vml" xmlns:wp14="http://schemas.microsoft.com/office/word/2010/wordprocessingDrawing" xmlns:wp="http://schemas.openxmlformats.org/drawingml/2006/wordprocessingDrawing" xmlns:w10="urn:schemas-microsoft-com:office:word" xmlns:w="http://schemas.openxmlformats.org/wordprocessingml/2006/main" xmlns:w14="http://schemas.microsoft.com/office/word/2010/wordml" xmlns:w15="http://schemas.microsoft.com/office/word/2012/wordml" xmlns:w16cex="http://schemas.microsoft.com/office/word/2018/wordml/cex" xmlns:w16cid="http://schemas.microsoft.com/office/word/2016/wordml/cid" xmlns:w16="http://schemas.microsoft.com/office/word/2018/wordml" xmlns:w16du="http://schemas.microsoft.com/office/word/2023/wordml/word16du" xmlns:w16sdtdh="http://schemas.microsoft.com/office/word/2020/wordml/sdtdatahash" xmlns:w16sdtfl="http://schemas.microsoft.com/office/word/2024/wordml/sdtformatlock" xmlns:w16se="http://schemas.microsoft.com/office/word/2015/wordml/symex" xmlns:wpg="http://schemas.microsoft.com/office/word/2010/wordprocessingGroup" xmlns:wpi="http://schemas.microsoft.com/office/word/2010/wordprocessingInk" xmlns:wne="http://schemas.microsoft.com/office/word/2006/wordml" xmlns:wps="http://schemas.microsoft.com/office/word/2010/wordprocessingShape" mc:Ignorable="w14 w15 w16se w16cid w16 w16cex w16sdtdh w16sdtfl w16du wp14">
+  <w:p>
+    <w:pPr>
+      <w:pStyle w:val="Header"/>
+    </w:pPr>
+    <w:r>
+      <w:rPr>
+        <w:rtl/>
+      </w:rPr>
+      <w:t>رأس الصفحة الأولى</w:t>
+    </w:r>
+    <w:r>
+      <w:t xml:space="preserve"> · First-page header</w:t>
+    </w:r>
+  </w:p>
+</w:hdr>
+</file>
+
 <file path=word/numbering.xml><?xml version="1.0" encoding="utf-8"?>
 <w:numbering xmlns:wpc="http://schemas.microsoft.com/office/word/2010/wordprocessingCanvas" xmlns:cx="http://schemas.microsoft.com/office/drawing/2014/chartex" xmlns:cx1="http://schemas.microsoft.com/office/drawing/2015/9/8/chartex" xmlns:cx2="http://schemas.microsoft.com/office/drawing/2015/10/21/chartex" xmlns:cx3="http://schemas.microsoft.com/office/drawing/2016/5/9/chartex" xmlns:cx4="http://schemas.microsoft.com/office/drawing/2016/5/10/chartex" xmlns:cx5="http://schemas.microsoft.com/office/drawing/2016/5/11/chartex" xmlns:cx6="http://schemas.microsoft.com/office/drawing/2016/5/12/chartex" xmlns:cx7="http://schemas.microsoft.com/office/drawing/2016/5/13/chartex" xmlns:cx8="http://schemas.microsoft.com/office/drawing/2016/5/14/chartex" xmlns:mc="http://schemas.openxmlformats.org/markup-compatibility/2006" xmlns:aink="http://schemas.microsoft.com/office/drawing/2016/ink" xmlns:am3d="http://schemas.microsoft.com/office/drawing/2017/model3d" xmlns:o="urn:schemas-microsoft-com:office:office" xmlns:oel="http://schemas.microsoft.com/office/2019/extlst" xmlns:r="http://schemas.openxmlformats.org/officeDocument/2006/relationships" xmlns:m="http://schemas.openxmlformats.org/officeDocument/2006/math" xmlns:v="urn:schemas-microsoft-com:vml" xmlns:wp14="http://schemas.microsoft.com/office/word/2010/wordprocessingDrawing" xmlns:wp="http://schemas.openxmlformats.org/drawingml/2006/wordprocessingDrawing" xmlns:w10="urn:schemas-microsoft-com:office:word" xmlns:w="http://schemas.openxmlformats.org/wordprocessingml/2006/main" xmlns:w14="http://schemas.microsoft.com/office/word/2010/wordml" xmlns:w15="http://schemas.microsoft.com/office/word/2012/wordml" xmlns:w16cex="http://schemas.microsoft.com/office/word/2018/wordml/cex" xmlns:w16cid="http://schemas.microsoft.com/office/word/2016/wordml/cid" xmlns:w16="http://schemas.microsoft.com/office/word/2018/wordml" xmlns:w16du="http://schemas.microsoft.com/office/word/2023/wordml/word16du" xmlns:w16sdtdh="http://schemas.microsoft.com/office/word/2020/wordml/sdtdatahash" xmlns:w16sdtfl="http://schemas.microsoft.com/office/word/2024/wordml/sdtformatlock" xmlns:w16se="http://schemas.microsoft.com/office/word/2015/wordml/symex" xmlns:wpg="http://schemas.microsoft.com/office/word/2010/wordprocessingGroup" xmlns:wpi="http://schemas.microsoft.com/office/word/2010/wordprocessingInk" xmlns:wne="http://schemas.microsoft.com/office/word/2006/wordml" xmlns:wps="http://schemas.microsoft.com/office/word/2010/wordprocessingShape" mc:Ignorable="w14 w15 w16se w16cid w16 w16cex w16sdtdh w16sdtfl w16du wp14">
   <w:abstractNum w:abstractNumId="0" w15:restartNumberingAfterBreak="0">
@@ -4920,6 +5576,20 @@
     </w:lvl>
   </w:abstractNum>
   <w:abstractNum w:abstractNumId="2" w15:restartNumberingAfterBreak="0">
+    <w:nsid w:val="2AAE143F"/>
+    <w:multiLevelType w:val="singleLevel"/>
+    <w:tmpl w:val="0409000F"/>
+    <w:lvl w:ilvl="0">
+      <w:start w:val="1"/>
+      <w:numFmt w:val="decimal"/>
+      <w:lvlText w:val="%1."/>
+      <w:lvlJc w:val="left"/>
+      <w:pPr>
+        <w:ind w:left="720" w:hanging="360"/>
+      </w:pPr>
+    </w:lvl>
+  </w:abstractNum>
+  <w:abstractNum w:abstractNumId="3" w15:restartNumberingAfterBreak="0">
     <w:nsid w:val="5180740F"/>
     <w:multiLevelType w:val="hybridMultilevel"/>
     <w:tmpl w:val="52CAA81C"/>
@@ -4980,6 +5650,20 @@
       <w:lvlJc w:val="left"/>
     </w:lvl>
   </w:abstractNum>
+  <w:abstractNum w:abstractNumId="4" w15:restartNumberingAfterBreak="0">
+    <w:nsid w:val="6FF26F63"/>
+    <w:multiLevelType w:val="singleLevel"/>
+    <w:tmpl w:val="0409000F"/>
+    <w:lvl w:ilvl="0">
+      <w:start w:val="1"/>
+      <w:numFmt w:val="decimal"/>
+      <w:lvlText w:val="%1."/>
+      <w:lvlJc w:val="left"/>
+      <w:pPr>
+        <w:ind w:left="720" w:hanging="360"/>
+      </w:pPr>
+    </w:lvl>
+  </w:abstractNum>
   <w:num w:numId="1" w16cid:durableId="1323662278">
     <w:abstractNumId w:val="0"/>
     <w:lvlOverride w:ilvl="0">
@@ -4987,7 +5671,7 @@
     </w:lvlOverride>
   </w:num>
   <w:num w:numId="2" w16cid:durableId="838082740">
-    <w:abstractNumId w:val="2"/>
+    <w:abstractNumId w:val="3"/>
     <w:lvlOverride w:ilvl="0">
       <w:startOverride w:val="1"/>
     </w:lvlOverride>
@@ -4997,6 +5681,12 @@
     <w:lvlOverride w:ilvl="0">
       <w:startOverride w:val="1"/>
     </w:lvlOverride>
+  </w:num>
+  <w:num w:numId="4" w16cid:durableId="578054331">
+    <w:abstractNumId w:val="2"/>
+  </w:num>
+  <w:num w:numId="5" w16cid:durableId="1088191622">
+    <w:abstractNumId w:val="4"/>
   </w:num>
 </w:numbering>
 </file>
@@ -5675,6 +6365,1850 @@
 </w:styles>
 </file>
 
+<file path=word/charts/chart1.xml><?xml version="1.0" encoding="utf-8"?>
+<c:chartSpace xmlns:c="http://schemas.openxmlformats.org/drawingml/2006/chart" xmlns:a="http://schemas.openxmlformats.org/drawingml/2006/main" xmlns:r="http://schemas.openxmlformats.org/officeDocument/2006/relationships" xmlns:c16r2="http://schemas.microsoft.com/office/drawing/2015/06/chart">
+  <c:date1904 val="0"/>
+  <c:lang val="en-US"/>
+  <c:roundedCorners val="0"/>
+  <mc:AlternateContent xmlns:mc="http://schemas.openxmlformats.org/markup-compatibility/2006">
+    <mc:Choice xmlns:c14="http://schemas.microsoft.com/office/drawing/2007/8/2/chart" Requires="c14">
+      <c14:style val="102"/>
+    </mc:Choice>
+    <mc:Fallback>
+      <c:style val="2"/>
+    </mc:Fallback>
+  </mc:AlternateContent>
+  <c:chart>
+    <c:title>
+      <c:tx>
+        <c:rich>
+          <a:bodyPr rot="0" spcFirstLastPara="1" vertOverflow="ellipsis" vert="horz" wrap="square" anchor="ctr" anchorCtr="1"/>
+          <a:lstStyle/>
+          <a:p>
+            <a:pPr>
+              <a:defRPr sz="1400" b="0" i="0" u="none" strike="noStrike" kern="1200" spc="0" baseline="0">
+                <a:solidFill>
+                  <a:schemeClr val="tx1">
+                    <a:lumMod val="65000"/>
+                    <a:lumOff val="35000"/>
+                  </a:schemeClr>
+                </a:solidFill>
+                <a:latin typeface="+mn-lt"/>
+                <a:ea typeface="+mn-ea"/>
+                <a:cs typeface="+mn-cs"/>
+              </a:defRPr>
+            </a:pPr>
+            <a:r>
+              <a:rPr lang="ar-EG"/>
+              <a:t>الساعات المسجلة لكل حلقة</a:t>
+            </a:r>
+          </a:p>
+        </c:rich>
+      </c:tx>
+      <c:overlay val="0"/>
+      <c:spPr>
+        <a:noFill/>
+        <a:ln>
+          <a:noFill/>
+        </a:ln>
+        <a:effectLst/>
+      </c:spPr>
+      <c:txPr>
+        <a:bodyPr rot="0" spcFirstLastPara="1" vertOverflow="ellipsis" vert="horz" wrap="square" anchor="ctr" anchorCtr="1"/>
+        <a:lstStyle/>
+        <a:p>
+          <a:pPr>
+            <a:defRPr sz="1400" b="0" i="0" u="none" strike="noStrike" kern="1200" spc="0" baseline="0">
+              <a:solidFill>
+                <a:schemeClr val="tx1">
+                  <a:lumMod val="65000"/>
+                  <a:lumOff val="35000"/>
+                </a:schemeClr>
+              </a:solidFill>
+              <a:latin typeface="+mn-lt"/>
+              <a:ea typeface="+mn-ea"/>
+              <a:cs typeface="+mn-cs"/>
+            </a:defRPr>
+          </a:pPr>
+          <a:endParaRPr lang="en-US"/>
+        </a:p>
+      </c:txPr>
+    </c:title>
+    <c:autoTitleDeleted val="0"/>
+    <c:plotArea>
+      <c:layout/>
+      <c:barChart>
+        <c:barDir val="col"/>
+        <c:grouping val="clustered"/>
+        <c:varyColors val="0"/>
+        <c:ser>
+          <c:idx val="0"/>
+          <c:order val="0"/>
+          <c:tx>
+            <c:v>المسجّلة</c:v>
+          </c:tx>
+          <c:spPr>
+            <a:solidFill>
+              <a:schemeClr val="accent1"/>
+            </a:solidFill>
+            <a:ln>
+              <a:noFill/>
+            </a:ln>
+            <a:effectLst/>
+          </c:spPr>
+          <c:invertIfNegative val="0"/>
+          <c:cat>
+            <c:strLit>
+              <c:ptCount val="3"/>
+              <c:pt idx="0">
+                <c:v>الحلقة الرابعة</c:v>
+              </c:pt>
+              <c:pt idx="1">
+                <c:v>الحلقة الخامسة</c:v>
+              </c:pt>
+              <c:pt idx="2">
+                <c:v>الحلقة السادسة</c:v>
+              </c:pt>
+            </c:strLit>
+          </c:cat>
+          <c:val>
+            <c:numLit>
+              <c:formatCode>General</c:formatCode>
+              <c:ptCount val="3"/>
+              <c:pt idx="0">
+                <c:v>39</c:v>
+              </c:pt>
+              <c:pt idx="1">
+                <c:v>27</c:v>
+              </c:pt>
+              <c:pt idx="2">
+                <c:v>8</c:v>
+              </c:pt>
+            </c:numLit>
+          </c:val>
+          <c:extLst>
+            <c:ext xmlns:c16="http://schemas.microsoft.com/office/drawing/2014/chart" uri="{C3380CC4-5D6E-409C-BE32-E72D297353CC}">
+              <c16:uniqueId val="{00000000-841D-4596-A34C-CD883A61479A}"/>
+            </c:ext>
+          </c:extLst>
+        </c:ser>
+        <c:ser>
+          <c:idx val="1"/>
+          <c:order val="1"/>
+          <c:tx>
+            <c:v>المخطّطة</c:v>
+          </c:tx>
+          <c:spPr>
+            <a:solidFill>
+              <a:schemeClr val="accent2"/>
+            </a:solidFill>
+            <a:ln>
+              <a:noFill/>
+            </a:ln>
+            <a:effectLst/>
+          </c:spPr>
+          <c:invertIfNegative val="0"/>
+          <c:cat>
+            <c:strLit>
+              <c:ptCount val="3"/>
+              <c:pt idx="0">
+                <c:v>الحلقة الرابعة</c:v>
+              </c:pt>
+              <c:pt idx="1">
+                <c:v>الحلقة الخامسة</c:v>
+              </c:pt>
+              <c:pt idx="2">
+                <c:v>الحلقة السادسة</c:v>
+              </c:pt>
+            </c:strLit>
+          </c:cat>
+          <c:val>
+            <c:numLit>
+              <c:formatCode>General</c:formatCode>
+              <c:ptCount val="3"/>
+              <c:pt idx="0">
+                <c:v>42</c:v>
+              </c:pt>
+              <c:pt idx="1">
+                <c:v>40</c:v>
+              </c:pt>
+              <c:pt idx="2">
+                <c:v>38</c:v>
+              </c:pt>
+            </c:numLit>
+          </c:val>
+          <c:extLst>
+            <c:ext xmlns:c16="http://schemas.microsoft.com/office/drawing/2014/chart" uri="{C3380CC4-5D6E-409C-BE32-E72D297353CC}">
+              <c16:uniqueId val="{00000001-841D-4596-A34C-CD883A61479A}"/>
+            </c:ext>
+          </c:extLst>
+        </c:ser>
+        <c:dLbls>
+          <c:showLegendKey val="0"/>
+          <c:showVal val="0"/>
+          <c:showCatName val="0"/>
+          <c:showSerName val="0"/>
+          <c:showPercent val="0"/>
+          <c:showBubbleSize val="0"/>
+        </c:dLbls>
+        <c:gapWidth val="219"/>
+        <c:overlap val="-27"/>
+        <c:axId val="1301100607"/>
+        <c:axId val="1305027183"/>
+      </c:barChart>
+      <c:catAx>
+        <c:axId val="1301100607"/>
+        <c:scaling>
+          <c:orientation val="minMax"/>
+        </c:scaling>
+        <c:delete val="0"/>
+        <c:axPos val="b"/>
+        <c:numFmt formatCode="General" sourceLinked="1"/>
+        <c:majorTickMark val="none"/>
+        <c:minorTickMark val="none"/>
+        <c:tickLblPos val="nextTo"/>
+        <c:spPr>
+          <a:noFill/>
+          <a:ln w="9525" cap="flat" cmpd="sng" algn="ctr">
+            <a:solidFill>
+              <a:schemeClr val="tx1">
+                <a:lumMod val="15000"/>
+                <a:lumOff val="85000"/>
+              </a:schemeClr>
+            </a:solidFill>
+            <a:round/>
+          </a:ln>
+          <a:effectLst/>
+        </c:spPr>
+        <c:txPr>
+          <a:bodyPr rot="-60000000" spcFirstLastPara="1" vertOverflow="ellipsis" vert="horz" wrap="square" anchor="ctr" anchorCtr="1"/>
+          <a:lstStyle/>
+          <a:p>
+            <a:pPr>
+              <a:defRPr sz="900" b="0" i="0" u="none" strike="noStrike" kern="1200" baseline="0">
+                <a:solidFill>
+                  <a:schemeClr val="tx1">
+                    <a:lumMod val="65000"/>
+                    <a:lumOff val="35000"/>
+                  </a:schemeClr>
+                </a:solidFill>
+                <a:latin typeface="+mn-lt"/>
+                <a:ea typeface="+mn-ea"/>
+                <a:cs typeface="+mn-cs"/>
+              </a:defRPr>
+            </a:pPr>
+            <a:endParaRPr lang="en-US"/>
+          </a:p>
+        </c:txPr>
+        <c:crossAx val="1305027183"/>
+        <c:crosses val="autoZero"/>
+        <c:auto val="1"/>
+        <c:lblAlgn val="ctr"/>
+        <c:lblOffset val="100"/>
+        <c:noMultiLvlLbl val="0"/>
+      </c:catAx>
+      <c:valAx>
+        <c:axId val="1305027183"/>
+        <c:scaling>
+          <c:orientation val="minMax"/>
+        </c:scaling>
+        <c:delete val="0"/>
+        <c:axPos val="l"/>
+        <c:majorGridlines>
+          <c:spPr>
+            <a:ln w="9525" cap="flat" cmpd="sng" algn="ctr">
+              <a:solidFill>
+                <a:schemeClr val="tx1">
+                  <a:lumMod val="15000"/>
+                  <a:lumOff val="85000"/>
+                </a:schemeClr>
+              </a:solidFill>
+              <a:round/>
+            </a:ln>
+            <a:effectLst/>
+          </c:spPr>
+        </c:majorGridlines>
+        <c:numFmt formatCode="General" sourceLinked="1"/>
+        <c:majorTickMark val="none"/>
+        <c:minorTickMark val="none"/>
+        <c:tickLblPos val="nextTo"/>
+        <c:spPr>
+          <a:noFill/>
+          <a:ln>
+            <a:noFill/>
+          </a:ln>
+          <a:effectLst/>
+        </c:spPr>
+        <c:txPr>
+          <a:bodyPr rot="-60000000" spcFirstLastPara="1" vertOverflow="ellipsis" vert="horz" wrap="square" anchor="ctr" anchorCtr="1"/>
+          <a:lstStyle/>
+          <a:p>
+            <a:pPr>
+              <a:defRPr sz="900" b="0" i="0" u="none" strike="noStrike" kern="1200" baseline="0">
+                <a:solidFill>
+                  <a:schemeClr val="tx1">
+                    <a:lumMod val="65000"/>
+                    <a:lumOff val="35000"/>
+                  </a:schemeClr>
+                </a:solidFill>
+                <a:latin typeface="+mn-lt"/>
+                <a:ea typeface="+mn-ea"/>
+                <a:cs typeface="+mn-cs"/>
+              </a:defRPr>
+            </a:pPr>
+            <a:endParaRPr lang="en-US"/>
+          </a:p>
+        </c:txPr>
+        <c:crossAx val="1301100607"/>
+        <c:crosses val="autoZero"/>
+        <c:crossBetween val="between"/>
+      </c:valAx>
+      <c:spPr>
+        <a:noFill/>
+        <a:ln>
+          <a:noFill/>
+        </a:ln>
+        <a:effectLst/>
+      </c:spPr>
+    </c:plotArea>
+    <c:legend>
+      <c:legendPos val="b"/>
+      <c:overlay val="0"/>
+      <c:spPr>
+        <a:noFill/>
+        <a:ln>
+          <a:noFill/>
+        </a:ln>
+        <a:effectLst/>
+      </c:spPr>
+      <c:txPr>
+        <a:bodyPr rot="0" spcFirstLastPara="1" vertOverflow="ellipsis" vert="horz" wrap="square" anchor="ctr" anchorCtr="1"/>
+        <a:lstStyle/>
+        <a:p>
+          <a:pPr>
+            <a:defRPr sz="900" b="0" i="0" u="none" strike="noStrike" kern="1200" baseline="0">
+              <a:solidFill>
+                <a:schemeClr val="tx1">
+                  <a:lumMod val="65000"/>
+                  <a:lumOff val="35000"/>
+                </a:schemeClr>
+              </a:solidFill>
+              <a:latin typeface="+mn-lt"/>
+              <a:ea typeface="+mn-ea"/>
+              <a:cs typeface="+mn-cs"/>
+            </a:defRPr>
+          </a:pPr>
+          <a:endParaRPr lang="en-US"/>
+        </a:p>
+      </c:txPr>
+    </c:legend>
+    <c:plotVisOnly val="1"/>
+    <c:dispBlanksAs val="gap"/>
+    <c:showDLblsOverMax val="0"/>
+    <c:extLst>
+      <c:ext xmlns:c16r3="http://schemas.microsoft.com/office/drawing/2017/03/chart" uri="{56B9EC1D-385E-4148-901F-78D8002777C0}">
+        <c16r3:dataDisplayOptions16>
+          <c16r3:dispNaAsBlank val="1"/>
+        </c16r3:dataDisplayOptions16>
+      </c:ext>
+    </c:extLst>
+  </c:chart>
+  <c:spPr>
+    <a:solidFill>
+      <a:schemeClr val="bg1"/>
+    </a:solidFill>
+    <a:ln w="9525" cap="flat" cmpd="sng" algn="ctr">
+      <a:solidFill>
+        <a:schemeClr val="tx1">
+          <a:lumMod val="15000"/>
+          <a:lumOff val="85000"/>
+        </a:schemeClr>
+      </a:solidFill>
+      <a:round/>
+    </a:ln>
+    <a:effectLst/>
+  </c:spPr>
+  <c:txPr>
+    <a:bodyPr/>
+    <a:lstStyle/>
+    <a:p>
+      <a:pPr>
+        <a:defRPr/>
+      </a:pPr>
+      <a:endParaRPr lang="en-US"/>
+    </a:p>
+  </c:txPr>
+  <c:externalData r:id="rId3">
+    <c:autoUpdate val="0"/>
+  </c:externalData>
+</c:chartSpace>
+</file>
+
+<file path=word/charts/chart2.xml><?xml version="1.0" encoding="utf-8"?>
+<c:chartSpace xmlns:c="http://schemas.openxmlformats.org/drawingml/2006/chart" xmlns:a="http://schemas.openxmlformats.org/drawingml/2006/main" xmlns:r="http://schemas.openxmlformats.org/officeDocument/2006/relationships" xmlns:c16r2="http://schemas.microsoft.com/office/drawing/2015/06/chart">
+  <c:date1904 val="0"/>
+  <c:lang val="en-US"/>
+  <c:roundedCorners val="0"/>
+  <mc:AlternateContent xmlns:mc="http://schemas.openxmlformats.org/markup-compatibility/2006">
+    <mc:Choice xmlns:c14="http://schemas.microsoft.com/office/drawing/2007/8/2/chart" Requires="c14">
+      <c14:style val="102"/>
+    </mc:Choice>
+    <mc:Fallback>
+      <c:style val="2"/>
+    </mc:Fallback>
+  </mc:AlternateContent>
+  <c:chart>
+    <c:title>
+      <c:tx>
+        <c:rich>
+          <a:bodyPr rot="0" spcFirstLastPara="1" vertOverflow="ellipsis" vert="horz" wrap="square" anchor="ctr" anchorCtr="1"/>
+          <a:lstStyle/>
+          <a:p>
+            <a:pPr>
+              <a:defRPr sz="1400" b="0" i="0" u="none" strike="noStrike" kern="1200" spc="0" baseline="0">
+                <a:solidFill>
+                  <a:schemeClr val="tx1">
+                    <a:lumMod val="65000"/>
+                    <a:lumOff val="35000"/>
+                  </a:schemeClr>
+                </a:solidFill>
+                <a:latin typeface="+mn-lt"/>
+                <a:ea typeface="+mn-ea"/>
+                <a:cs typeface="+mn-cs"/>
+              </a:defRPr>
+            </a:pPr>
+            <a:r>
+              <a:rPr lang="ar-EG"/>
+              <a:t>الساعات المسجلة لكل حلقة</a:t>
+            </a:r>
+          </a:p>
+        </c:rich>
+      </c:tx>
+      <c:overlay val="0"/>
+      <c:spPr>
+        <a:noFill/>
+        <a:ln>
+          <a:noFill/>
+        </a:ln>
+        <a:effectLst/>
+      </c:spPr>
+      <c:txPr>
+        <a:bodyPr rot="0" spcFirstLastPara="1" vertOverflow="ellipsis" vert="horz" wrap="square" anchor="ctr" anchorCtr="1"/>
+        <a:lstStyle/>
+        <a:p>
+          <a:pPr>
+            <a:defRPr sz="1400" b="0" i="0" u="none" strike="noStrike" kern="1200" spc="0" baseline="0">
+              <a:solidFill>
+                <a:schemeClr val="tx1">
+                  <a:lumMod val="65000"/>
+                  <a:lumOff val="35000"/>
+                </a:schemeClr>
+              </a:solidFill>
+              <a:latin typeface="+mn-lt"/>
+              <a:ea typeface="+mn-ea"/>
+              <a:cs typeface="+mn-cs"/>
+            </a:defRPr>
+          </a:pPr>
+          <a:endParaRPr lang="en-US"/>
+        </a:p>
+      </c:txPr>
+    </c:title>
+    <c:autoTitleDeleted val="0"/>
+    <c:plotArea>
+      <c:layout/>
+      <c:barChart>
+        <c:barDir val="col"/>
+        <c:grouping val="clustered"/>
+        <c:varyColors val="0"/>
+        <c:ser>
+          <c:idx val="0"/>
+          <c:order val="0"/>
+          <c:tx>
+            <c:v>المسجّلة</c:v>
+          </c:tx>
+          <c:spPr>
+            <a:solidFill>
+              <a:schemeClr val="accent1"/>
+            </a:solidFill>
+            <a:ln>
+              <a:noFill/>
+            </a:ln>
+            <a:effectLst/>
+          </c:spPr>
+          <c:invertIfNegative val="0"/>
+          <c:cat>
+            <c:strLit>
+              <c:ptCount val="3"/>
+              <c:pt idx="0">
+                <c:v>الحلقة الرابعة</c:v>
+              </c:pt>
+              <c:pt idx="1">
+                <c:v>الحلقة الخامسة</c:v>
+              </c:pt>
+              <c:pt idx="2">
+                <c:v>الحلقة السادسة</c:v>
+              </c:pt>
+            </c:strLit>
+          </c:cat>
+          <c:val>
+            <c:numLit>
+              <c:formatCode>General</c:formatCode>
+              <c:ptCount val="3"/>
+              <c:pt idx="0">
+                <c:v>39</c:v>
+              </c:pt>
+              <c:pt idx="1">
+                <c:v>27</c:v>
+              </c:pt>
+              <c:pt idx="2">
+                <c:v>8</c:v>
+              </c:pt>
+            </c:numLit>
+          </c:val>
+          <c:extLst>
+            <c:ext xmlns:c16="http://schemas.microsoft.com/office/drawing/2014/chart" uri="{C3380CC4-5D6E-409C-BE32-E72D297353CC}">
+              <c16:uniqueId val="{00000000-C9F1-42E2-B72E-552B20429953}"/>
+            </c:ext>
+          </c:extLst>
+        </c:ser>
+        <c:ser>
+          <c:idx val="1"/>
+          <c:order val="1"/>
+          <c:tx>
+            <c:v>المخطّطة</c:v>
+          </c:tx>
+          <c:spPr>
+            <a:solidFill>
+              <a:schemeClr val="accent2"/>
+            </a:solidFill>
+            <a:ln>
+              <a:noFill/>
+            </a:ln>
+            <a:effectLst/>
+          </c:spPr>
+          <c:invertIfNegative val="0"/>
+          <c:cat>
+            <c:strLit>
+              <c:ptCount val="3"/>
+              <c:pt idx="0">
+                <c:v>الحلقة الرابعة</c:v>
+              </c:pt>
+              <c:pt idx="1">
+                <c:v>الحلقة الخامسة</c:v>
+              </c:pt>
+              <c:pt idx="2">
+                <c:v>الحلقة السادسة</c:v>
+              </c:pt>
+            </c:strLit>
+          </c:cat>
+          <c:val>
+            <c:numLit>
+              <c:formatCode>General</c:formatCode>
+              <c:ptCount val="3"/>
+              <c:pt idx="0">
+                <c:v>42</c:v>
+              </c:pt>
+              <c:pt idx="1">
+                <c:v>40</c:v>
+              </c:pt>
+              <c:pt idx="2">
+                <c:v>38</c:v>
+              </c:pt>
+            </c:numLit>
+          </c:val>
+          <c:extLst>
+            <c:ext xmlns:c16="http://schemas.microsoft.com/office/drawing/2014/chart" uri="{C3380CC4-5D6E-409C-BE32-E72D297353CC}">
+              <c16:uniqueId val="{00000001-C9F1-42E2-B72E-552B20429953}"/>
+            </c:ext>
+          </c:extLst>
+        </c:ser>
+        <c:dLbls>
+          <c:showLegendKey val="0"/>
+          <c:showVal val="0"/>
+          <c:showCatName val="0"/>
+          <c:showSerName val="0"/>
+          <c:showPercent val="0"/>
+          <c:showBubbleSize val="0"/>
+        </c:dLbls>
+        <c:gapWidth val="219"/>
+        <c:overlap val="-27"/>
+        <c:axId val="1331339391"/>
+        <c:axId val="1305108783"/>
+      </c:barChart>
+      <c:catAx>
+        <c:axId val="1331339391"/>
+        <c:scaling>
+          <c:orientation val="minMax"/>
+        </c:scaling>
+        <c:delete val="0"/>
+        <c:axPos val="b"/>
+        <c:numFmt formatCode="General" sourceLinked="1"/>
+        <c:majorTickMark val="none"/>
+        <c:minorTickMark val="none"/>
+        <c:tickLblPos val="nextTo"/>
+        <c:spPr>
+          <a:noFill/>
+          <a:ln w="9525" cap="flat" cmpd="sng" algn="ctr">
+            <a:solidFill>
+              <a:schemeClr val="tx1">
+                <a:lumMod val="15000"/>
+                <a:lumOff val="85000"/>
+              </a:schemeClr>
+            </a:solidFill>
+            <a:round/>
+          </a:ln>
+          <a:effectLst/>
+        </c:spPr>
+        <c:txPr>
+          <a:bodyPr rot="-60000000" spcFirstLastPara="1" vertOverflow="ellipsis" vert="horz" wrap="square" anchor="ctr" anchorCtr="1"/>
+          <a:lstStyle/>
+          <a:p>
+            <a:pPr>
+              <a:defRPr sz="900" b="0" i="0" u="none" strike="noStrike" kern="1200" baseline="0">
+                <a:solidFill>
+                  <a:schemeClr val="tx1">
+                    <a:lumMod val="65000"/>
+                    <a:lumOff val="35000"/>
+                  </a:schemeClr>
+                </a:solidFill>
+                <a:latin typeface="+mn-lt"/>
+                <a:ea typeface="+mn-ea"/>
+                <a:cs typeface="+mn-cs"/>
+              </a:defRPr>
+            </a:pPr>
+            <a:endParaRPr lang="en-US"/>
+          </a:p>
+        </c:txPr>
+        <c:crossAx val="1305108783"/>
+        <c:crosses val="autoZero"/>
+        <c:auto val="1"/>
+        <c:lblAlgn val="ctr"/>
+        <c:lblOffset val="100"/>
+        <c:noMultiLvlLbl val="0"/>
+      </c:catAx>
+      <c:valAx>
+        <c:axId val="1305108783"/>
+        <c:scaling>
+          <c:orientation val="minMax"/>
+        </c:scaling>
+        <c:delete val="0"/>
+        <c:axPos val="l"/>
+        <c:majorGridlines>
+          <c:spPr>
+            <a:ln w="9525" cap="flat" cmpd="sng" algn="ctr">
+              <a:solidFill>
+                <a:schemeClr val="tx1">
+                  <a:lumMod val="15000"/>
+                  <a:lumOff val="85000"/>
+                </a:schemeClr>
+              </a:solidFill>
+              <a:round/>
+            </a:ln>
+            <a:effectLst/>
+          </c:spPr>
+        </c:majorGridlines>
+        <c:numFmt formatCode="General" sourceLinked="1"/>
+        <c:majorTickMark val="none"/>
+        <c:minorTickMark val="none"/>
+        <c:tickLblPos val="nextTo"/>
+        <c:spPr>
+          <a:noFill/>
+          <a:ln>
+            <a:noFill/>
+          </a:ln>
+          <a:effectLst/>
+        </c:spPr>
+        <c:txPr>
+          <a:bodyPr rot="-60000000" spcFirstLastPara="1" vertOverflow="ellipsis" vert="horz" wrap="square" anchor="ctr" anchorCtr="1"/>
+          <a:lstStyle/>
+          <a:p>
+            <a:pPr>
+              <a:defRPr sz="900" b="0" i="0" u="none" strike="noStrike" kern="1200" baseline="0">
+                <a:solidFill>
+                  <a:schemeClr val="tx1">
+                    <a:lumMod val="65000"/>
+                    <a:lumOff val="35000"/>
+                  </a:schemeClr>
+                </a:solidFill>
+                <a:latin typeface="+mn-lt"/>
+                <a:ea typeface="+mn-ea"/>
+                <a:cs typeface="+mn-cs"/>
+              </a:defRPr>
+            </a:pPr>
+            <a:endParaRPr lang="en-US"/>
+          </a:p>
+        </c:txPr>
+        <c:crossAx val="1331339391"/>
+        <c:crosses val="autoZero"/>
+        <c:crossBetween val="between"/>
+      </c:valAx>
+      <c:spPr>
+        <a:noFill/>
+        <a:ln>
+          <a:noFill/>
+        </a:ln>
+        <a:effectLst/>
+      </c:spPr>
+    </c:plotArea>
+    <c:legend>
+      <c:legendPos val="b"/>
+      <c:overlay val="0"/>
+      <c:spPr>
+        <a:noFill/>
+        <a:ln>
+          <a:noFill/>
+        </a:ln>
+        <a:effectLst/>
+      </c:spPr>
+      <c:txPr>
+        <a:bodyPr rot="0" spcFirstLastPara="1" vertOverflow="ellipsis" vert="horz" wrap="square" anchor="ctr" anchorCtr="1"/>
+        <a:lstStyle/>
+        <a:p>
+          <a:pPr>
+            <a:defRPr sz="900" b="0" i="0" u="none" strike="noStrike" kern="1200" baseline="0">
+              <a:solidFill>
+                <a:schemeClr val="tx1">
+                  <a:lumMod val="65000"/>
+                  <a:lumOff val="35000"/>
+                </a:schemeClr>
+              </a:solidFill>
+              <a:latin typeface="+mn-lt"/>
+              <a:ea typeface="+mn-ea"/>
+              <a:cs typeface="+mn-cs"/>
+            </a:defRPr>
+          </a:pPr>
+          <a:endParaRPr lang="en-US"/>
+        </a:p>
+      </c:txPr>
+    </c:legend>
+    <c:plotVisOnly val="1"/>
+    <c:dispBlanksAs val="gap"/>
+    <c:showDLblsOverMax val="0"/>
+    <c:extLst>
+      <c:ext xmlns:c16r3="http://schemas.microsoft.com/office/drawing/2017/03/chart" uri="{56B9EC1D-385E-4148-901F-78D8002777C0}">
+        <c16r3:dataDisplayOptions16>
+          <c16r3:dispNaAsBlank val="1"/>
+        </c16r3:dataDisplayOptions16>
+      </c:ext>
+    </c:extLst>
+  </c:chart>
+  <c:spPr>
+    <a:solidFill>
+      <a:schemeClr val="bg1"/>
+    </a:solidFill>
+    <a:ln w="9525" cap="flat" cmpd="sng" algn="ctr">
+      <a:solidFill>
+        <a:schemeClr val="tx1">
+          <a:lumMod val="15000"/>
+          <a:lumOff val="85000"/>
+        </a:schemeClr>
+      </a:solidFill>
+      <a:round/>
+    </a:ln>
+    <a:effectLst/>
+  </c:spPr>
+  <c:txPr>
+    <a:bodyPr/>
+    <a:lstStyle/>
+    <a:p>
+      <a:pPr>
+        <a:defRPr/>
+      </a:pPr>
+      <a:endParaRPr lang="en-US"/>
+    </a:p>
+  </c:txPr>
+  <c:externalData r:id="rId3">
+    <c:autoUpdate val="0"/>
+  </c:externalData>
+</c:chartSpace>
+</file>
+
+<file path=word/charts/colors1.xml><?xml version="1.0" encoding="utf-8"?>
+<cs:colorStyle xmlns:cs="http://schemas.microsoft.com/office/drawing/2012/chartStyle" xmlns:a="http://schemas.openxmlformats.org/drawingml/2006/main" meth="cycle" id="10">
+  <a:schemeClr val="accent1"/>
+  <a:schemeClr val="accent2"/>
+  <a:schemeClr val="accent3"/>
+  <a:schemeClr val="accent4"/>
+  <a:schemeClr val="accent5"/>
+  <a:schemeClr val="accent6"/>
+  <cs:variation/>
+  <cs:variation>
+    <a:lumMod val="60000"/>
+  </cs:variation>
+  <cs:variation>
+    <a:lumMod val="80000"/>
+    <a:lumOff val="20000"/>
+  </cs:variation>
+  <cs:variation>
+    <a:lumMod val="80000"/>
+  </cs:variation>
+  <cs:variation>
+    <a:lumMod val="60000"/>
+    <a:lumOff val="40000"/>
+  </cs:variation>
+  <cs:variation>
+    <a:lumMod val="50000"/>
+  </cs:variation>
+  <cs:variation>
+    <a:lumMod val="70000"/>
+    <a:lumOff val="30000"/>
+  </cs:variation>
+  <cs:variation>
+    <a:lumMod val="70000"/>
+  </cs:variation>
+  <cs:variation>
+    <a:lumMod val="50000"/>
+    <a:lumOff val="50000"/>
+  </cs:variation>
+</cs:colorStyle>
+</file>
+
+<file path=word/charts/colors2.xml><?xml version="1.0" encoding="utf-8"?>
+<cs:colorStyle xmlns:cs="http://schemas.microsoft.com/office/drawing/2012/chartStyle" xmlns:a="http://schemas.openxmlformats.org/drawingml/2006/main" meth="cycle" id="10">
+  <a:schemeClr val="accent1"/>
+  <a:schemeClr val="accent2"/>
+  <a:schemeClr val="accent3"/>
+  <a:schemeClr val="accent4"/>
+  <a:schemeClr val="accent5"/>
+  <a:schemeClr val="accent6"/>
+  <cs:variation/>
+  <cs:variation>
+    <a:lumMod val="60000"/>
+  </cs:variation>
+  <cs:variation>
+    <a:lumMod val="80000"/>
+    <a:lumOff val="20000"/>
+  </cs:variation>
+  <cs:variation>
+    <a:lumMod val="80000"/>
+  </cs:variation>
+  <cs:variation>
+    <a:lumMod val="60000"/>
+    <a:lumOff val="40000"/>
+  </cs:variation>
+  <cs:variation>
+    <a:lumMod val="50000"/>
+  </cs:variation>
+  <cs:variation>
+    <a:lumMod val="70000"/>
+    <a:lumOff val="30000"/>
+  </cs:variation>
+  <cs:variation>
+    <a:lumMod val="70000"/>
+  </cs:variation>
+  <cs:variation>
+    <a:lumMod val="50000"/>
+    <a:lumOff val="50000"/>
+  </cs:variation>
+</cs:colorStyle>
+</file>
+
+<file path=word/charts/style1.xml><?xml version="1.0" encoding="utf-8"?>
+<cs:chartStyle xmlns:cs="http://schemas.microsoft.com/office/drawing/2012/chartStyle" xmlns:a="http://schemas.openxmlformats.org/drawingml/2006/main" id="201">
+  <cs:axisTitle>
+    <cs:lnRef idx="0"/>
+    <cs:fillRef idx="0"/>
+    <cs:effectRef idx="0"/>
+    <cs:fontRef idx="minor">
+      <a:schemeClr val="tx1">
+        <a:lumMod val="65000"/>
+        <a:lumOff val="35000"/>
+      </a:schemeClr>
+    </cs:fontRef>
+    <cs:defRPr sz="1000" kern="1200"/>
+  </cs:axisTitle>
+  <cs:categoryAxis>
+    <cs:lnRef idx="0"/>
+    <cs:fillRef idx="0"/>
+    <cs:effectRef idx="0"/>
+    <cs:fontRef idx="minor">
+      <a:schemeClr val="tx1">
+        <a:lumMod val="65000"/>
+        <a:lumOff val="35000"/>
+      </a:schemeClr>
+    </cs:fontRef>
+    <cs:spPr>
+      <a:ln w="9525" cap="flat" cmpd="sng" algn="ctr">
+        <a:solidFill>
+          <a:schemeClr val="tx1">
+            <a:lumMod val="15000"/>
+            <a:lumOff val="85000"/>
+          </a:schemeClr>
+        </a:solidFill>
+        <a:round/>
+      </a:ln>
+    </cs:spPr>
+    <cs:defRPr sz="900" kern="1200"/>
+  </cs:categoryAxis>
+  <cs:chartArea mods="allowNoFillOverride allowNoLineOverride">
+    <cs:lnRef idx="0"/>
+    <cs:fillRef idx="0"/>
+    <cs:effectRef idx="0"/>
+    <cs:fontRef idx="minor">
+      <a:schemeClr val="tx1"/>
+    </cs:fontRef>
+    <cs:spPr>
+      <a:solidFill>
+        <a:schemeClr val="bg1"/>
+      </a:solidFill>
+      <a:ln w="9525" cap="flat" cmpd="sng" algn="ctr">
+        <a:solidFill>
+          <a:schemeClr val="tx1">
+            <a:lumMod val="15000"/>
+            <a:lumOff val="85000"/>
+          </a:schemeClr>
+        </a:solidFill>
+        <a:round/>
+      </a:ln>
+    </cs:spPr>
+    <cs:defRPr sz="1000" kern="1200"/>
+  </cs:chartArea>
+  <cs:dataLabel>
+    <cs:lnRef idx="0"/>
+    <cs:fillRef idx="0"/>
+    <cs:effectRef idx="0"/>
+    <cs:fontRef idx="minor">
+      <a:schemeClr val="tx1">
+        <a:lumMod val="75000"/>
+        <a:lumOff val="25000"/>
+      </a:schemeClr>
+    </cs:fontRef>
+    <cs:defRPr sz="900" kern="1200"/>
+  </cs:dataLabel>
+  <cs:dataLabelCallout>
+    <cs:lnRef idx="0"/>
+    <cs:fillRef idx="0"/>
+    <cs:effectRef idx="0"/>
+    <cs:fontRef idx="minor">
+      <a:schemeClr val="dk1">
+        <a:lumMod val="65000"/>
+        <a:lumOff val="35000"/>
+      </a:schemeClr>
+    </cs:fontRef>
+    <cs:spPr>
+      <a:solidFill>
+        <a:schemeClr val="lt1"/>
+      </a:solidFill>
+      <a:ln>
+        <a:solidFill>
+          <a:schemeClr val="dk1">
+            <a:lumMod val="25000"/>
+            <a:lumOff val="75000"/>
+          </a:schemeClr>
+        </a:solidFill>
+      </a:ln>
+    </cs:spPr>
+    <cs:defRPr sz="900" kern="1200"/>
+    <cs:bodyPr rot="0" spcFirstLastPara="1" vertOverflow="clip" horzOverflow="clip" vert="horz" wrap="square" lIns="36576" tIns="18288" rIns="36576" bIns="18288" anchor="ctr" anchorCtr="1">
+      <a:spAutoFit/>
+    </cs:bodyPr>
+  </cs:dataLabelCallout>
+  <cs:dataPoint>
+    <cs:lnRef idx="0"/>
+    <cs:fillRef idx="1">
+      <cs:styleClr val="auto"/>
+    </cs:fillRef>
+    <cs:effectRef idx="0"/>
+    <cs:fontRef idx="minor">
+      <a:schemeClr val="tx1"/>
+    </cs:fontRef>
+  </cs:dataPoint>
+  <cs:dataPoint3D>
+    <cs:lnRef idx="0"/>
+    <cs:fillRef idx="1">
+      <cs:styleClr val="auto"/>
+    </cs:fillRef>
+    <cs:effectRef idx="0"/>
+    <cs:fontRef idx="minor">
+      <a:schemeClr val="tx1"/>
+    </cs:fontRef>
+  </cs:dataPoint3D>
+  <cs:dataPointLine>
+    <cs:lnRef idx="0">
+      <cs:styleClr val="auto"/>
+    </cs:lnRef>
+    <cs:fillRef idx="1"/>
+    <cs:effectRef idx="0"/>
+    <cs:fontRef idx="minor">
+      <a:schemeClr val="tx1"/>
+    </cs:fontRef>
+    <cs:spPr>
+      <a:ln w="28575" cap="rnd">
+        <a:solidFill>
+          <a:schemeClr val="phClr"/>
+        </a:solidFill>
+        <a:round/>
+      </a:ln>
+    </cs:spPr>
+  </cs:dataPointLine>
+  <cs:dataPointMarker>
+    <cs:lnRef idx="0">
+      <cs:styleClr val="auto"/>
+    </cs:lnRef>
+    <cs:fillRef idx="1">
+      <cs:styleClr val="auto"/>
+    </cs:fillRef>
+    <cs:effectRef idx="0"/>
+    <cs:fontRef idx="minor">
+      <a:schemeClr val="tx1"/>
+    </cs:fontRef>
+    <cs:spPr>
+      <a:ln w="9525">
+        <a:solidFill>
+          <a:schemeClr val="phClr"/>
+        </a:solidFill>
+      </a:ln>
+    </cs:spPr>
+  </cs:dataPointMarker>
+  <cs:dataPointMarkerLayout symbol="circle" size="5"/>
+  <cs:dataPointWireframe>
+    <cs:lnRef idx="0">
+      <cs:styleClr val="auto"/>
+    </cs:lnRef>
+    <cs:fillRef idx="1"/>
+    <cs:effectRef idx="0"/>
+    <cs:fontRef idx="minor">
+      <a:schemeClr val="tx1"/>
+    </cs:fontRef>
+    <cs:spPr>
+      <a:ln w="9525" cap="rnd">
+        <a:solidFill>
+          <a:schemeClr val="phClr"/>
+        </a:solidFill>
+        <a:round/>
+      </a:ln>
+    </cs:spPr>
+  </cs:dataPointWireframe>
+  <cs:dataTable>
+    <cs:lnRef idx="0"/>
+    <cs:fillRef idx="0"/>
+    <cs:effectRef idx="0"/>
+    <cs:fontRef idx="minor">
+      <a:schemeClr val="tx1">
+        <a:lumMod val="65000"/>
+        <a:lumOff val="35000"/>
+      </a:schemeClr>
+    </cs:fontRef>
+    <cs:spPr>
+      <a:noFill/>
+      <a:ln w="9525" cap="flat" cmpd="sng" algn="ctr">
+        <a:solidFill>
+          <a:schemeClr val="tx1">
+            <a:lumMod val="15000"/>
+            <a:lumOff val="85000"/>
+          </a:schemeClr>
+        </a:solidFill>
+        <a:round/>
+      </a:ln>
+    </cs:spPr>
+    <cs:defRPr sz="900" kern="1200"/>
+  </cs:dataTable>
+  <cs:downBar>
+    <cs:lnRef idx="0"/>
+    <cs:fillRef idx="0"/>
+    <cs:effectRef idx="0"/>
+    <cs:fontRef idx="minor">
+      <a:schemeClr val="dk1"/>
+    </cs:fontRef>
+    <cs:spPr>
+      <a:solidFill>
+        <a:schemeClr val="dk1">
+          <a:lumMod val="65000"/>
+          <a:lumOff val="35000"/>
+        </a:schemeClr>
+      </a:solidFill>
+      <a:ln w="9525">
+        <a:solidFill>
+          <a:schemeClr val="tx1">
+            <a:lumMod val="65000"/>
+            <a:lumOff val="35000"/>
+          </a:schemeClr>
+        </a:solidFill>
+      </a:ln>
+    </cs:spPr>
+  </cs:downBar>
+  <cs:dropLine>
+    <cs:lnRef idx="0"/>
+    <cs:fillRef idx="0"/>
+    <cs:effectRef idx="0"/>
+    <cs:fontRef idx="minor">
+      <a:schemeClr val="tx1"/>
+    </cs:fontRef>
+    <cs:spPr>
+      <a:ln w="9525" cap="flat" cmpd="sng" algn="ctr">
+        <a:solidFill>
+          <a:schemeClr val="tx1">
+            <a:lumMod val="35000"/>
+            <a:lumOff val="65000"/>
+          </a:schemeClr>
+        </a:solidFill>
+        <a:round/>
+      </a:ln>
+    </cs:spPr>
+  </cs:dropLine>
+  <cs:errorBar>
+    <cs:lnRef idx="0"/>
+    <cs:fillRef idx="0"/>
+    <cs:effectRef idx="0"/>
+    <cs:fontRef idx="minor">
+      <a:schemeClr val="tx1"/>
+    </cs:fontRef>
+    <cs:spPr>
+      <a:ln w="9525" cap="flat" cmpd="sng" algn="ctr">
+        <a:solidFill>
+          <a:schemeClr val="tx1">
+            <a:lumMod val="65000"/>
+            <a:lumOff val="35000"/>
+          </a:schemeClr>
+        </a:solidFill>
+        <a:round/>
+      </a:ln>
+    </cs:spPr>
+  </cs:errorBar>
+  <cs:floor>
+    <cs:lnRef idx="0"/>
+    <cs:fillRef idx="0"/>
+    <cs:effectRef idx="0"/>
+    <cs:fontRef idx="minor">
+      <a:schemeClr val="tx1"/>
+    </cs:fontRef>
+    <cs:spPr>
+      <a:noFill/>
+      <a:ln>
+        <a:noFill/>
+      </a:ln>
+    </cs:spPr>
+  </cs:floor>
+  <cs:gridlineMajor>
+    <cs:lnRef idx="0"/>
+    <cs:fillRef idx="0"/>
+    <cs:effectRef idx="0"/>
+    <cs:fontRef idx="minor">
+      <a:schemeClr val="tx1"/>
+    </cs:fontRef>
+    <cs:spPr>
+      <a:ln w="9525" cap="flat" cmpd="sng" algn="ctr">
+        <a:solidFill>
+          <a:schemeClr val="tx1">
+            <a:lumMod val="15000"/>
+            <a:lumOff val="85000"/>
+          </a:schemeClr>
+        </a:solidFill>
+        <a:round/>
+      </a:ln>
+    </cs:spPr>
+  </cs:gridlineMajor>
+  <cs:gridlineMinor>
+    <cs:lnRef idx="0"/>
+    <cs:fillRef idx="0"/>
+    <cs:effectRef idx="0"/>
+    <cs:fontRef idx="minor">
+      <a:schemeClr val="tx1"/>
+    </cs:fontRef>
+    <cs:spPr>
+      <a:ln w="9525" cap="flat" cmpd="sng" algn="ctr">
+        <a:solidFill>
+          <a:schemeClr val="tx1">
+            <a:lumMod val="5000"/>
+            <a:lumOff val="95000"/>
+          </a:schemeClr>
+        </a:solidFill>
+        <a:round/>
+      </a:ln>
+    </cs:spPr>
+  </cs:gridlineMinor>
+  <cs:hiLoLine>
+    <cs:lnRef idx="0"/>
+    <cs:fillRef idx="0"/>
+    <cs:effectRef idx="0"/>
+    <cs:fontRef idx="minor">
+      <a:schemeClr val="tx1"/>
+    </cs:fontRef>
+    <cs:spPr>
+      <a:ln w="9525" cap="flat" cmpd="sng" algn="ctr">
+        <a:solidFill>
+          <a:schemeClr val="tx1">
+            <a:lumMod val="75000"/>
+            <a:lumOff val="25000"/>
+          </a:schemeClr>
+        </a:solidFill>
+        <a:round/>
+      </a:ln>
+    </cs:spPr>
+  </cs:hiLoLine>
+  <cs:leaderLine>
+    <cs:lnRef idx="0"/>
+    <cs:fillRef idx="0"/>
+    <cs:effectRef idx="0"/>
+    <cs:fontRef idx="minor">
+      <a:schemeClr val="tx1"/>
+    </cs:fontRef>
+    <cs:spPr>
+      <a:ln w="9525" cap="flat" cmpd="sng" algn="ctr">
+        <a:solidFill>
+          <a:schemeClr val="tx1">
+            <a:lumMod val="35000"/>
+            <a:lumOff val="65000"/>
+          </a:schemeClr>
+        </a:solidFill>
+        <a:round/>
+      </a:ln>
+    </cs:spPr>
+  </cs:leaderLine>
+  <cs:legend>
+    <cs:lnRef idx="0"/>
+    <cs:fillRef idx="0"/>
+    <cs:effectRef idx="0"/>
+    <cs:fontRef idx="minor">
+      <a:schemeClr val="tx1">
+        <a:lumMod val="65000"/>
+        <a:lumOff val="35000"/>
+      </a:schemeClr>
+    </cs:fontRef>
+    <cs:defRPr sz="900" kern="1200"/>
+  </cs:legend>
+  <cs:plotArea mods="allowNoFillOverride allowNoLineOverride">
+    <cs:lnRef idx="0"/>
+    <cs:fillRef idx="0"/>
+    <cs:effectRef idx="0"/>
+    <cs:fontRef idx="minor">
+      <a:schemeClr val="tx1"/>
+    </cs:fontRef>
+  </cs:plotArea>
+  <cs:plotArea3D mods="allowNoFillOverride allowNoLineOverride">
+    <cs:lnRef idx="0"/>
+    <cs:fillRef idx="0"/>
+    <cs:effectRef idx="0"/>
+    <cs:fontRef idx="minor">
+      <a:schemeClr val="tx1"/>
+    </cs:fontRef>
+  </cs:plotArea3D>
+  <cs:seriesAxis>
+    <cs:lnRef idx="0"/>
+    <cs:fillRef idx="0"/>
+    <cs:effectRef idx="0"/>
+    <cs:fontRef idx="minor">
+      <a:schemeClr val="tx1">
+        <a:lumMod val="65000"/>
+        <a:lumOff val="35000"/>
+      </a:schemeClr>
+    </cs:fontRef>
+    <cs:defRPr sz="900" kern="1200"/>
+  </cs:seriesAxis>
+  <cs:seriesLine>
+    <cs:lnRef idx="0"/>
+    <cs:fillRef idx="0"/>
+    <cs:effectRef idx="0"/>
+    <cs:fontRef idx="minor">
+      <a:schemeClr val="tx1"/>
+    </cs:fontRef>
+    <cs:spPr>
+      <a:ln w="9525" cap="flat" cmpd="sng" algn="ctr">
+        <a:solidFill>
+          <a:schemeClr val="tx1">
+            <a:lumMod val="35000"/>
+            <a:lumOff val="65000"/>
+          </a:schemeClr>
+        </a:solidFill>
+        <a:round/>
+      </a:ln>
+    </cs:spPr>
+  </cs:seriesLine>
+  <cs:title>
+    <cs:lnRef idx="0"/>
+    <cs:fillRef idx="0"/>
+    <cs:effectRef idx="0"/>
+    <cs:fontRef idx="minor">
+      <a:schemeClr val="tx1">
+        <a:lumMod val="65000"/>
+        <a:lumOff val="35000"/>
+      </a:schemeClr>
+    </cs:fontRef>
+    <cs:defRPr sz="1400" b="0" kern="1200" spc="0" baseline="0"/>
+  </cs:title>
+  <cs:trendline>
+    <cs:lnRef idx="0">
+      <cs:styleClr val="auto"/>
+    </cs:lnRef>
+    <cs:fillRef idx="0"/>
+    <cs:effectRef idx="0"/>
+    <cs:fontRef idx="minor">
+      <a:schemeClr val="tx1"/>
+    </cs:fontRef>
+    <cs:spPr>
+      <a:ln w="19050" cap="rnd">
+        <a:solidFill>
+          <a:schemeClr val="phClr"/>
+        </a:solidFill>
+        <a:prstDash val="sysDot"/>
+      </a:ln>
+    </cs:spPr>
+  </cs:trendline>
+  <cs:trendlineLabel>
+    <cs:lnRef idx="0"/>
+    <cs:fillRef idx="0"/>
+    <cs:effectRef idx="0"/>
+    <cs:fontRef idx="minor">
+      <a:schemeClr val="tx1">
+        <a:lumMod val="65000"/>
+        <a:lumOff val="35000"/>
+      </a:schemeClr>
+    </cs:fontRef>
+    <cs:defRPr sz="900" kern="1200"/>
+  </cs:trendlineLabel>
+  <cs:upBar>
+    <cs:lnRef idx="0"/>
+    <cs:fillRef idx="0"/>
+    <cs:effectRef idx="0"/>
+    <cs:fontRef idx="minor">
+      <a:schemeClr val="dk1"/>
+    </cs:fontRef>
+    <cs:spPr>
+      <a:solidFill>
+        <a:schemeClr val="lt1"/>
+      </a:solidFill>
+      <a:ln w="9525">
+        <a:solidFill>
+          <a:schemeClr val="tx1">
+            <a:lumMod val="15000"/>
+            <a:lumOff val="85000"/>
+          </a:schemeClr>
+        </a:solidFill>
+      </a:ln>
+    </cs:spPr>
+  </cs:upBar>
+  <cs:valueAxis>
+    <cs:lnRef idx="0"/>
+    <cs:fillRef idx="0"/>
+    <cs:effectRef idx="0"/>
+    <cs:fontRef idx="minor">
+      <a:schemeClr val="tx1">
+        <a:lumMod val="65000"/>
+        <a:lumOff val="35000"/>
+      </a:schemeClr>
+    </cs:fontRef>
+    <cs:defRPr sz="900" kern="1200"/>
+  </cs:valueAxis>
+  <cs:wall>
+    <cs:lnRef idx="0"/>
+    <cs:fillRef idx="0"/>
+    <cs:effectRef idx="0"/>
+    <cs:fontRef idx="minor">
+      <a:schemeClr val="tx1"/>
+    </cs:fontRef>
+    <cs:spPr>
+      <a:noFill/>
+      <a:ln>
+        <a:noFill/>
+      </a:ln>
+    </cs:spPr>
+  </cs:wall>
+</cs:chartStyle>
+</file>
+
+<file path=word/charts/style2.xml><?xml version="1.0" encoding="utf-8"?>
+<cs:chartStyle xmlns:cs="http://schemas.microsoft.com/office/drawing/2012/chartStyle" xmlns:a="http://schemas.openxmlformats.org/drawingml/2006/main" id="201">
+  <cs:axisTitle>
+    <cs:lnRef idx="0"/>
+    <cs:fillRef idx="0"/>
+    <cs:effectRef idx="0"/>
+    <cs:fontRef idx="minor">
+      <a:schemeClr val="tx1">
+        <a:lumMod val="65000"/>
+        <a:lumOff val="35000"/>
+      </a:schemeClr>
+    </cs:fontRef>
+    <cs:defRPr sz="1000" kern="1200"/>
+  </cs:axisTitle>
+  <cs:categoryAxis>
+    <cs:lnRef idx="0"/>
+    <cs:fillRef idx="0"/>
+    <cs:effectRef idx="0"/>
+    <cs:fontRef idx="minor">
+      <a:schemeClr val="tx1">
+        <a:lumMod val="65000"/>
+        <a:lumOff val="35000"/>
+      </a:schemeClr>
+    </cs:fontRef>
+    <cs:spPr>
+      <a:ln w="9525" cap="flat" cmpd="sng" algn="ctr">
+        <a:solidFill>
+          <a:schemeClr val="tx1">
+            <a:lumMod val="15000"/>
+            <a:lumOff val="85000"/>
+          </a:schemeClr>
+        </a:solidFill>
+        <a:round/>
+      </a:ln>
+    </cs:spPr>
+    <cs:defRPr sz="900" kern="1200"/>
+  </cs:categoryAxis>
+  <cs:chartArea mods="allowNoFillOverride allowNoLineOverride">
+    <cs:lnRef idx="0"/>
+    <cs:fillRef idx="0"/>
+    <cs:effectRef idx="0"/>
+    <cs:fontRef idx="minor">
+      <a:schemeClr val="tx1"/>
+    </cs:fontRef>
+    <cs:spPr>
+      <a:solidFill>
+        <a:schemeClr val="bg1"/>
+      </a:solidFill>
+      <a:ln w="9525" cap="flat" cmpd="sng" algn="ctr">
+        <a:solidFill>
+          <a:schemeClr val="tx1">
+            <a:lumMod val="15000"/>
+            <a:lumOff val="85000"/>
+          </a:schemeClr>
+        </a:solidFill>
+        <a:round/>
+      </a:ln>
+    </cs:spPr>
+    <cs:defRPr sz="1000" kern="1200"/>
+  </cs:chartArea>
+  <cs:dataLabel>
+    <cs:lnRef idx="0"/>
+    <cs:fillRef idx="0"/>
+    <cs:effectRef idx="0"/>
+    <cs:fontRef idx="minor">
+      <a:schemeClr val="tx1">
+        <a:lumMod val="75000"/>
+        <a:lumOff val="25000"/>
+      </a:schemeClr>
+    </cs:fontRef>
+    <cs:defRPr sz="900" kern="1200"/>
+  </cs:dataLabel>
+  <cs:dataLabelCallout>
+    <cs:lnRef idx="0"/>
+    <cs:fillRef idx="0"/>
+    <cs:effectRef idx="0"/>
+    <cs:fontRef idx="minor">
+      <a:schemeClr val="dk1">
+        <a:lumMod val="65000"/>
+        <a:lumOff val="35000"/>
+      </a:schemeClr>
+    </cs:fontRef>
+    <cs:spPr>
+      <a:solidFill>
+        <a:schemeClr val="lt1"/>
+      </a:solidFill>
+      <a:ln>
+        <a:solidFill>
+          <a:schemeClr val="dk1">
+            <a:lumMod val="25000"/>
+            <a:lumOff val="75000"/>
+          </a:schemeClr>
+        </a:solidFill>
+      </a:ln>
+    </cs:spPr>
+    <cs:defRPr sz="900" kern="1200"/>
+    <cs:bodyPr rot="0" spcFirstLastPara="1" vertOverflow="clip" horzOverflow="clip" vert="horz" wrap="square" lIns="36576" tIns="18288" rIns="36576" bIns="18288" anchor="ctr" anchorCtr="1">
+      <a:spAutoFit/>
+    </cs:bodyPr>
+  </cs:dataLabelCallout>
+  <cs:dataPoint>
+    <cs:lnRef idx="0"/>
+    <cs:fillRef idx="1">
+      <cs:styleClr val="auto"/>
+    </cs:fillRef>
+    <cs:effectRef idx="0"/>
+    <cs:fontRef idx="minor">
+      <a:schemeClr val="tx1"/>
+    </cs:fontRef>
+  </cs:dataPoint>
+  <cs:dataPoint3D>
+    <cs:lnRef idx="0"/>
+    <cs:fillRef idx="1">
+      <cs:styleClr val="auto"/>
+    </cs:fillRef>
+    <cs:effectRef idx="0"/>
+    <cs:fontRef idx="minor">
+      <a:schemeClr val="tx1"/>
+    </cs:fontRef>
+  </cs:dataPoint3D>
+  <cs:dataPointLine>
+    <cs:lnRef idx="0">
+      <cs:styleClr val="auto"/>
+    </cs:lnRef>
+    <cs:fillRef idx="1"/>
+    <cs:effectRef idx="0"/>
+    <cs:fontRef idx="minor">
+      <a:schemeClr val="tx1"/>
+    </cs:fontRef>
+    <cs:spPr>
+      <a:ln w="28575" cap="rnd">
+        <a:solidFill>
+          <a:schemeClr val="phClr"/>
+        </a:solidFill>
+        <a:round/>
+      </a:ln>
+    </cs:spPr>
+  </cs:dataPointLine>
+  <cs:dataPointMarker>
+    <cs:lnRef idx="0">
+      <cs:styleClr val="auto"/>
+    </cs:lnRef>
+    <cs:fillRef idx="1">
+      <cs:styleClr val="auto"/>
+    </cs:fillRef>
+    <cs:effectRef idx="0"/>
+    <cs:fontRef idx="minor">
+      <a:schemeClr val="tx1"/>
+    </cs:fontRef>
+    <cs:spPr>
+      <a:ln w="9525">
+        <a:solidFill>
+          <a:schemeClr val="phClr"/>
+        </a:solidFill>
+      </a:ln>
+    </cs:spPr>
+  </cs:dataPointMarker>
+  <cs:dataPointMarkerLayout symbol="circle" size="5"/>
+  <cs:dataPointWireframe>
+    <cs:lnRef idx="0">
+      <cs:styleClr val="auto"/>
+    </cs:lnRef>
+    <cs:fillRef idx="1"/>
+    <cs:effectRef idx="0"/>
+    <cs:fontRef idx="minor">
+      <a:schemeClr val="tx1"/>
+    </cs:fontRef>
+    <cs:spPr>
+      <a:ln w="9525" cap="rnd">
+        <a:solidFill>
+          <a:schemeClr val="phClr"/>
+        </a:solidFill>
+        <a:round/>
+      </a:ln>
+    </cs:spPr>
+  </cs:dataPointWireframe>
+  <cs:dataTable>
+    <cs:lnRef idx="0"/>
+    <cs:fillRef idx="0"/>
+    <cs:effectRef idx="0"/>
+    <cs:fontRef idx="minor">
+      <a:schemeClr val="tx1">
+        <a:lumMod val="65000"/>
+        <a:lumOff val="35000"/>
+      </a:schemeClr>
+    </cs:fontRef>
+    <cs:spPr>
+      <a:noFill/>
+      <a:ln w="9525" cap="flat" cmpd="sng" algn="ctr">
+        <a:solidFill>
+          <a:schemeClr val="tx1">
+            <a:lumMod val="15000"/>
+            <a:lumOff val="85000"/>
+          </a:schemeClr>
+        </a:solidFill>
+        <a:round/>
+      </a:ln>
+    </cs:spPr>
+    <cs:defRPr sz="900" kern="1200"/>
+  </cs:dataTable>
+  <cs:downBar>
+    <cs:lnRef idx="0"/>
+    <cs:fillRef idx="0"/>
+    <cs:effectRef idx="0"/>
+    <cs:fontRef idx="minor">
+      <a:schemeClr val="dk1"/>
+    </cs:fontRef>
+    <cs:spPr>
+      <a:solidFill>
+        <a:schemeClr val="dk1">
+          <a:lumMod val="65000"/>
+          <a:lumOff val="35000"/>
+        </a:schemeClr>
+      </a:solidFill>
+      <a:ln w="9525">
+        <a:solidFill>
+          <a:schemeClr val="tx1">
+            <a:lumMod val="65000"/>
+            <a:lumOff val="35000"/>
+          </a:schemeClr>
+        </a:solidFill>
+      </a:ln>
+    </cs:spPr>
+  </cs:downBar>
+  <cs:dropLine>
+    <cs:lnRef idx="0"/>
+    <cs:fillRef idx="0"/>
+    <cs:effectRef idx="0"/>
+    <cs:fontRef idx="minor">
+      <a:schemeClr val="tx1"/>
+    </cs:fontRef>
+    <cs:spPr>
+      <a:ln w="9525" cap="flat" cmpd="sng" algn="ctr">
+        <a:solidFill>
+          <a:schemeClr val="tx1">
+            <a:lumMod val="35000"/>
+            <a:lumOff val="65000"/>
+          </a:schemeClr>
+        </a:solidFill>
+        <a:round/>
+      </a:ln>
+    </cs:spPr>
+  </cs:dropLine>
+  <cs:errorBar>
+    <cs:lnRef idx="0"/>
+    <cs:fillRef idx="0"/>
+    <cs:effectRef idx="0"/>
+    <cs:fontRef idx="minor">
+      <a:schemeClr val="tx1"/>
+    </cs:fontRef>
+    <cs:spPr>
+      <a:ln w="9525" cap="flat" cmpd="sng" algn="ctr">
+        <a:solidFill>
+          <a:schemeClr val="tx1">
+            <a:lumMod val="65000"/>
+            <a:lumOff val="35000"/>
+          </a:schemeClr>
+        </a:solidFill>
+        <a:round/>
+      </a:ln>
+    </cs:spPr>
+  </cs:errorBar>
+  <cs:floor>
+    <cs:lnRef idx="0"/>
+    <cs:fillRef idx="0"/>
+    <cs:effectRef idx="0"/>
+    <cs:fontRef idx="minor">
+      <a:schemeClr val="tx1"/>
+    </cs:fontRef>
+    <cs:spPr>
+      <a:noFill/>
+      <a:ln>
+        <a:noFill/>
+      </a:ln>
+    </cs:spPr>
+  </cs:floor>
+  <cs:gridlineMajor>
+    <cs:lnRef idx="0"/>
+    <cs:fillRef idx="0"/>
+    <cs:effectRef idx="0"/>
+    <cs:fontRef idx="minor">
+      <a:schemeClr val="tx1"/>
+    </cs:fontRef>
+    <cs:spPr>
+      <a:ln w="9525" cap="flat" cmpd="sng" algn="ctr">
+        <a:solidFill>
+          <a:schemeClr val="tx1">
+            <a:lumMod val="15000"/>
+            <a:lumOff val="85000"/>
+          </a:schemeClr>
+        </a:solidFill>
+        <a:round/>
+      </a:ln>
+    </cs:spPr>
+  </cs:gridlineMajor>
+  <cs:gridlineMinor>
+    <cs:lnRef idx="0"/>
+    <cs:fillRef idx="0"/>
+    <cs:effectRef idx="0"/>
+    <cs:fontRef idx="minor">
+      <a:schemeClr val="tx1"/>
+    </cs:fontRef>
+    <cs:spPr>
+      <a:ln w="9525" cap="flat" cmpd="sng" algn="ctr">
+        <a:solidFill>
+          <a:schemeClr val="tx1">
+            <a:lumMod val="5000"/>
+            <a:lumOff val="95000"/>
+          </a:schemeClr>
+        </a:solidFill>
+        <a:round/>
+      </a:ln>
+    </cs:spPr>
+  </cs:gridlineMinor>
+  <cs:hiLoLine>
+    <cs:lnRef idx="0"/>
+    <cs:fillRef idx="0"/>
+    <cs:effectRef idx="0"/>
+    <cs:fontRef idx="minor">
+      <a:schemeClr val="tx1"/>
+    </cs:fontRef>
+    <cs:spPr>
+      <a:ln w="9525" cap="flat" cmpd="sng" algn="ctr">
+        <a:solidFill>
+          <a:schemeClr val="tx1">
+            <a:lumMod val="75000"/>
+            <a:lumOff val="25000"/>
+          </a:schemeClr>
+        </a:solidFill>
+        <a:round/>
+      </a:ln>
+    </cs:spPr>
+  </cs:hiLoLine>
+  <cs:leaderLine>
+    <cs:lnRef idx="0"/>
+    <cs:fillRef idx="0"/>
+    <cs:effectRef idx="0"/>
+    <cs:fontRef idx="minor">
+      <a:schemeClr val="tx1"/>
+    </cs:fontRef>
+    <cs:spPr>
+      <a:ln w="9525" cap="flat" cmpd="sng" algn="ctr">
+        <a:solidFill>
+          <a:schemeClr val="tx1">
+            <a:lumMod val="35000"/>
+            <a:lumOff val="65000"/>
+          </a:schemeClr>
+        </a:solidFill>
+        <a:round/>
+      </a:ln>
+    </cs:spPr>
+  </cs:leaderLine>
+  <cs:legend>
+    <cs:lnRef idx="0"/>
+    <cs:fillRef idx="0"/>
+    <cs:effectRef idx="0"/>
+    <cs:fontRef idx="minor">
+      <a:schemeClr val="tx1">
+        <a:lumMod val="65000"/>
+        <a:lumOff val="35000"/>
+      </a:schemeClr>
+    </cs:fontRef>
+    <cs:defRPr sz="900" kern="1200"/>
+  </cs:legend>
+  <cs:plotArea mods="allowNoFillOverride allowNoLineOverride">
+    <cs:lnRef idx="0"/>
+    <cs:fillRef idx="0"/>
+    <cs:effectRef idx="0"/>
+    <cs:fontRef idx="minor">
+      <a:schemeClr val="tx1"/>
+    </cs:fontRef>
+  </cs:plotArea>
+  <cs:plotArea3D mods="allowNoFillOverride allowNoLineOverride">
+    <cs:lnRef idx="0"/>
+    <cs:fillRef idx="0"/>
+    <cs:effectRef idx="0"/>
+    <cs:fontRef idx="minor">
+      <a:schemeClr val="tx1"/>
+    </cs:fontRef>
+  </cs:plotArea3D>
+  <cs:seriesAxis>
+    <cs:lnRef idx="0"/>
+    <cs:fillRef idx="0"/>
+    <cs:effectRef idx="0"/>
+    <cs:fontRef idx="minor">
+      <a:schemeClr val="tx1">
+        <a:lumMod val="65000"/>
+        <a:lumOff val="35000"/>
+      </a:schemeClr>
+    </cs:fontRef>
+    <cs:defRPr sz="900" kern="1200"/>
+  </cs:seriesAxis>
+  <cs:seriesLine>
+    <cs:lnRef idx="0"/>
+    <cs:fillRef idx="0"/>
+    <cs:effectRef idx="0"/>
+    <cs:fontRef idx="minor">
+      <a:schemeClr val="tx1"/>
+    </cs:fontRef>
+    <cs:spPr>
+      <a:ln w="9525" cap="flat" cmpd="sng" algn="ctr">
+        <a:solidFill>
+          <a:schemeClr val="tx1">
+            <a:lumMod val="35000"/>
+            <a:lumOff val="65000"/>
+          </a:schemeClr>
+        </a:solidFill>
+        <a:round/>
+      </a:ln>
+    </cs:spPr>
+  </cs:seriesLine>
+  <cs:title>
+    <cs:lnRef idx="0"/>
+    <cs:fillRef idx="0"/>
+    <cs:effectRef idx="0"/>
+    <cs:fontRef idx="minor">
+      <a:schemeClr val="tx1">
+        <a:lumMod val="65000"/>
+        <a:lumOff val="35000"/>
+      </a:schemeClr>
+    </cs:fontRef>
+    <cs:defRPr sz="1400" b="0" kern="1200" spc="0" baseline="0"/>
+  </cs:title>
+  <cs:trendline>
+    <cs:lnRef idx="0">
+      <cs:styleClr val="auto"/>
+    </cs:lnRef>
+    <cs:fillRef idx="0"/>
+    <cs:effectRef idx="0"/>
+    <cs:fontRef idx="minor">
+      <a:schemeClr val="tx1"/>
+    </cs:fontRef>
+    <cs:spPr>
+      <a:ln w="19050" cap="rnd">
+        <a:solidFill>
+          <a:schemeClr val="phClr"/>
+        </a:solidFill>
+        <a:prstDash val="sysDot"/>
+      </a:ln>
+    </cs:spPr>
+  </cs:trendline>
+  <cs:trendlineLabel>
+    <cs:lnRef idx="0"/>
+    <cs:fillRef idx="0"/>
+    <cs:effectRef idx="0"/>
+    <cs:fontRef idx="minor">
+      <a:schemeClr val="tx1">
+        <a:lumMod val="65000"/>
+        <a:lumOff val="35000"/>
+      </a:schemeClr>
+    </cs:fontRef>
+    <cs:defRPr sz="900" kern="1200"/>
+  </cs:trendlineLabel>
+  <cs:upBar>
+    <cs:lnRef idx="0"/>
+    <cs:fillRef idx="0"/>
+    <cs:effectRef idx="0"/>
+    <cs:fontRef idx="minor">
+      <a:schemeClr val="dk1"/>
+    </cs:fontRef>
+    <cs:spPr>
+      <a:solidFill>
+        <a:schemeClr val="lt1"/>
+      </a:solidFill>
+      <a:ln w="9525">
+        <a:solidFill>
+          <a:schemeClr val="tx1">
+            <a:lumMod val="15000"/>
+            <a:lumOff val="85000"/>
+          </a:schemeClr>
+        </a:solidFill>
+      </a:ln>
+    </cs:spPr>
+  </cs:upBar>
+  <cs:valueAxis>
+    <cs:lnRef idx="0"/>
+    <cs:fillRef idx="0"/>
+    <cs:effectRef idx="0"/>
+    <cs:fontRef idx="minor">
+      <a:schemeClr val="tx1">
+        <a:lumMod val="65000"/>
+        <a:lumOff val="35000"/>
+      </a:schemeClr>
+    </cs:fontRef>
+    <cs:defRPr sz="900" kern="1200"/>
+  </cs:valueAxis>
+  <cs:wall>
+    <cs:lnRef idx="0"/>
+    <cs:fillRef idx="0"/>
+    <cs:effectRef idx="0"/>
+    <cs:fontRef idx="minor">
+      <a:schemeClr val="tx1"/>
+    </cs:fontRef>
+    <cs:spPr>
+      <a:noFill/>
+      <a:ln>
+        <a:noFill/>
+      </a:ln>
+    </cs:spPr>
+  </cs:wall>
+</cs:chartStyle>
+</file>
+
 <file path=word/theme/theme1.xml><?xml version="1.0" encoding="utf-8"?>
 <a:theme xmlns:a="http://schemas.openxmlformats.org/drawingml/2006/main" name="Office Theme">
   <a:themeElements>

</xml_diff>